<commit_message>
add(docs): word report documents & demonstration in presentation
</commit_message>
<xml_diff>
--- a/docs/practice/Отчёт_учебная_практика.docx
+++ b/docs/practice/Отчёт_учебная_практика.docx
@@ -307,7 +307,7 @@
         <w:rPr>
           <w:b w:val="0"/>
         </w:rPr>
-        <w:t>Отчёт 21 с., 5 табл., 1 рис., 45 источников, 1 прил.</w:t>
+        <w:t>Отчёт 22 с., 5 табл., 1 рис., 45 источников, 1 прил.</w:t>
       </w:r>
     </w:p>
     <w:p>
@@ -723,6 +723,22 @@
           <w:tab w:pos="9354" w:val="right" w:leader="dot"/>
         </w:tabs>
         <w:spacing w:line="360" w:lineRule="auto" w:after="0"/>
+        <w:ind w:firstLine="0" w:left="425"/>
+      </w:pPr>
+      <w:r>
+        <w:t>4.6 Взаимодействие с ИИ: оценка — коррекция</w:t>
+      </w:r>
+      <w:r>
+        <w:tab/>
+        <w:t>15</w:t>
+      </w:r>
+    </w:p>
+    <w:p>
+      <w:pPr>
+        <w:tabs>
+          <w:tab w:pos="9354" w:val="right" w:leader="dot"/>
+        </w:tabs>
+        <w:spacing w:line="360" w:lineRule="auto" w:after="0"/>
         <w:ind w:firstLine="0" w:left="0"/>
       </w:pPr>
       <w:r>
@@ -733,7 +749,7 @@
       </w:r>
       <w:r>
         <w:tab/>
-        <w:t>16</w:t>
+        <w:t>17</w:t>
       </w:r>
     </w:p>
     <w:p>
@@ -752,7 +768,7 @@
       </w:r>
       <w:r>
         <w:tab/>
-        <w:t>17</w:t>
+        <w:t>18</w:t>
       </w:r>
     </w:p>
     <w:p>
@@ -771,7 +787,7 @@
       </w:r>
       <w:r>
         <w:tab/>
-        <w:t>21</w:t>
+        <w:t>22</w:t>
       </w:r>
     </w:p>
     <w:p>
@@ -804,7 +820,7 @@
         <w:rPr>
           <w:b w:val="0"/>
         </w:rPr>
-        <w:t>Объект исследования — методы генерации и автоматической оценки рифмованной русской поэзии. Предмет исследования — конвейер «генерация → численная оценка рифмы → отбор лучшего варианта», пригодный для практического приложения и дальнейшего развития в рамках выпускной квалификационной работы (ВКР).</w:t>
+        <w:t>Объект исследования — методы генерации и автоматической оценки рифмованной русской поэзии. Предмет исследования — конвейер «генерация — численная оценка рифмы — отбор лучшего варианта», пригодный для практического приложения и дальнейшего развития в рамках выпускной квалификационной работы (ВКР).</w:t>
       </w:r>
     </w:p>
     <w:p>
@@ -3304,7 +3320,7 @@
         <w:spacing w:line="360" w:lineRule="auto"/>
       </w:pPr>
       <w:r>
-        <w:t>разметка ударений (RPST) → хвосты/клаузулы; сверка с эталоном для размеченных датасетов;</w:t>
+        <w:t>разметка ударений (RPST) — хвосты/клаузулы; сверка с эталоном для размеченных датасетов;</w:t>
       </w:r>
     </w:p>
     <w:p>
@@ -4253,7 +4269,7 @@
         <w:rPr>
           <w:b w:val="0"/>
         </w:rPr>
-        <w:t>Сбор корпуса → нормализация (приведение к нижнему регистру, удаление пунктуации, разбиение на строки и слова) → дедупликация и фильтрация (длина строф, язык, кодировка) → разметка ударений (RPST) и выделение хвостов/клаузул → формирование примеров (строфа, схема, метки рифмующихся пар) → разбиение train/val/test со стратификацией → оценка детектором и (для генерации) best-of-N с самокоррекцией → логи экспериментов для таблиц ВКР.</w:t>
+        <w:t>Сбор корпуса — нормализация (приведение к нижнему регистру, удаление пунктуации, разбиение на строки и слова) — дедупликация и фильтрация (длина строф, язык, кодировка) — разметка ударений (RPST) и выделение хвостов/клаузул — формирование примеров (строфа, схема, метки рифмующихся пар) — разбиение train/val/test со стратификацией — оценка детектором и (для генерации) best-of-N с самокоррекцией — логи экспериментов для таблиц ВКР.</w:t>
       </w:r>
     </w:p>
     <w:p>
@@ -4278,6 +4294,66 @@
           <w:b w:val="0"/>
         </w:rPr>
         <w:t>Первый детектор — обёртка над RPST: разметка ударений, определение размера и схемы рифмовки, оценка поэтичности, сравнение рифмующихся хвостов и расчёт точности по схеме. Второй — авторский алгоритм на потенциале Юкавы: стихотворение рассматривается как поток волн, сила созвучия слогов экранируется расстоянием, эффект резонанса усиливает созвучные цепочки, а группы рифм выделяются как компоненты связности графа. Ядро схожести слогов — фонетическая векторизация: каждый слог кодируется вектором артикуляционных признаков (отдельно блок гласной и блок согласных), а близость измеряется косинусом, так что основной вклад дают гласные, а согласные добавляют созвучие (аллитерацию). Интерфейс приложения, настройки провайдера и сохранение сессий показаны в приложении А.</w:t>
+      </w:r>
+    </w:p>
+    <w:p>
+      <w:pPr>
+        <w:pStyle w:val="Heading2"/>
+      </w:pPr>
+      <w:r>
+        <w:t>4.6 Взаимодействие с ИИ: оценка — коррекция</w:t>
+      </w:r>
+    </w:p>
+    <w:p>
+      <w:r>
+        <w:rPr>
+          <w:b w:val="0"/>
+        </w:rPr>
+        <w:t>Хотя тема ВКР относится к искусственному интеллекту, ядро работы — математика оценки рифмы; именно численные метрики направляют исправление текста. Взаимодействие с языковой моделью построено как цикл с обратной связью:</w:t>
+      </w:r>
+    </w:p>
+    <w:p>
+      <w:pPr>
+        <w:pStyle w:val="ListBullet"/>
+        <w:spacing w:line="360" w:lineRule="auto"/>
+      </w:pPr>
+      <w:r>
+        <w:t>генерация: модель выдаёт N вариантов стиха на тему (best-of-N);</w:t>
+      </w:r>
+    </w:p>
+    <w:p>
+      <w:pPr>
+        <w:pStyle w:val="ListBullet"/>
+        <w:spacing w:line="360" w:lineRule="auto"/>
+      </w:pPr>
+      <w:r>
+        <w:t>оценка: детектор рифмы численно оценивает каждый вариант (RPST или Юкава);</w:t>
+      </w:r>
+    </w:p>
+    <w:p>
+      <w:pPr>
+        <w:pStyle w:val="ListBullet"/>
+        <w:spacing w:line="360" w:lineRule="auto"/>
+      </w:pPr>
+      <w:r>
+        <w:t>разметка: по результату оценки помечаются окончания строк — какие рифмуются (оставить), а какие нет (переписать);</w:t>
+      </w:r>
+    </w:p>
+    <w:p>
+      <w:pPr>
+        <w:pStyle w:val="ListBullet"/>
+        <w:spacing w:line="360" w:lineRule="auto"/>
+      </w:pPr>
+      <w:r>
+        <w:t>коррекция: модели передаётся этот разбор и запрос переписать только плохо рифмующиеся строки, сохранив удачные рифмы, и проверить читаемость (естественный порядок слов) и форму (размер, число строк, схема).</w:t>
+      </w:r>
+    </w:p>
+    <w:p>
+      <w:r>
+        <w:rPr>
+          <w:b w:val="0"/>
+        </w:rPr>
+        <w:t>Таким образом языковая модель выступает инструментом, а решения о том, что исправлять, принимаются на основе численных метрик качества рифмы. Это отличает подход от простого промптинга и делает результат воспроизводимым и измеримым.</w:t>
       </w:r>
     </w:p>
     <w:p>

</xml_diff>

<commit_message>
fix(docs): docx according  "ГОСТ", add presentation datapreparing slide
</commit_message>
<xml_diff>
--- a/docs/practice/Отчёт_учебная_практика.docx
+++ b/docs/practice/Отчёт_учебная_практика.docx
@@ -289,60 +289,32 @@
     <w:p>
       <w:pPr>
         <w:pageBreakBefore/>
+        <w:spacing w:before="240" w:after="240"/>
         <w:ind w:firstLine="0"/>
         <w:jc w:val="center"/>
       </w:pPr>
       <w:r>
         <w:rPr>
           <w:b/>
+          <w:sz w:val="32"/>
         </w:rPr>
-        <w:t>РЕФЕРАТ</w:t>
-      </w:r>
-    </w:p>
-    <w:p>
-      <w:pPr>
-        <w:ind w:firstLine="0"/>
-      </w:pPr>
+        <w:t>АННОТАЦИЯ</w:t>
+      </w:r>
+    </w:p>
+    <w:p>
       <w:r>
         <w:rPr>
           <w:b w:val="0"/>
         </w:rPr>
-        <w:t>Отчёт 22 с., 5 табл., 1 рис., 45 источников, 1 прил.</w:t>
-      </w:r>
-    </w:p>
-    <w:p>
-      <w:pPr>
-        <w:ind w:firstLine="0"/>
-      </w:pPr>
+        <w:t>Отчёт по учебной практике посвящён разработке прототипа конвейера ИИ-генерации и автоматической оценки рифмованной русской поэзии. Объект исследования — методы генерации и автоматической оценки рифмованной русской поэзии; предмет — конвейер, объединяющий генерацию стиха большой языковой моделью с численной оценкой рифмы и отбором лучшего варианта (best-of-N).</w:t>
+      </w:r>
+    </w:p>
+    <w:p>
       <w:r>
         <w:rPr>
           <w:b w:val="0"/>
         </w:rPr>
-        <w:t>ГЕНЕРАЦИЯ ПОЭЗИИ, ОЦЕНКА РИФМЫ, СИЛЛАБО-ТОНИКА, БОЛЬШИЕ ЯЗЫКОВЫЕ МОДЕЛИ, ДЕТЕКТОР РИФМЫ, ПОТЕНЦИАЛ ЮКАВЫ, ФОНЕТИЧЕСКАЯ ВЕКТОРИЗАЦИЯ, BEST-OF-N, RUSSIAN POETRY SCANSION TOOL.</w:t>
-      </w:r>
-    </w:p>
-    <w:p>
-      <w:r>
-        <w:rPr>
-          <w:b w:val="0"/>
-        </w:rPr>
-        <w:t>Объект исследования — методы генерации и автоматической оценки рифмованной русской поэзии. Предмет — конвейер, объединяющий генерацию стиха большой языковой моделью с численной оценкой рифмы и отбором лучшего варианта (best-of-N).</w:t>
-      </w:r>
-    </w:p>
-    <w:p>
-      <w:r>
-        <w:rPr>
-          <w:b w:val="0"/>
-        </w:rPr>
-        <w:t>Цель учебной практики — разработать прототип такого конвейера (приложение «Rhymer») и подготовить материалы исследования: обзор источников, план-график работы над ВКР, описание данных и спецификацию системы.</w:t>
-      </w:r>
-    </w:p>
-    <w:p>
-      <w:r>
-        <w:rPr>
-          <w:b w:val="0"/>
-        </w:rPr>
-        <w:t>В ходе практики выполнен аналитический обзор предметной области (генерация поэзии, русскоязычные языковые модели, автоматический анализ стиха, управляемая генерация, обучение с подкреплением, метрики оценки), составлен библиографический список, разработан двухлетний план-график с диаграммой Ганта, обоснован выбор данных и протокол их подготовки, сформулирована математическая постановка и метрики качества. Реализован прототип «Rhymer» на PySide6: генерация (best-of-N с самокоррекцией), два взаимозаменяемых детектора рифмы (RPST и авторский алгоритм на потенциале Юкавы с фонетической векторизацией слогов).</w:t>
+        <w:t>Цель учебной практики — разработать прототип такого конвейера (приложение «Rhymer») и подготовить материалы исследования: обзор источников, план-график работы над ВКР, описание данных и спецификацию системы. В ходе практики выполнен аналитический обзор предметной области, составлен библиографический список, разработан двухлетний план-график с диаграммой Ганта, обоснован выбор данных, сформулированы математическая постановка задачи и метрики качества. Реализован прототип «Rhymer» на PySide6: генерация (best-of-N с самокоррекцией) и два взаимозаменяемых детектора рифмы — RPST и авторский алгоритм на потенциале Юкавы с фонетической векторизацией слогов. Научная новизна сосредоточена в авторском алгоритме оценки созвучия и способе векторизации слогов.</w:t>
       </w:r>
     </w:p>
     <w:p>
@@ -351,6 +323,61 @@
           <w:b w:val="0"/>
         </w:rPr>
         <w:t>Область применения результатов — инструменты поддержки авторов и редактирования стихов, образование (стиховедение, фонетика), а также объективная оценка генеративных моделей на поэтическом материале.</w:t>
+      </w:r>
+    </w:p>
+    <w:p>
+      <w:r>
+        <w:rPr>
+          <w:b w:val="0"/>
+        </w:rPr>
+        <w:t>Объём отчёта — 34 с., 5 таблиц, рисунков и листингов — в приложениях, 48 использованных источников, 2 приложения.</w:t>
+      </w:r>
+    </w:p>
+    <w:p>
+      <w:r>
+        <w:rPr>
+          <w:b w:val="0"/>
+        </w:rPr>
+        <w:t>Ключевые слова: ГЕНЕРАЦИЯ ПОЭЗИИ, ОЦЕНКА РИФМЫ, СИЛЛАБО-ТОНИКА, БОЛЬШИЕ ЯЗЫКОВЫЕ МОДЕЛИ, ДЕТЕКТОР РИФМЫ, ПОТЕНЦИАЛ ЮКАВЫ, ФОНЕТИЧЕСКАЯ ВЕКТОРИЗАЦИЯ, BEST-OF-N, RUSSIAN POETRY SCANSION TOOL.</w:t>
+      </w:r>
+    </w:p>
+    <w:p>
+      <w:pPr>
+        <w:pageBreakBefore/>
+        <w:spacing w:before="240" w:after="240"/>
+        <w:ind w:firstLine="0"/>
+        <w:jc w:val="center"/>
+      </w:pPr>
+      <w:r>
+        <w:rPr>
+          <w:b/>
+          <w:sz w:val="32"/>
+        </w:rPr>
+        <w:t>ABSTRACT</w:t>
+      </w:r>
+    </w:p>
+    <w:p>
+      <w:r>
+        <w:rPr>
+          <w:b w:val="0"/>
+        </w:rPr>
+        <w:t>This report on the academic practice is devoted to the development of a prototype pipeline for AI-based generation and automatic evaluation of rhymed Russian poetry. The object of research is methods for generating and automatically evaluating rhymed Russian poetry; the subject is a pipeline that combines verse generation by a large language model with a numerical rhyme score and best-of-N selection of the best candidate.</w:t>
+      </w:r>
+    </w:p>
+    <w:p>
+      <w:r>
+        <w:rPr>
+          <w:b w:val="0"/>
+        </w:rPr>
+        <w:t>The goal of the practice is to build a prototype of such a pipeline (the «Rhymer» application) and to prepare research materials: a literature review, a schedule of work on the master's thesis, a description of the data, and a system specification. A working prototype was implemented in PySide6: best-of-N generation with self-correction and two interchangeable rhyme detectors — RPST and an original algorithm based on the Yukawa potential with phonetic vectorization of syllables. The scientific novelty lies in the original consonance-scoring algorithm and the syllable vectorization method.</w:t>
+      </w:r>
+    </w:p>
+    <w:p>
+      <w:r>
+        <w:rPr>
+          <w:b w:val="0"/>
+        </w:rPr>
+        <w:t>Keywords: POETRY GENERATION, RHYME EVALUATION, SYLLABIC-ACCENTUAL VERSE, LARGE LANGUAGE MODELS, RHYME DETECTOR, YUKAWA POTENTIAL, PHONETIC VECTORIZATION, BEST-OF-N, RUSSIAN POETRY SCANSION TOOL.</w:t>
       </w:r>
     </w:p>
     <w:p>
@@ -382,7 +409,7 @@
       </w:r>
       <w:r>
         <w:tab/>
-        <w:t>4</w:t>
+        <w:t>5</w:t>
       </w:r>
     </w:p>
     <w:p>
@@ -401,7 +428,7 @@
       </w:r>
       <w:r>
         <w:tab/>
-        <w:t>6</w:t>
+        <w:t>7</w:t>
       </w:r>
     </w:p>
     <w:p>
@@ -417,7 +444,7 @@
       </w:r>
       <w:r>
         <w:tab/>
-        <w:t>6</w:t>
+        <w:t>7</w:t>
       </w:r>
     </w:p>
     <w:p>
@@ -433,7 +460,7 @@
       </w:r>
       <w:r>
         <w:tab/>
-        <w:t>6</w:t>
+        <w:t>7</w:t>
       </w:r>
     </w:p>
     <w:p>
@@ -449,7 +476,7 @@
       </w:r>
       <w:r>
         <w:tab/>
-        <w:t>7</w:t>
+        <w:t>8</w:t>
       </w:r>
     </w:p>
     <w:p>
@@ -468,7 +495,7 @@
       </w:r>
       <w:r>
         <w:tab/>
-        <w:t>8</w:t>
+        <w:t>10</w:t>
       </w:r>
     </w:p>
     <w:p>
@@ -484,7 +511,7 @@
       </w:r>
       <w:r>
         <w:tab/>
-        <w:t>8</w:t>
+        <w:t>10</w:t>
       </w:r>
     </w:p>
     <w:p>
@@ -500,7 +527,7 @@
       </w:r>
       <w:r>
         <w:tab/>
-        <w:t>8</w:t>
+        <w:t>10</w:t>
       </w:r>
     </w:p>
     <w:p>
@@ -516,7 +543,7 @@
       </w:r>
       <w:r>
         <w:tab/>
-        <w:t>9</w:t>
+        <w:t>11</w:t>
       </w:r>
     </w:p>
     <w:p>
@@ -535,7 +562,7 @@
       </w:r>
       <w:r>
         <w:tab/>
-        <w:t>10</w:t>
+        <w:t>12</w:t>
       </w:r>
     </w:p>
     <w:p>
@@ -551,7 +578,7 @@
       </w:r>
       <w:r>
         <w:tab/>
-        <w:t>10</w:t>
+        <w:t>12</w:t>
       </w:r>
     </w:p>
     <w:p>
@@ -567,7 +594,7 @@
       </w:r>
       <w:r>
         <w:tab/>
-        <w:t>10</w:t>
+        <w:t>12</w:t>
       </w:r>
     </w:p>
     <w:p>
@@ -583,7 +610,7 @@
       </w:r>
       <w:r>
         <w:tab/>
-        <w:t>11</w:t>
+        <w:t>13</w:t>
       </w:r>
     </w:p>
     <w:p>
@@ -599,7 +626,7 @@
       </w:r>
       <w:r>
         <w:tab/>
-        <w:t>11</w:t>
+        <w:t>13</w:t>
       </w:r>
     </w:p>
     <w:p>
@@ -615,7 +642,7 @@
       </w:r>
       <w:r>
         <w:tab/>
-        <w:t>11</w:t>
+        <w:t>14</w:t>
       </w:r>
     </w:p>
     <w:p>
@@ -634,7 +661,7 @@
       </w:r>
       <w:r>
         <w:tab/>
-        <w:t>13</w:t>
+        <w:t>15</w:t>
       </w:r>
     </w:p>
     <w:p>
@@ -650,7 +677,7 @@
       </w:r>
       <w:r>
         <w:tab/>
-        <w:t>13</w:t>
+        <w:t>15</w:t>
       </w:r>
     </w:p>
     <w:p>
@@ -666,7 +693,7 @@
       </w:r>
       <w:r>
         <w:tab/>
-        <w:t>13</w:t>
+        <w:t>15</w:t>
       </w:r>
     </w:p>
     <w:p>
@@ -682,7 +709,7 @@
       </w:r>
       <w:r>
         <w:tab/>
-        <w:t>14</w:t>
+        <w:t>16</w:t>
       </w:r>
     </w:p>
     <w:p>
@@ -698,7 +725,7 @@
       </w:r>
       <w:r>
         <w:tab/>
-        <w:t>14</w:t>
+        <w:t>16</w:t>
       </w:r>
     </w:p>
     <w:p>
@@ -714,7 +741,7 @@
       </w:r>
       <w:r>
         <w:tab/>
-        <w:t>14</w:t>
+        <w:t>16</w:t>
       </w:r>
     </w:p>
     <w:p>
@@ -730,7 +757,7 @@
       </w:r>
       <w:r>
         <w:tab/>
-        <w:t>15</w:t>
+        <w:t>17</w:t>
       </w:r>
     </w:p>
     <w:p>
@@ -749,7 +776,7 @@
       </w:r>
       <w:r>
         <w:tab/>
-        <w:t>17</w:t>
+        <w:t>19</w:t>
       </w:r>
     </w:p>
     <w:p>
@@ -768,7 +795,7 @@
       </w:r>
       <w:r>
         <w:tab/>
-        <w:t>18</w:t>
+        <w:t>20</w:t>
       </w:r>
     </w:p>
     <w:p>
@@ -783,11 +810,30 @@
         <w:rPr>
           <w:b/>
         </w:rPr>
-        <w:t>ПРИЛОЖЕНИЕ А</w:t>
+        <w:t>ПРИЛОЖЕНИЕ А. Интерфейс приложения «Rhymer»</w:t>
       </w:r>
       <w:r>
         <w:tab/>
-        <w:t>22</w:t>
+        <w:t>24</w:t>
+      </w:r>
+    </w:p>
+    <w:p>
+      <w:pPr>
+        <w:tabs>
+          <w:tab w:pos="9354" w:val="right" w:leader="dot"/>
+        </w:tabs>
+        <w:spacing w:line="360" w:lineRule="auto" w:after="0"/>
+        <w:ind w:firstLine="0" w:left="0"/>
+      </w:pPr>
+      <w:r>
+        <w:rPr>
+          <w:b/>
+        </w:rPr>
+        <w:t>ПРИЛОЖЕНИЕ Б. Ключевые фрагменты исходного кода</w:t>
+      </w:r>
+      <w:r>
+        <w:tab/>
+        <w:t>30</w:t>
       </w:r>
     </w:p>
     <w:p>
@@ -930,7 +976,7 @@
         <w:rPr>
           <w:b w:val="0"/>
         </w:rPr>
-        <w:t>Генерация поэзии прошла путь от рекуррентных сетей с конечными автоматами для рифмы и метра (Hafez, Deep-speare) к токен-свободным и управляемым моделям (ByGPT5, PoeLM) и далее к LLM общего назначения с управлением через промпт и декодирование. Узкое место — одновременное соблюдение смысла, размера и рифмы.</w:t>
+        <w:t>Генерация поэзии прошла путь от рекуррентных сетей с конечными автоматами для рифмы и метра (Hafez [1; 2], Deep-speare [3]) к токен-свободным и управляемым моделям (ByGPT5 [4], PoeLM [7]) и далее к LLM общего назначения с управлением через промпт и декодирование. Для русского языка доступны открытые модели — ruGPT [9; 10], mGPT [11], YaLM [12], Vikhr [13], Saiga [14], GigaChat [15], оцениваемые бенчмарком MERA [16]. Узкое место — одновременное соблюдение смысла, размера и рифмы.</w:t>
       </w:r>
     </w:p>
     <w:p>
@@ -938,7 +984,7 @@
         <w:rPr>
           <w:b w:val="0"/>
         </w:rPr>
-        <w:t>Для русского языка автоматическая оценка стиха фактически закрывается инструментом RPST (RussianPoetryScansionTool, И. Козиев): расстановка ударений, классификация метра, детекция точных и неточных рифм, оценка «техничности». Этот инструмент используется в проекте как опорный внешний верификатор.</w:t>
+        <w:t>Для русского языка автоматическая оценка стиха фактически закрывается инструментом RPST (RussianPoetryScansionTool, И. Козиев) [17; 18]: расстановка ударений, классификация метра, детекция точных и неточных рифм, оценка «техничности». Этот инструмент используется в проекте как опорный внешний верификатор. Для неконтекстной детекции рифмы известны коллокационные методы (RhymeTagger [21; 22]).</w:t>
       </w:r>
     </w:p>
     <w:p>
@@ -946,7 +992,15 @@
         <w:rPr>
           <w:b w:val="0"/>
         </w:rPr>
-        <w:t>Управляемая генерация (PPLM, FUDGE, grid-beam search, COLD, NeuroLogic) даёт механизмы навязывания рифмы и метра без переобучения модели. Обучение с подкреплением с наградой за рифму (Generate-and-Revise) и регуляризованный best-of-N — прямая опора для направления ВКР, где rhyme-score выступает функцией вознаграждения. Метрики оценки поэзии слабо коррелируют между собой и с экспертами, поэтому требуется комбинированный протокол (автометрики RPST совместно с экспертной оценкой).</w:t>
+        <w:t>Управляемая генерация (PPLM [25], FUDGE [26], grid-beam search [27], COLD [28], NeuroLogic [29]) даёт механизмы навязывания рифмы и метра без переобучения модели. Обучение с подкреплением с наградой за рифму (Generate-and-Revise [32]) и регуляризованный best-of-N [35] — прямая опора для направления ВКР, где rhyme-score выступает функцией вознаграждения [31; 34]. Метрики оценки поэзии слабо коррелируют между собой и с экспертами [36; 37], поэтому требуется комбинированный протокол (автометрики RPST совместно с экспертной оценкой).</w:t>
+      </w:r>
+    </w:p>
+    <w:p>
+      <w:r>
+        <w:rPr>
+          <w:b w:val="0"/>
+        </w:rPr>
+        <w:t>Подготовка текста к анализу опирается на классический NLP-конвейер: токенизация и нормализация (приведение к нижнему регистру, удаление пунктуации), лемматизация и частеречная разметка, затем — векторизация. Классические векторные представления слов (Word2Vec [44], FastText [45]) и контекстные модели (BERT [46]) кодируют семантику; в настоящей работе аналогичная идея векторизации переносится с уровня слов на уровень слогов, но с фонетическими, а не семантическими признаками, что и лежит в основе авторского детектора рифмы (глава 4).</w:t>
       </w:r>
     </w:p>
     <w:p>
@@ -2431,7 +2485,7 @@
         <w:rPr>
           <w:b w:val="0"/>
         </w:rPr>
-        <w:t>Требования к данным: русскоязычная силлабо-тоническая поэзия со строфами регулярной рифмовки; желательна разметка ударений, схемы рифмовки и метра; открытая лицензия; достаточный объём и разнообразие авторов и эпох, чтобы метрики не переобучались на одном стиле. Для оценки детектора рифмы нужна разметка — отсюда выбор корпусов Rifma и ArsPoetica (совместимы с RPST); для генерации и языкового разнообразия — крупные неразмеченные корпуса (stihi_ru, поэтический подкорпус НКРЯ, PULPO); для кросс-языковых экспериментов — Gutenberg Poetry Corpus.</w:t>
+        <w:t>Требования к данным: русскоязычная силлабо-тоническая поэзия со строфами регулярной рифмовки; желательна разметка ударений, схемы рифмовки и метра; открытая лицензия; достаточный объём и разнообразие авторов и эпох, чтобы метрики не переобучались на одном стиле. Для оценки детектора рифмы нужна разметка — отсюда выбор корпусов Rifma [20] и ArsPoetica [19] (совместимы с RPST); для генерации и языкового разнообразия — крупные неразмеченные корпуса (stihi_ru [40], поэтический подкорпус НКРЯ [41], PULPO [42]); для кросс-языковых экспериментов — Gutenberg Poetry Corpus [43].</w:t>
       </w:r>
     </w:p>
     <w:p>
@@ -4404,7 +4458,7 @@
         <w:ind w:left="425" w:hanging="425"/>
       </w:pPr>
       <w:r>
-        <w:t>1. Ghazvininejad M., Shi X., Choi Y., Knight K. Generating Topical Poetry // EMNLP 2016. URL: https://aclanthology.org/D16-1126/ (Hafez: RNN + конечный автомат для рифмы и метра).</w:t>
+        <w:t>1. Ghazvininejad M., Shi X., Choi Y., Knight K. Generating Topical Poetry // EMNLP 2016. URL: https://aclanthology.org/D16-1126/.</w:t>
       </w:r>
     </w:p>
     <w:p>
@@ -4557,7 +4611,7 @@
         <w:ind w:left="425" w:hanging="425"/>
       </w:pPr>
       <w:r>
-        <w:t>18. Koziev I. RussianPoetryScansionTool. GitHub. URL: https://github.com/Koziev/RussianPoetryScansionTool (ударения, метр, рифма; лицензия MIT).</w:t>
+        <w:t>18. Koziev I. RussianPoetryScansionTool. GitHub. URL: https://github.com/Koziev/RussianPoetryScansionTool.</w:t>
       </w:r>
     </w:p>
     <w:p>
@@ -4566,7 +4620,7 @@
         <w:ind w:left="425" w:hanging="425"/>
       </w:pPr>
       <w:r>
-        <w:t>19. Koziev I. ArsPoetica (~8,5 тыс. стихов). Hugging Face. URL: https://huggingface.co/datasets/inkoziev/ArsPoetica.</w:t>
+        <w:t>19. Koziev I. ArsPoetica. Hugging Face. URL: https://huggingface.co/datasets/inkoziev/ArsPoetica.</w:t>
       </w:r>
     </w:p>
     <w:p>
@@ -4575,7 +4629,7 @@
         <w:ind w:left="425" w:hanging="425"/>
       </w:pPr>
       <w:r>
-        <w:t>20. Koziev I. Rifma (5002 фрагмента с разметкой ударений и схемы рифмовки). GitHub. URL: https://github.com/Koziev/Rifma.</w:t>
+        <w:t>20. Koziev I. Rifma. GitHub. URL: https://github.com/Koziev/Rifma.</w:t>
       </w:r>
     </w:p>
     <w:p>
@@ -4584,7 +4638,7 @@
         <w:ind w:left="425" w:hanging="425"/>
       </w:pPr>
       <w:r>
-        <w:t>21. Plecháč P. A Collocation-Driven Method of Discovering Rhymes // Taming the Corpus. Springer, 2018. RhymeTagger. URL: https://github.com/versotym/rhymetagger.</w:t>
+        <w:t>21. Plecháč P. A Collocation-Driven Method of Discovering Rhymes // Taming the Corpus. Springer, 2018. URL: https://github.com/versotym/rhymetagger.</w:t>
       </w:r>
     </w:p>
     <w:p>
@@ -4791,7 +4845,7 @@
         <w:ind w:left="425" w:hanging="425"/>
       </w:pPr>
       <w:r>
-        <w:t>44. ГОСТ Р 7.0.100–2018. Библиографическая запись. Библиографическое описание. М.: Стандартинформ, 2018.</w:t>
+        <w:t>44. Mikolov T., Chen K., Corrado G., Dean J. Efficient Estimation of Word Representations in Vector Space. arXiv:1301.3781. URL: https://arxiv.org/abs/1301.3781.</w:t>
       </w:r>
     </w:p>
     <w:p>
@@ -4800,20 +4854,43 @@
         <w:ind w:left="425" w:hanging="425"/>
       </w:pPr>
       <w:r>
-        <w:t>45. ГОСТ 7.32–2017. Отчёт о научно-исследовательской работе. Структура и правила оформления. М.: Стандартинформ, 2017.</w:t>
-      </w:r>
-    </w:p>
-    <w:p>
-      <w:pPr>
+        <w:t>45. Bojanowski P., Grave E., Joulin A., Mikolov T. Enriching Word Vectors with Subword Information // TACL 2017. arXiv:1607.04606. URL: https://arxiv.org/abs/1607.04606.</w:t>
+      </w:r>
+    </w:p>
+    <w:p>
+      <w:pPr>
+        <w:spacing w:line="360" w:lineRule="auto"/>
+        <w:ind w:left="425" w:hanging="425"/>
+      </w:pPr>
+      <w:r>
+        <w:t>46. Devlin J., Chang M.-W., Lee K., Toutanova K. BERT: Pre-training of Deep Bidirectional Transformers for Language Understanding // NAACL 2019. arXiv:1810.04805. URL: https://arxiv.org/abs/1810.04805.</w:t>
+      </w:r>
+    </w:p>
+    <w:p>
+      <w:pPr>
+        <w:spacing w:line="360" w:lineRule="auto"/>
+        <w:ind w:left="425" w:hanging="425"/>
+      </w:pPr>
+      <w:r>
+        <w:t>47. ГОСТ Р 7.0.100–2018. Библиографическая запись. Библиографическое описание. М.: Стандартинформ, 2018.</w:t>
+      </w:r>
+    </w:p>
+    <w:p>
+      <w:pPr>
+        <w:spacing w:line="360" w:lineRule="auto"/>
+        <w:ind w:left="425" w:hanging="425"/>
+      </w:pPr>
+      <w:r>
+        <w:t>48. ГОСТ 7.32–2017. Отчёт о научно-исследовательской работе. Структура и правила оформления. М.: Стандартинформ, 2017.</w:t>
+      </w:r>
+    </w:p>
+    <w:p>
+      <w:pPr>
+        <w:pStyle w:val="Heading1"/>
         <w:pageBreakBefore/>
-        <w:ind w:firstLine="0"/>
-        <w:jc w:val="center"/>
-      </w:pPr>
-      <w:r>
-        <w:rPr>
-          <w:b/>
-        </w:rPr>
-        <w:t>ПРИЛОЖЕНИЕ А</w:t>
+      </w:pPr>
+      <w:r>
+        <w:t>ПРИЛОЖЕНИЕ А. Интерфейс приложения «Rhymer»</w:t>
       </w:r>
     </w:p>
     <w:p>
@@ -4833,7 +4910,313 @@
         <w:rPr>
           <w:b w:val="0"/>
         </w:rPr>
-        <w:t>Диаграмма Ганта плана работы над ВКР и интерфейс прототипа «Rhymer».</w:t>
+        <w:t>Прототип «Rhymer» реализован как десктоп-приложение на PySide6. Ниже приведены экранные снимки основных режимов работы: генерации стиха, его улучшения по обратной связи детектора, а также оценки рифмы двумя взаимозаменяемыми детекторами (RPST и авторский алгоритм на потенциале Юкавы).</w:t>
+      </w:r>
+    </w:p>
+    <w:p>
+      <w:pPr>
+        <w:spacing w:before="120"/>
+        <w:ind w:firstLine="0"/>
+        <w:jc w:val="center"/>
+      </w:pPr>
+      <w:r>
+        <w:drawing>
+          <wp:inline xmlns:a="http://schemas.openxmlformats.org/drawingml/2006/main" xmlns:pic="http://schemas.openxmlformats.org/drawingml/2006/picture">
+            <wp:extent cx="5760000" cy="4642531"/>
+            <wp:docPr id="1" name="Picture 1"/>
+            <wp:cNvGraphicFramePr>
+              <a:graphicFrameLocks noChangeAspect="1"/>
+            </wp:cNvGraphicFramePr>
+            <a:graphic>
+              <a:graphicData uri="http://schemas.openxmlformats.org/drawingml/2006/picture">
+                <pic:pic>
+                  <pic:nvPicPr>
+                    <pic:cNvPr id="0" name="Generation.png"/>
+                    <pic:cNvPicPr/>
+                  </pic:nvPicPr>
+                  <pic:blipFill>
+                    <a:blip r:embed="rId10"/>
+                    <a:stretch>
+                      <a:fillRect/>
+                    </a:stretch>
+                  </pic:blipFill>
+                  <pic:spPr>
+                    <a:xfrm>
+                      <a:off x="0" y="0"/>
+                      <a:ext cx="5760000" cy="4642531"/>
+                    </a:xfrm>
+                    <a:prstGeom prst="rect"/>
+                  </pic:spPr>
+                </pic:pic>
+              </a:graphicData>
+            </a:graphic>
+          </wp:inline>
+        </w:drawing>
+      </w:r>
+    </w:p>
+    <w:p>
+      <w:pPr>
+        <w:spacing w:after="240" w:line="240" w:lineRule="auto"/>
+        <w:ind w:firstLine="0"/>
+        <w:jc w:val="center"/>
+      </w:pPr>
+      <w:r>
+        <w:t>Рисунок А.1 — Вкладка «Генерация»: тема, размер, схема рифмовки и сгенерированный стих</w:t>
+      </w:r>
+    </w:p>
+    <w:p>
+      <w:pPr>
+        <w:spacing w:before="120"/>
+        <w:ind w:firstLine="0"/>
+        <w:jc w:val="center"/>
+      </w:pPr>
+      <w:r>
+        <w:drawing>
+          <wp:inline xmlns:a="http://schemas.openxmlformats.org/drawingml/2006/main" xmlns:pic="http://schemas.openxmlformats.org/drawingml/2006/picture">
+            <wp:extent cx="5760000" cy="4642531"/>
+            <wp:docPr id="2" name="Picture 2"/>
+            <wp:cNvGraphicFramePr>
+              <a:graphicFrameLocks noChangeAspect="1"/>
+            </wp:cNvGraphicFramePr>
+            <a:graphic>
+              <a:graphicData uri="http://schemas.openxmlformats.org/drawingml/2006/picture">
+                <pic:pic>
+                  <pic:nvPicPr>
+                    <pic:cNvPr id="0" name="ImprovingGeneration.png"/>
+                    <pic:cNvPicPr/>
+                  </pic:nvPicPr>
+                  <pic:blipFill>
+                    <a:blip r:embed="rId11"/>
+                    <a:stretch>
+                      <a:fillRect/>
+                    </a:stretch>
+                  </pic:blipFill>
+                  <pic:spPr>
+                    <a:xfrm>
+                      <a:off x="0" y="0"/>
+                      <a:ext cx="5760000" cy="4642531"/>
+                    </a:xfrm>
+                    <a:prstGeom prst="rect"/>
+                  </pic:spPr>
+                </pic:pic>
+              </a:graphicData>
+            </a:graphic>
+          </wp:inline>
+        </w:drawing>
+      </w:r>
+    </w:p>
+    <w:p>
+      <w:pPr>
+        <w:spacing w:after="240" w:line="240" w:lineRule="auto"/>
+        <w:ind w:firstLine="0"/>
+        <w:jc w:val="center"/>
+      </w:pPr>
+      <w:r>
+        <w:t>Рисунок А.2 — Улучшение стиха: самокоррекция по разбору рифмы (best-of-N с одним проходом правки)</w:t>
+      </w:r>
+    </w:p>
+    <w:p>
+      <w:pPr>
+        <w:spacing w:before="120"/>
+        <w:ind w:firstLine="0"/>
+        <w:jc w:val="center"/>
+      </w:pPr>
+      <w:r>
+        <w:drawing>
+          <wp:inline xmlns:a="http://schemas.openxmlformats.org/drawingml/2006/main" xmlns:pic="http://schemas.openxmlformats.org/drawingml/2006/picture">
+            <wp:extent cx="5760000" cy="4642531"/>
+            <wp:docPr id="3" name="Picture 3"/>
+            <wp:cNvGraphicFramePr>
+              <a:graphicFrameLocks noChangeAspect="1"/>
+            </wp:cNvGraphicFramePr>
+            <a:graphic>
+              <a:graphicData uri="http://schemas.openxmlformats.org/drawingml/2006/picture">
+                <pic:pic>
+                  <pic:nvPicPr>
+                    <pic:cNvPr id="0" name="RhymeAnalisisRPST.png"/>
+                    <pic:cNvPicPr/>
+                  </pic:nvPicPr>
+                  <pic:blipFill>
+                    <a:blip r:embed="rId12"/>
+                    <a:stretch>
+                      <a:fillRect/>
+                    </a:stretch>
+                  </pic:blipFill>
+                  <pic:spPr>
+                    <a:xfrm>
+                      <a:off x="0" y="0"/>
+                      <a:ext cx="5760000" cy="4642531"/>
+                    </a:xfrm>
+                    <a:prstGeom prst="rect"/>
+                  </pic:spPr>
+                </pic:pic>
+              </a:graphicData>
+            </a:graphic>
+          </wp:inline>
+        </w:drawing>
+      </w:r>
+    </w:p>
+    <w:p>
+      <w:pPr>
+        <w:spacing w:after="240" w:line="240" w:lineRule="auto"/>
+        <w:ind w:firstLine="0"/>
+        <w:jc w:val="center"/>
+      </w:pPr>
+      <w:r>
+        <w:t>Рисунок А.3 — Оценка рифмы детектором RPST с подсветкой рифмующихся окончаний</w:t>
+      </w:r>
+    </w:p>
+    <w:p>
+      <w:pPr>
+        <w:spacing w:before="120"/>
+        <w:ind w:firstLine="0"/>
+        <w:jc w:val="center"/>
+      </w:pPr>
+      <w:r>
+        <w:drawing>
+          <wp:inline xmlns:a="http://schemas.openxmlformats.org/drawingml/2006/main" xmlns:pic="http://schemas.openxmlformats.org/drawingml/2006/picture">
+            <wp:extent cx="5760000" cy="4642531"/>
+            <wp:docPr id="4" name="Picture 4"/>
+            <wp:cNvGraphicFramePr>
+              <a:graphicFrameLocks noChangeAspect="1"/>
+            </wp:cNvGraphicFramePr>
+            <a:graphic>
+              <a:graphicData uri="http://schemas.openxmlformats.org/drawingml/2006/picture">
+                <pic:pic>
+                  <pic:nvPicPr>
+                    <pic:cNvPr id="0" name="RhymeAnalisisYukawa.png"/>
+                    <pic:cNvPicPr/>
+                  </pic:nvPicPr>
+                  <pic:blipFill>
+                    <a:blip r:embed="rId13"/>
+                    <a:stretch>
+                      <a:fillRect/>
+                    </a:stretch>
+                  </pic:blipFill>
+                  <pic:spPr>
+                    <a:xfrm>
+                      <a:off x="0" y="0"/>
+                      <a:ext cx="5760000" cy="4642531"/>
+                    </a:xfrm>
+                    <a:prstGeom prst="rect"/>
+                  </pic:spPr>
+                </pic:pic>
+              </a:graphicData>
+            </a:graphic>
+          </wp:inline>
+        </w:drawing>
+      </w:r>
+    </w:p>
+    <w:p>
+      <w:pPr>
+        <w:spacing w:after="240" w:line="240" w:lineRule="auto"/>
+        <w:ind w:firstLine="0"/>
+        <w:jc w:val="center"/>
+      </w:pPr>
+      <w:r>
+        <w:t>Рисунок А.4 — Оценка рифмы авторским детектором на потенциале Юкавы (группы рифм — компоненты связности графа)</w:t>
+      </w:r>
+    </w:p>
+    <w:p>
+      <w:pPr>
+        <w:spacing w:before="120"/>
+        <w:ind w:firstLine="0"/>
+        <w:jc w:val="center"/>
+      </w:pPr>
+      <w:r>
+        <w:drawing>
+          <wp:inline xmlns:a="http://schemas.openxmlformats.org/drawingml/2006/main" xmlns:pic="http://schemas.openxmlformats.org/drawingml/2006/picture">
+            <wp:extent cx="5760000" cy="4642531"/>
+            <wp:docPr id="5" name="Picture 5"/>
+            <wp:cNvGraphicFramePr>
+              <a:graphicFrameLocks noChangeAspect="1"/>
+            </wp:cNvGraphicFramePr>
+            <a:graphic>
+              <a:graphicData uri="http://schemas.openxmlformats.org/drawingml/2006/picture">
+                <pic:pic>
+                  <pic:nvPicPr>
+                    <pic:cNvPr id="0" name="RhymeAnalisisDarkTheme.png"/>
+                    <pic:cNvPicPr/>
+                  </pic:nvPicPr>
+                  <pic:blipFill>
+                    <a:blip r:embed="rId14"/>
+                    <a:stretch>
+                      <a:fillRect/>
+                    </a:stretch>
+                  </pic:blipFill>
+                  <pic:spPr>
+                    <a:xfrm>
+                      <a:off x="0" y="0"/>
+                      <a:ext cx="5760000" cy="4642531"/>
+                    </a:xfrm>
+                    <a:prstGeom prst="rect"/>
+                  </pic:spPr>
+                </pic:pic>
+              </a:graphicData>
+            </a:graphic>
+          </wp:inline>
+        </w:drawing>
+      </w:r>
+    </w:p>
+    <w:p>
+      <w:pPr>
+        <w:spacing w:after="240" w:line="240" w:lineRule="auto"/>
+        <w:ind w:firstLine="0"/>
+        <w:jc w:val="center"/>
+      </w:pPr>
+      <w:r>
+        <w:t>Рисунок А.5 — Тёмная тема интерфейса</w:t>
+      </w:r>
+    </w:p>
+    <w:p>
+      <w:pPr>
+        <w:spacing w:before="120"/>
+        <w:ind w:firstLine="0"/>
+        <w:jc w:val="center"/>
+      </w:pPr>
+      <w:r>
+        <w:drawing>
+          <wp:inline xmlns:a="http://schemas.openxmlformats.org/drawingml/2006/main" xmlns:pic="http://schemas.openxmlformats.org/drawingml/2006/picture">
+            <wp:extent cx="3600000" cy="3184615"/>
+            <wp:docPr id="6" name="Picture 6"/>
+            <wp:cNvGraphicFramePr>
+              <a:graphicFrameLocks noChangeAspect="1"/>
+            </wp:cNvGraphicFramePr>
+            <a:graphic>
+              <a:graphicData uri="http://schemas.openxmlformats.org/drawingml/2006/picture">
+                <pic:pic>
+                  <pic:nvPicPr>
+                    <pic:cNvPr id="0" name="SettingsProviderAPIKeys.png"/>
+                    <pic:cNvPicPr/>
+                  </pic:nvPicPr>
+                  <pic:blipFill>
+                    <a:blip r:embed="rId15"/>
+                    <a:stretch>
+                      <a:fillRect/>
+                    </a:stretch>
+                  </pic:blipFill>
+                  <pic:spPr>
+                    <a:xfrm>
+                      <a:off x="0" y="0"/>
+                      <a:ext cx="3600000" cy="3184615"/>
+                    </a:xfrm>
+                    <a:prstGeom prst="rect"/>
+                  </pic:spPr>
+                </pic:pic>
+              </a:graphicData>
+            </a:graphic>
+          </wp:inline>
+        </w:drawing>
+      </w:r>
+    </w:p>
+    <w:p>
+      <w:pPr>
+        <w:spacing w:after="240" w:line="240" w:lineRule="auto"/>
+        <w:ind w:firstLine="0"/>
+        <w:jc w:val="center"/>
+      </w:pPr>
+      <w:r>
+        <w:t>Рисунок А.6 — Настройки провайдера и API-ключей (Claude, Gemini, DeepSeek)</w:t>
       </w:r>
     </w:p>
     <w:p>
@@ -4841,19 +5224,1757 @@
         <w:rPr>
           <w:b w:val="0"/>
         </w:rPr>
-        <w:t>Диаграмма Ганта подготовлена в формате mermaid (исходный текст — в репозитории проекта, docs/practice/02_plan_gantt.md) и может быть экспортирована в PNG/SVG через сервис mermaid.live для вставки в пояснительную записку ВКР. Скриншоты интерфейса приложения (вкладки «Генерация» и «Оценка рифм», окно настроек провайдера, сохранение сессий) приводятся в презентации к защите отчёта.</w:t>
+        <w:t>Диаграмма Ганта плана работы над ВКР подготовлена в формате mermaid (исходный текст — в репозитории проекта, docs/practice/02_plan_gantt.md) и может быть экспортирована в PNG/SVG для вставки в пояснительную записку ВКР.</w:t>
+      </w:r>
+    </w:p>
+    <w:p>
+      <w:pPr>
+        <w:pStyle w:val="Heading1"/>
+        <w:pageBreakBefore/>
+      </w:pPr>
+      <w:r>
+        <w:t>ПРИЛОЖЕНИЕ Б. Ключевые фрагменты исходного кода</w:t>
       </w:r>
     </w:p>
     <w:p>
       <w:pPr>
         <w:ind w:firstLine="0"/>
-      </w:pPr>
+        <w:jc w:val="center"/>
+      </w:pPr>
+      <w:r>
+        <w:rPr>
+          <w:i/>
+        </w:rPr>
+        <w:t>(справочное)</w:t>
+      </w:r>
+    </w:p>
+    <w:p>
       <w:r>
         <w:rPr>
           <w:b w:val="0"/>
         </w:rPr>
-        <w:t>Рисунок А.1 — Диаграмма Ганта (вставляется при вёрстке).</w:t>
-      </w:r>
+        <w:t>Приведены ключевые фрагменты прототипа: ядро авторского детектора рифмы на потенциале Юкавы, определение энергии слога с фонетической векторизацией и непосредственные промпты к большой языковой модели. Настраиваемые константы (λ, γ, веса) вынесены в параметры и опущены для краткости.</w:t>
+      </w:r>
+    </w:p>
+    <w:p>
+      <w:r>
+        <w:rPr>
+          <w:b w:val="0"/>
+        </w:rPr>
+        <w:t>Ядро детектора Юкавы: экранирующее ядро подавляет дальние связи слогов, а резонанс усиливает созвучные цепочки за счёт общих «друзей» (тройные корреляции).</w:t>
+      </w:r>
+    </w:p>
+    <w:p>
+      <w:pPr>
+        <w:keepNext/>
+        <w:spacing w:before="120"/>
+        <w:ind w:firstLine="0"/>
+      </w:pPr>
+      <w:r>
+        <w:t>Листинг Б.1 — Экранирующее ядро Юкавы и резонанс связей</w:t>
+      </w:r>
+    </w:p>
+    <w:p>
+      <w:pPr>
+        <w:spacing w:line="240" w:lineRule="auto" w:after="0" w:before="0"/>
+        <w:ind w:firstLine="0" w:left="283"/>
+        <w:jc w:val="left"/>
+      </w:pPr>
+      <w:r>
+        <w:rPr>
+          <w:rFonts w:ascii="Consolas" w:hAnsi="Consolas" w:eastAsia="Consolas"/>
+          <w:sz w:val="20"/>
+        </w:rPr>
+        <w:t>def yukawa_kernel(d, lam=0.8):</w:t>
+      </w:r>
+    </w:p>
+    <w:p>
+      <w:pPr>
+        <w:spacing w:line="240" w:lineRule="auto" w:after="0" w:before="0"/>
+        <w:ind w:firstLine="0" w:left="283"/>
+        <w:jc w:val="left"/>
+      </w:pPr>
+      <w:r>
+        <w:rPr>
+          <w:rFonts w:ascii="Consolas" w:hAnsi="Consolas" w:eastAsia="Consolas"/>
+          <w:sz w:val="20"/>
+        </w:rPr>
+        <w:t xml:space="preserve">    """Экранированное взаимодействие: подавляет дальние связи."""</w:t>
+      </w:r>
+    </w:p>
+    <w:p>
+      <w:pPr>
+        <w:spacing w:line="240" w:lineRule="auto" w:after="0" w:before="0"/>
+        <w:ind w:firstLine="0" w:left="283"/>
+        <w:jc w:val="left"/>
+      </w:pPr>
+      <w:r>
+        <w:rPr>
+          <w:rFonts w:ascii="Consolas" w:hAnsi="Consolas" w:eastAsia="Consolas"/>
+          <w:sz w:val="20"/>
+        </w:rPr>
+        <w:t xml:space="preserve">    if d == 0:</w:t>
+      </w:r>
+    </w:p>
+    <w:p>
+      <w:pPr>
+        <w:spacing w:line="240" w:lineRule="auto" w:after="0" w:before="0"/>
+        <w:ind w:firstLine="0" w:left="283"/>
+        <w:jc w:val="left"/>
+      </w:pPr>
+      <w:r>
+        <w:rPr>
+          <w:rFonts w:ascii="Consolas" w:hAnsi="Consolas" w:eastAsia="Consolas"/>
+          <w:sz w:val="20"/>
+        </w:rPr>
+        <w:t xml:space="preserve">        return 1.0</w:t>
+      </w:r>
+    </w:p>
+    <w:p>
+      <w:pPr>
+        <w:spacing w:line="240" w:lineRule="auto" w:after="0" w:before="0"/>
+        <w:ind w:firstLine="0" w:left="283"/>
+        <w:jc w:val="left"/>
+      </w:pPr>
+      <w:r>
+        <w:rPr>
+          <w:rFonts w:ascii="Consolas" w:hAnsi="Consolas" w:eastAsia="Consolas"/>
+          <w:sz w:val="20"/>
+        </w:rPr>
+        <w:t xml:space="preserve">    return np.exp(-lam * d) / d</w:t>
+      </w:r>
+    </w:p>
+    <w:p>
+      <w:pPr>
+        <w:spacing w:line="240" w:lineRule="auto" w:after="0" w:before="0"/>
+        <w:ind w:firstLine="0" w:left="283"/>
+        <w:jc w:val="left"/>
+      </w:pPr>
+      <w:r>
+        <w:rPr>
+          <w:rFonts w:ascii="Consolas" w:hAnsi="Consolas" w:eastAsia="Consolas"/>
+          <w:sz w:val="20"/>
+        </w:rPr>
+        <w:t xml:space="preserve"> </w:t>
+      </w:r>
+    </w:p>
+    <w:p>
+      <w:pPr>
+        <w:spacing w:line="240" w:lineRule="auto" w:after="0" w:before="0"/>
+        <w:ind w:firstLine="0" w:left="283"/>
+        <w:jc w:val="left"/>
+      </w:pPr>
+      <w:r>
+        <w:rPr>
+          <w:rFonts w:ascii="Consolas" w:hAnsi="Consolas" w:eastAsia="Consolas"/>
+          <w:sz w:val="20"/>
+        </w:rPr>
+        <w:t xml:space="preserve"> </w:t>
+      </w:r>
+    </w:p>
+    <w:p>
+      <w:pPr>
+        <w:spacing w:line="240" w:lineRule="auto" w:after="0" w:before="0"/>
+        <w:ind w:firstLine="0" w:left="283"/>
+        <w:jc w:val="left"/>
+      </w:pPr>
+      <w:r>
+        <w:rPr>
+          <w:rFonts w:ascii="Consolas" w:hAnsi="Consolas" w:eastAsia="Consolas"/>
+          <w:sz w:val="20"/>
+        </w:rPr>
+        <w:t>def apply_resonance(S, gamma=0.3):</w:t>
+      </w:r>
+    </w:p>
+    <w:p>
+      <w:pPr>
+        <w:spacing w:line="240" w:lineRule="auto" w:after="0" w:before="0"/>
+        <w:ind w:firstLine="0" w:left="283"/>
+        <w:jc w:val="left"/>
+      </w:pPr>
+      <w:r>
+        <w:rPr>
+          <w:rFonts w:ascii="Consolas" w:hAnsi="Consolas" w:eastAsia="Consolas"/>
+          <w:sz w:val="20"/>
+        </w:rPr>
+        <w:t xml:space="preserve">    """Тройные корреляции (ритм): усиливаем связи с общими «друзьями»."""</w:t>
+      </w:r>
+    </w:p>
+    <w:p>
+      <w:pPr>
+        <w:spacing w:line="240" w:lineRule="auto" w:after="0" w:before="0"/>
+        <w:ind w:firstLine="0" w:left="283"/>
+        <w:jc w:val="left"/>
+      </w:pPr>
+      <w:r>
+        <w:rPr>
+          <w:rFonts w:ascii="Consolas" w:hAnsi="Consolas" w:eastAsia="Consolas"/>
+          <w:sz w:val="20"/>
+        </w:rPr>
+        <w:t xml:space="preserve">    S_new = S.copy()</w:t>
+      </w:r>
+    </w:p>
+    <w:p>
+      <w:pPr>
+        <w:spacing w:line="240" w:lineRule="auto" w:after="0" w:before="0"/>
+        <w:ind w:firstLine="0" w:left="283"/>
+        <w:jc w:val="left"/>
+      </w:pPr>
+      <w:r>
+        <w:rPr>
+          <w:rFonts w:ascii="Consolas" w:hAnsi="Consolas" w:eastAsia="Consolas"/>
+          <w:sz w:val="20"/>
+        </w:rPr>
+        <w:t xml:space="preserve">    N = S.shape[0]</w:t>
+      </w:r>
+    </w:p>
+    <w:p>
+      <w:pPr>
+        <w:spacing w:line="240" w:lineRule="auto" w:after="0" w:before="0"/>
+        <w:ind w:firstLine="0" w:left="283"/>
+        <w:jc w:val="left"/>
+      </w:pPr>
+      <w:r>
+        <w:rPr>
+          <w:rFonts w:ascii="Consolas" w:hAnsi="Consolas" w:eastAsia="Consolas"/>
+          <w:sz w:val="20"/>
+        </w:rPr>
+        <w:t xml:space="preserve">    for a in range(N):</w:t>
+      </w:r>
+    </w:p>
+    <w:p>
+      <w:pPr>
+        <w:spacing w:line="240" w:lineRule="auto" w:after="0" w:before="0"/>
+        <w:ind w:firstLine="0" w:left="283"/>
+        <w:jc w:val="left"/>
+      </w:pPr>
+      <w:r>
+        <w:rPr>
+          <w:rFonts w:ascii="Consolas" w:hAnsi="Consolas" w:eastAsia="Consolas"/>
+          <w:sz w:val="20"/>
+        </w:rPr>
+        <w:t xml:space="preserve">        for b in range(a + 1, N):</w:t>
+      </w:r>
+    </w:p>
+    <w:p>
+      <w:pPr>
+        <w:spacing w:line="240" w:lineRule="auto" w:after="0" w:before="0"/>
+        <w:ind w:firstLine="0" w:left="283"/>
+        <w:jc w:val="left"/>
+      </w:pPr>
+      <w:r>
+        <w:rPr>
+          <w:rFonts w:ascii="Consolas" w:hAnsi="Consolas" w:eastAsia="Consolas"/>
+          <w:sz w:val="20"/>
+        </w:rPr>
+        <w:t xml:space="preserve">            resonance = 0.0</w:t>
+      </w:r>
+    </w:p>
+    <w:p>
+      <w:pPr>
+        <w:spacing w:line="240" w:lineRule="auto" w:after="0" w:before="0"/>
+        <w:ind w:firstLine="0" w:left="283"/>
+        <w:jc w:val="left"/>
+      </w:pPr>
+      <w:r>
+        <w:rPr>
+          <w:rFonts w:ascii="Consolas" w:hAnsi="Consolas" w:eastAsia="Consolas"/>
+          <w:sz w:val="20"/>
+        </w:rPr>
+        <w:t xml:space="preserve">            for c in range(N):</w:t>
+      </w:r>
+    </w:p>
+    <w:p>
+      <w:pPr>
+        <w:spacing w:line="240" w:lineRule="auto" w:after="0" w:before="0"/>
+        <w:ind w:firstLine="0" w:left="283"/>
+        <w:jc w:val="left"/>
+      </w:pPr>
+      <w:r>
+        <w:rPr>
+          <w:rFonts w:ascii="Consolas" w:hAnsi="Consolas" w:eastAsia="Consolas"/>
+          <w:sz w:val="20"/>
+        </w:rPr>
+        <w:t xml:space="preserve">                if c != a and c != b:</w:t>
+      </w:r>
+    </w:p>
+    <w:p>
+      <w:pPr>
+        <w:spacing w:line="240" w:lineRule="auto" w:after="0" w:before="0"/>
+        <w:ind w:firstLine="0" w:left="283"/>
+        <w:jc w:val="left"/>
+      </w:pPr>
+      <w:r>
+        <w:rPr>
+          <w:rFonts w:ascii="Consolas" w:hAnsi="Consolas" w:eastAsia="Consolas"/>
+          <w:sz w:val="20"/>
+        </w:rPr>
+        <w:t xml:space="preserve">                    resonance += S[a, c] * S[b, c]</w:t>
+      </w:r>
+    </w:p>
+    <w:p>
+      <w:pPr>
+        <w:spacing w:line="240" w:lineRule="auto" w:after="0" w:before="0"/>
+        <w:ind w:firstLine="0" w:left="283"/>
+        <w:jc w:val="left"/>
+      </w:pPr>
+      <w:r>
+        <w:rPr>
+          <w:rFonts w:ascii="Consolas" w:hAnsi="Consolas" w:eastAsia="Consolas"/>
+          <w:sz w:val="20"/>
+        </w:rPr>
+        <w:t xml:space="preserve">            resonance /= N</w:t>
+      </w:r>
+    </w:p>
+    <w:p>
+      <w:pPr>
+        <w:spacing w:line="240" w:lineRule="auto" w:after="0" w:before="0"/>
+        <w:ind w:firstLine="0" w:left="283"/>
+        <w:jc w:val="left"/>
+      </w:pPr>
+      <w:r>
+        <w:rPr>
+          <w:rFonts w:ascii="Consolas" w:hAnsi="Consolas" w:eastAsia="Consolas"/>
+          <w:sz w:val="20"/>
+        </w:rPr>
+        <w:t xml:space="preserve">            S_new[a, b] += gamma * resonance</w:t>
+      </w:r>
+    </w:p>
+    <w:p>
+      <w:pPr>
+        <w:spacing w:line="240" w:lineRule="auto" w:after="0" w:before="0"/>
+        <w:ind w:firstLine="0" w:left="283"/>
+        <w:jc w:val="left"/>
+      </w:pPr>
+      <w:r>
+        <w:rPr>
+          <w:rFonts w:ascii="Consolas" w:hAnsi="Consolas" w:eastAsia="Consolas"/>
+          <w:sz w:val="20"/>
+        </w:rPr>
+        <w:t xml:space="preserve">            S_new[b, a] = S_new[a, b]</w:t>
+      </w:r>
+    </w:p>
+    <w:p>
+      <w:pPr>
+        <w:spacing w:line="240" w:lineRule="auto" w:after="0" w:before="0"/>
+        <w:ind w:firstLine="0" w:left="283"/>
+        <w:jc w:val="left"/>
+      </w:pPr>
+      <w:r>
+        <w:rPr>
+          <w:rFonts w:ascii="Consolas" w:hAnsi="Consolas" w:eastAsia="Consolas"/>
+          <w:sz w:val="20"/>
+        </w:rPr>
+        <w:t xml:space="preserve">    return S_new</w:t>
+      </w:r>
+    </w:p>
+    <w:p>
+      <w:pPr>
+        <w:spacing w:after="120"/>
+      </w:pPr>
+    </w:p>
+    <w:p>
+      <w:r>
+        <w:rPr>
+          <w:b w:val="0"/>
+        </w:rPr>
+        <w:t>Из энергий слогов, их фонетической схожести и экранирования расстоянием собирается матрица связей S; группы рифм выделяются как компоненты связности графа при пороге как доле от максимума связи.</w:t>
+      </w:r>
+    </w:p>
+    <w:p>
+      <w:pPr>
+        <w:keepNext/>
+        <w:spacing w:before="120"/>
+        <w:ind w:firstLine="0"/>
+      </w:pPr>
+      <w:r>
+        <w:t>Листинг Б.2 — Матрица связей слогов и выделение групп рифм</w:t>
+      </w:r>
+    </w:p>
+    <w:p>
+      <w:pPr>
+        <w:spacing w:line="240" w:lineRule="auto" w:after="0" w:before="0"/>
+        <w:ind w:firstLine="0" w:left="283"/>
+        <w:jc w:val="left"/>
+      </w:pPr>
+      <w:r>
+        <w:rPr>
+          <w:rFonts w:ascii="Consolas" w:hAnsi="Consolas" w:eastAsia="Consolas"/>
+          <w:sz w:val="20"/>
+        </w:rPr>
+        <w:t># узлы графа — слоги; nodes[k] = (строка_i, позиция_j, текст_слога)</w:t>
+      </w:r>
+    </w:p>
+    <w:p>
+      <w:pPr>
+        <w:spacing w:line="240" w:lineRule="auto" w:after="0" w:before="0"/>
+        <w:ind w:firstLine="0" w:left="283"/>
+        <w:jc w:val="left"/>
+      </w:pPr>
+      <w:r>
+        <w:rPr>
+          <w:rFonts w:ascii="Consolas" w:hAnsi="Consolas" w:eastAsia="Consolas"/>
+          <w:sz w:val="20"/>
+        </w:rPr>
+        <w:t>energy = [syllable_energy(t, voiced_mult, voiceless_mult)</w:t>
+      </w:r>
+    </w:p>
+    <w:p>
+      <w:pPr>
+        <w:spacing w:line="240" w:lineRule="auto" w:after="0" w:before="0"/>
+        <w:ind w:firstLine="0" w:left="283"/>
+        <w:jc w:val="left"/>
+      </w:pPr>
+      <w:r>
+        <w:rPr>
+          <w:rFonts w:ascii="Consolas" w:hAnsi="Consolas" w:eastAsia="Consolas"/>
+          <w:sz w:val="20"/>
+        </w:rPr>
+        <w:t xml:space="preserve">          for (_, _, t) in nodes]</w:t>
+      </w:r>
+    </w:p>
+    <w:p>
+      <w:pPr>
+        <w:spacing w:line="240" w:lineRule="auto" w:after="0" w:before="0"/>
+        <w:ind w:firstLine="0" w:left="283"/>
+        <w:jc w:val="left"/>
+      </w:pPr>
+      <w:r>
+        <w:rPr>
+          <w:rFonts w:ascii="Consolas" w:hAnsi="Consolas" w:eastAsia="Consolas"/>
+          <w:sz w:val="20"/>
+        </w:rPr>
+        <w:t>S = np.zeros((N, N))</w:t>
+      </w:r>
+    </w:p>
+    <w:p>
+      <w:pPr>
+        <w:spacing w:line="240" w:lineRule="auto" w:after="0" w:before="0"/>
+        <w:ind w:firstLine="0" w:left="283"/>
+        <w:jc w:val="left"/>
+      </w:pPr>
+      <w:r>
+        <w:rPr>
+          <w:rFonts w:ascii="Consolas" w:hAnsi="Consolas" w:eastAsia="Consolas"/>
+          <w:sz w:val="20"/>
+        </w:rPr>
+        <w:t>for a in range(N):</w:t>
+      </w:r>
+    </w:p>
+    <w:p>
+      <w:pPr>
+        <w:spacing w:line="240" w:lineRule="auto" w:after="0" w:before="0"/>
+        <w:ind w:firstLine="0" w:left="283"/>
+        <w:jc w:val="left"/>
+      </w:pPr>
+      <w:r>
+        <w:rPr>
+          <w:rFonts w:ascii="Consolas" w:hAnsi="Consolas" w:eastAsia="Consolas"/>
+          <w:sz w:val="20"/>
+        </w:rPr>
+        <w:t xml:space="preserve">    for b in range(a + 1, N):</w:t>
+      </w:r>
+    </w:p>
+    <w:p>
+      <w:pPr>
+        <w:spacing w:line="240" w:lineRule="auto" w:after="0" w:before="0"/>
+        <w:ind w:firstLine="0" w:left="283"/>
+        <w:jc w:val="left"/>
+      </w:pPr>
+      <w:r>
+        <w:rPr>
+          <w:rFonts w:ascii="Consolas" w:hAnsi="Consolas" w:eastAsia="Consolas"/>
+          <w:sz w:val="20"/>
+        </w:rPr>
+        <w:t xml:space="preserve">        d   = manhattan_distance(nodes[a][:2], nodes[b][:2])</w:t>
+      </w:r>
+    </w:p>
+    <w:p>
+      <w:pPr>
+        <w:spacing w:line="240" w:lineRule="auto" w:after="0" w:before="0"/>
+        <w:ind w:firstLine="0" w:left="283"/>
+        <w:jc w:val="left"/>
+      </w:pPr>
+      <w:r>
+        <w:rPr>
+          <w:rFonts w:ascii="Consolas" w:hAnsi="Consolas" w:eastAsia="Consolas"/>
+          <w:sz w:val="20"/>
+        </w:rPr>
+        <w:t xml:space="preserve">        sim = syllable_similarity(nodes[a][2], nodes[b][2], vowel_weight)</w:t>
+      </w:r>
+    </w:p>
+    <w:p>
+      <w:pPr>
+        <w:spacing w:line="240" w:lineRule="auto" w:after="0" w:before="0"/>
+        <w:ind w:firstLine="0" w:left="283"/>
+        <w:jc w:val="left"/>
+      </w:pPr>
+      <w:r>
+        <w:rPr>
+          <w:rFonts w:ascii="Consolas" w:hAnsi="Consolas" w:eastAsia="Consolas"/>
+          <w:sz w:val="20"/>
+        </w:rPr>
+        <w:t xml:space="preserve">        k   = yukawa_kernel(d, lam)                  # экранирование расстоянием</w:t>
+      </w:r>
+    </w:p>
+    <w:p>
+      <w:pPr>
+        <w:spacing w:line="240" w:lineRule="auto" w:after="0" w:before="0"/>
+        <w:ind w:firstLine="0" w:left="283"/>
+        <w:jc w:val="left"/>
+      </w:pPr>
+      <w:r>
+        <w:rPr>
+          <w:rFonts w:ascii="Consolas" w:hAnsi="Consolas" w:eastAsia="Consolas"/>
+          <w:sz w:val="20"/>
+        </w:rPr>
+        <w:t xml:space="preserve">        ef  = abs(energy[a] * energy[b]) / energy_div  # вклад «масс» слогов</w:t>
+      </w:r>
+    </w:p>
+    <w:p>
+      <w:pPr>
+        <w:spacing w:line="240" w:lineRule="auto" w:after="0" w:before="0"/>
+        <w:ind w:firstLine="0" w:left="283"/>
+        <w:jc w:val="left"/>
+      </w:pPr>
+      <w:r>
+        <w:rPr>
+          <w:rFonts w:ascii="Consolas" w:hAnsi="Consolas" w:eastAsia="Consolas"/>
+          <w:sz w:val="20"/>
+        </w:rPr>
+        <w:t xml:space="preserve">        S[a, b] = S[b, a] = sim * k * ef</w:t>
+      </w:r>
+    </w:p>
+    <w:p>
+      <w:pPr>
+        <w:spacing w:line="240" w:lineRule="auto" w:after="0" w:before="0"/>
+        <w:ind w:firstLine="0" w:left="283"/>
+        <w:jc w:val="left"/>
+      </w:pPr>
+      <w:r>
+        <w:rPr>
+          <w:rFonts w:ascii="Consolas" w:hAnsi="Consolas" w:eastAsia="Consolas"/>
+          <w:sz w:val="20"/>
+        </w:rPr>
+        <w:t>S = apply_resonance(S, gamma=gamma)</w:t>
+      </w:r>
+    </w:p>
+    <w:p>
+      <w:pPr>
+        <w:spacing w:line="240" w:lineRule="auto" w:after="0" w:before="0"/>
+        <w:ind w:firstLine="0" w:left="283"/>
+        <w:jc w:val="left"/>
+      </w:pPr>
+      <w:r>
+        <w:rPr>
+          <w:rFonts w:ascii="Consolas" w:hAnsi="Consolas" w:eastAsia="Consolas"/>
+          <w:sz w:val="20"/>
+        </w:rPr>
+        <w:t>S = S / S.max()                                      # нормировка</w:t>
+      </w:r>
+    </w:p>
+    <w:p>
+      <w:pPr>
+        <w:spacing w:line="240" w:lineRule="auto" w:after="0" w:before="0"/>
+        <w:ind w:firstLine="0" w:left="283"/>
+        <w:jc w:val="left"/>
+      </w:pPr>
+      <w:r>
+        <w:rPr>
+          <w:rFonts w:ascii="Consolas" w:hAnsi="Consolas" w:eastAsia="Consolas"/>
+          <w:sz w:val="20"/>
+        </w:rPr>
+        <w:t xml:space="preserve"> </w:t>
+      </w:r>
+    </w:p>
+    <w:p>
+      <w:pPr>
+        <w:spacing w:line="240" w:lineRule="auto" w:after="0" w:before="0"/>
+        <w:ind w:firstLine="0" w:left="283"/>
+        <w:jc w:val="left"/>
+      </w:pPr>
+      <w:r>
+        <w:rPr>
+          <w:rFonts w:ascii="Consolas" w:hAnsi="Consolas" w:eastAsia="Consolas"/>
+          <w:sz w:val="20"/>
+        </w:rPr>
+        <w:t># рифмы = компоненты связности графа при пороге link_ratio * max(S)</w:t>
+      </w:r>
+    </w:p>
+    <w:p>
+      <w:pPr>
+        <w:spacing w:line="240" w:lineRule="auto" w:after="0" w:before="0"/>
+        <w:ind w:firstLine="0" w:left="283"/>
+        <w:jc w:val="left"/>
+      </w:pPr>
+      <w:r>
+        <w:rPr>
+          <w:rFonts w:ascii="Consolas" w:hAnsi="Consolas" w:eastAsia="Consolas"/>
+          <w:sz w:val="20"/>
+        </w:rPr>
+        <w:t>thr = link_ratio * off.max()</w:t>
+      </w:r>
+    </w:p>
+    <w:p>
+      <w:pPr>
+        <w:spacing w:line="240" w:lineRule="auto" w:after="0" w:before="0"/>
+        <w:ind w:firstLine="0" w:left="283"/>
+        <w:jc w:val="left"/>
+      </w:pPr>
+      <w:r>
+        <w:rPr>
+          <w:rFonts w:ascii="Consolas" w:hAnsi="Consolas" w:eastAsia="Consolas"/>
+          <w:sz w:val="20"/>
+        </w:rPr>
+        <w:t>for a in range(N):</w:t>
+      </w:r>
+    </w:p>
+    <w:p>
+      <w:pPr>
+        <w:spacing w:line="240" w:lineRule="auto" w:after="0" w:before="0"/>
+        <w:ind w:firstLine="0" w:left="283"/>
+        <w:jc w:val="left"/>
+      </w:pPr>
+      <w:r>
+        <w:rPr>
+          <w:rFonts w:ascii="Consolas" w:hAnsi="Consolas" w:eastAsia="Consolas"/>
+          <w:sz w:val="20"/>
+        </w:rPr>
+        <w:t xml:space="preserve">    for b in range(a + 1, N):</w:t>
+      </w:r>
+    </w:p>
+    <w:p>
+      <w:pPr>
+        <w:spacing w:line="240" w:lineRule="auto" w:after="0" w:before="0"/>
+        <w:ind w:firstLine="0" w:left="283"/>
+        <w:jc w:val="left"/>
+      </w:pPr>
+      <w:r>
+        <w:rPr>
+          <w:rFonts w:ascii="Consolas" w:hAnsi="Consolas" w:eastAsia="Consolas"/>
+          <w:sz w:val="20"/>
+        </w:rPr>
+        <w:t xml:space="preserve">        if off[a, b] &gt;= thr:</w:t>
+      </w:r>
+    </w:p>
+    <w:p>
+      <w:pPr>
+        <w:spacing w:line="240" w:lineRule="auto" w:after="0" w:before="0"/>
+        <w:ind w:firstLine="0" w:left="283"/>
+        <w:jc w:val="left"/>
+      </w:pPr>
+      <w:r>
+        <w:rPr>
+          <w:rFonts w:ascii="Consolas" w:hAnsi="Consolas" w:eastAsia="Consolas"/>
+          <w:sz w:val="20"/>
+        </w:rPr>
+        <w:t xml:space="preserve">            parent[find(a)] = find(b)   # union-find: объединяем созвучные слоги</w:t>
+      </w:r>
+    </w:p>
+    <w:p>
+      <w:pPr>
+        <w:spacing w:after="120"/>
+      </w:pPr>
+    </w:p>
+    <w:p>
+      <w:r>
+        <w:rPr>
+          <w:b w:val="0"/>
+        </w:rPr>
+        <w:t>Энергия («масса») слога складывается из сонорности гласной и вклада согласных (звонкие тяжелее глухих).</w:t>
+      </w:r>
+    </w:p>
+    <w:p>
+      <w:pPr>
+        <w:keepNext/>
+        <w:spacing w:before="120"/>
+        <w:ind w:firstLine="0"/>
+      </w:pPr>
+      <w:r>
+        <w:t>Листинг Б.3 — Определение энергии слога (syllable energy)</w:t>
+      </w:r>
+    </w:p>
+    <w:p>
+      <w:pPr>
+        <w:spacing w:line="240" w:lineRule="auto" w:after="0" w:before="0"/>
+        <w:ind w:firstLine="0" w:left="283"/>
+        <w:jc w:val="left"/>
+      </w:pPr>
+      <w:r>
+        <w:rPr>
+          <w:rFonts w:ascii="Consolas" w:hAnsi="Consolas" w:eastAsia="Consolas"/>
+          <w:sz w:val="20"/>
+        </w:rPr>
+        <w:t>def syllable_energy(syllable, voiced_mult=2.0, voiceless_mult=0.5):</w:t>
+      </w:r>
+    </w:p>
+    <w:p>
+      <w:pPr>
+        <w:spacing w:line="240" w:lineRule="auto" w:after="0" w:before="0"/>
+        <w:ind w:firstLine="0" w:left="283"/>
+        <w:jc w:val="left"/>
+      </w:pPr>
+      <w:r>
+        <w:rPr>
+          <w:rFonts w:ascii="Consolas" w:hAnsi="Consolas" w:eastAsia="Consolas"/>
+          <w:sz w:val="20"/>
+        </w:rPr>
+        <w:t xml:space="preserve">    """«Масса» слога: основа — сонорность гласной, согласные добавляют</w:t>
+      </w:r>
+    </w:p>
+    <w:p>
+      <w:pPr>
+        <w:spacing w:line="240" w:lineRule="auto" w:after="0" w:before="0"/>
+        <w:ind w:firstLine="0" w:left="283"/>
+        <w:jc w:val="left"/>
+      </w:pPr>
+      <w:r>
+        <w:rPr>
+          <w:rFonts w:ascii="Consolas" w:hAnsi="Consolas" w:eastAsia="Consolas"/>
+          <w:sz w:val="20"/>
+        </w:rPr>
+        <w:t xml:space="preserve">    массу (звонкие тяжелее глухих)."""</w:t>
+      </w:r>
+    </w:p>
+    <w:p>
+      <w:pPr>
+        <w:spacing w:line="240" w:lineRule="auto" w:after="0" w:before="0"/>
+        <w:ind w:firstLine="0" w:left="283"/>
+        <w:jc w:val="left"/>
+      </w:pPr>
+      <w:r>
+        <w:rPr>
+          <w:rFonts w:ascii="Consolas" w:hAnsi="Consolas" w:eastAsia="Consolas"/>
+          <w:sz w:val="20"/>
+        </w:rPr>
+        <w:t xml:space="preserve">    syl = syllable.lower()</w:t>
+      </w:r>
+    </w:p>
+    <w:p>
+      <w:pPr>
+        <w:spacing w:line="240" w:lineRule="auto" w:after="0" w:before="0"/>
+        <w:ind w:firstLine="0" w:left="283"/>
+        <w:jc w:val="left"/>
+      </w:pPr>
+      <w:r>
+        <w:rPr>
+          <w:rFonts w:ascii="Consolas" w:hAnsi="Consolas" w:eastAsia="Consolas"/>
+          <w:sz w:val="20"/>
+        </w:rPr>
+        <w:t xml:space="preserve">    base = 0.0   # сонорность гласной (основной тон)</w:t>
+      </w:r>
+    </w:p>
+    <w:p>
+      <w:pPr>
+        <w:spacing w:line="240" w:lineRule="auto" w:after="0" w:before="0"/>
+        <w:ind w:firstLine="0" w:left="283"/>
+        <w:jc w:val="left"/>
+      </w:pPr>
+      <w:r>
+        <w:rPr>
+          <w:rFonts w:ascii="Consolas" w:hAnsi="Consolas" w:eastAsia="Consolas"/>
+          <w:sz w:val="20"/>
+        </w:rPr>
+        <w:t xml:space="preserve">    mass = 0.0   # вклад согласных</w:t>
+      </w:r>
+    </w:p>
+    <w:p>
+      <w:pPr>
+        <w:spacing w:line="240" w:lineRule="auto" w:after="0" w:before="0"/>
+        <w:ind w:firstLine="0" w:left="283"/>
+        <w:jc w:val="left"/>
+      </w:pPr>
+      <w:r>
+        <w:rPr>
+          <w:rFonts w:ascii="Consolas" w:hAnsi="Consolas" w:eastAsia="Consolas"/>
+          <w:sz w:val="20"/>
+        </w:rPr>
+        <w:t xml:space="preserve">    for ch in syl:</w:t>
+      </w:r>
+    </w:p>
+    <w:p>
+      <w:pPr>
+        <w:spacing w:line="240" w:lineRule="auto" w:after="0" w:before="0"/>
+        <w:ind w:firstLine="0" w:left="283"/>
+        <w:jc w:val="left"/>
+      </w:pPr>
+      <w:r>
+        <w:rPr>
+          <w:rFonts w:ascii="Consolas" w:hAnsi="Consolas" w:eastAsia="Consolas"/>
+          <w:sz w:val="20"/>
+        </w:rPr>
+        <w:t xml:space="preserve">        cls = VOWEL_SOUND.get(ch)</w:t>
+      </w:r>
+    </w:p>
+    <w:p>
+      <w:pPr>
+        <w:spacing w:line="240" w:lineRule="auto" w:after="0" w:before="0"/>
+        <w:ind w:firstLine="0" w:left="283"/>
+        <w:jc w:val="left"/>
+      </w:pPr>
+      <w:r>
+        <w:rPr>
+          <w:rFonts w:ascii="Consolas" w:hAnsi="Consolas" w:eastAsia="Consolas"/>
+          <w:sz w:val="20"/>
+        </w:rPr>
+        <w:t xml:space="preserve">        if cls is not None:</w:t>
+      </w:r>
+    </w:p>
+    <w:p>
+      <w:pPr>
+        <w:spacing w:line="240" w:lineRule="auto" w:after="0" w:before="0"/>
+        <w:ind w:firstLine="0" w:left="283"/>
+        <w:jc w:val="left"/>
+      </w:pPr>
+      <w:r>
+        <w:rPr>
+          <w:rFonts w:ascii="Consolas" w:hAnsi="Consolas" w:eastAsia="Consolas"/>
+          <w:sz w:val="20"/>
+        </w:rPr>
+        <w:t xml:space="preserve">            base = VOWEL_SONORITY[cls]</w:t>
+      </w:r>
+    </w:p>
+    <w:p>
+      <w:pPr>
+        <w:spacing w:line="240" w:lineRule="auto" w:after="0" w:before="0"/>
+        <w:ind w:firstLine="0" w:left="283"/>
+        <w:jc w:val="left"/>
+      </w:pPr>
+      <w:r>
+        <w:rPr>
+          <w:rFonts w:ascii="Consolas" w:hAnsi="Consolas" w:eastAsia="Consolas"/>
+          <w:sz w:val="20"/>
+        </w:rPr>
+        <w:t xml:space="preserve">        else:</w:t>
+      </w:r>
+    </w:p>
+    <w:p>
+      <w:pPr>
+        <w:spacing w:line="240" w:lineRule="auto" w:after="0" w:before="0"/>
+        <w:ind w:firstLine="0" w:left="283"/>
+        <w:jc w:val="left"/>
+      </w:pPr>
+      <w:r>
+        <w:rPr>
+          <w:rFonts w:ascii="Consolas" w:hAnsi="Consolas" w:eastAsia="Consolas"/>
+          <w:sz w:val="20"/>
+        </w:rPr>
+        <w:t xml:space="preserve">            f = CONS_FEATURES.get(ch)</w:t>
+      </w:r>
+    </w:p>
+    <w:p>
+      <w:pPr>
+        <w:spacing w:line="240" w:lineRule="auto" w:after="0" w:before="0"/>
+        <w:ind w:firstLine="0" w:left="283"/>
+        <w:jc w:val="left"/>
+      </w:pPr>
+      <w:r>
+        <w:rPr>
+          <w:rFonts w:ascii="Consolas" w:hAnsi="Consolas" w:eastAsia="Consolas"/>
+          <w:sz w:val="20"/>
+        </w:rPr>
+        <w:t xml:space="preserve">            if f is not None:</w:t>
+      </w:r>
+    </w:p>
+    <w:p>
+      <w:pPr>
+        <w:spacing w:line="240" w:lineRule="auto" w:after="0" w:before="0"/>
+        <w:ind w:firstLine="0" w:left="283"/>
+        <w:jc w:val="left"/>
+      </w:pPr>
+      <w:r>
+        <w:rPr>
+          <w:rFonts w:ascii="Consolas" w:hAnsi="Consolas" w:eastAsia="Consolas"/>
+          <w:sz w:val="20"/>
+        </w:rPr>
+        <w:t xml:space="preserve">                mass += voiced_mult if f[0] else voiceless_mult</w:t>
+      </w:r>
+    </w:p>
+    <w:p>
+      <w:pPr>
+        <w:spacing w:line="240" w:lineRule="auto" w:after="0" w:before="0"/>
+        <w:ind w:firstLine="0" w:left="283"/>
+        <w:jc w:val="left"/>
+      </w:pPr>
+      <w:r>
+        <w:rPr>
+          <w:rFonts w:ascii="Consolas" w:hAnsi="Consolas" w:eastAsia="Consolas"/>
+          <w:sz w:val="20"/>
+        </w:rPr>
+        <w:t xml:space="preserve">    return base * (1.0 + mass)</w:t>
+      </w:r>
+    </w:p>
+    <w:p>
+      <w:pPr>
+        <w:spacing w:after="120"/>
+      </w:pPr>
+    </w:p>
+    <w:p>
+      <w:r>
+        <w:rPr>
+          <w:b w:val="0"/>
+        </w:rPr>
+        <w:t>Фонетическая векторизация: гласная задаёт основной тон (класс звука плюс артикуляция), согласные кодируются «мешком» признаков; схожесть слогов — взвешенный косинус блоков гласной и согласных.</w:t>
+      </w:r>
+    </w:p>
+    <w:p>
+      <w:pPr>
+        <w:keepNext/>
+        <w:spacing w:before="120"/>
+        <w:ind w:firstLine="0"/>
+      </w:pPr>
+      <w:r>
+        <w:t>Листинг Б.4 — Фонетическая векторизация и схожесть слогов</w:t>
+      </w:r>
+    </w:p>
+    <w:p>
+      <w:pPr>
+        <w:spacing w:line="240" w:lineRule="auto" w:after="0" w:before="0"/>
+        <w:ind w:firstLine="0" w:left="283"/>
+        <w:jc w:val="left"/>
+      </w:pPr>
+      <w:r>
+        <w:rPr>
+          <w:rFonts w:ascii="Consolas" w:hAnsi="Consolas" w:eastAsia="Consolas"/>
+          <w:sz w:val="20"/>
+        </w:rPr>
+        <w:t>def syllable_vector(syllable):</w:t>
+      </w:r>
+    </w:p>
+    <w:p>
+      <w:pPr>
+        <w:spacing w:line="240" w:lineRule="auto" w:after="0" w:before="0"/>
+        <w:ind w:firstLine="0" w:left="283"/>
+        <w:jc w:val="left"/>
+      </w:pPr>
+      <w:r>
+        <w:rPr>
+          <w:rFonts w:ascii="Consolas" w:hAnsi="Consolas" w:eastAsia="Consolas"/>
+          <w:sz w:val="20"/>
+        </w:rPr>
+        <w:t xml:space="preserve">    """Слог -&gt; (вектор гласной, вектор согласных)."""</w:t>
+      </w:r>
+    </w:p>
+    <w:p>
+      <w:pPr>
+        <w:spacing w:line="240" w:lineRule="auto" w:after="0" w:before="0"/>
+        <w:ind w:firstLine="0" w:left="283"/>
+        <w:jc w:val="left"/>
+      </w:pPr>
+      <w:r>
+        <w:rPr>
+          <w:rFonts w:ascii="Consolas" w:hAnsi="Consolas" w:eastAsia="Consolas"/>
+          <w:sz w:val="20"/>
+        </w:rPr>
+        <w:t xml:space="preserve">    syl = syllable.lower()</w:t>
+      </w:r>
+    </w:p>
+    <w:p>
+      <w:pPr>
+        <w:spacing w:line="240" w:lineRule="auto" w:after="0" w:before="0"/>
+        <w:ind w:firstLine="0" w:left="283"/>
+        <w:jc w:val="left"/>
+      </w:pPr>
+      <w:r>
+        <w:rPr>
+          <w:rFonts w:ascii="Consolas" w:hAnsi="Consolas" w:eastAsia="Consolas"/>
+          <w:sz w:val="20"/>
+        </w:rPr>
+        <w:t xml:space="preserve">    vvec = np.zeros(len(VOWEL_CLASSES) + 3)</w:t>
+      </w:r>
+    </w:p>
+    <w:p>
+      <w:pPr>
+        <w:spacing w:line="240" w:lineRule="auto" w:after="0" w:before="0"/>
+        <w:ind w:firstLine="0" w:left="283"/>
+        <w:jc w:val="left"/>
+      </w:pPr>
+      <w:r>
+        <w:rPr>
+          <w:rFonts w:ascii="Consolas" w:hAnsi="Consolas" w:eastAsia="Consolas"/>
+          <w:sz w:val="20"/>
+        </w:rPr>
+        <w:t xml:space="preserve">    cvec = np.zeros(CONS_DIM + 1)</w:t>
+      </w:r>
+    </w:p>
+    <w:p>
+      <w:pPr>
+        <w:spacing w:line="240" w:lineRule="auto" w:after="0" w:before="0"/>
+        <w:ind w:firstLine="0" w:left="283"/>
+        <w:jc w:val="left"/>
+      </w:pPr>
+      <w:r>
+        <w:rPr>
+          <w:rFonts w:ascii="Consolas" w:hAnsi="Consolas" w:eastAsia="Consolas"/>
+          <w:sz w:val="20"/>
+        </w:rPr>
+        <w:t xml:space="preserve">    soft = 0.0</w:t>
+      </w:r>
+    </w:p>
+    <w:p>
+      <w:pPr>
+        <w:spacing w:line="240" w:lineRule="auto" w:after="0" w:before="0"/>
+        <w:ind w:firstLine="0" w:left="283"/>
+        <w:jc w:val="left"/>
+      </w:pPr>
+      <w:r>
+        <w:rPr>
+          <w:rFonts w:ascii="Consolas" w:hAnsi="Consolas" w:eastAsia="Consolas"/>
+          <w:sz w:val="20"/>
+        </w:rPr>
+        <w:t xml:space="preserve">    for ch in syl:</w:t>
+      </w:r>
+    </w:p>
+    <w:p>
+      <w:pPr>
+        <w:spacing w:line="240" w:lineRule="auto" w:after="0" w:before="0"/>
+        <w:ind w:firstLine="0" w:left="283"/>
+        <w:jc w:val="left"/>
+      </w:pPr>
+      <w:r>
+        <w:rPr>
+          <w:rFonts w:ascii="Consolas" w:hAnsi="Consolas" w:eastAsia="Consolas"/>
+          <w:sz w:val="20"/>
+        </w:rPr>
+        <w:t xml:space="preserve">        cls = VOWEL_SOUND.get(ch)</w:t>
+      </w:r>
+    </w:p>
+    <w:p>
+      <w:pPr>
+        <w:spacing w:line="240" w:lineRule="auto" w:after="0" w:before="0"/>
+        <w:ind w:firstLine="0" w:left="283"/>
+        <w:jc w:val="left"/>
+      </w:pPr>
+      <w:r>
+        <w:rPr>
+          <w:rFonts w:ascii="Consolas" w:hAnsi="Consolas" w:eastAsia="Consolas"/>
+          <w:sz w:val="20"/>
+        </w:rPr>
+        <w:t xml:space="preserve">        if cls is not None:                      # гласная: класс + артикуляция</w:t>
+      </w:r>
+    </w:p>
+    <w:p>
+      <w:pPr>
+        <w:spacing w:line="240" w:lineRule="auto" w:after="0" w:before="0"/>
+        <w:ind w:firstLine="0" w:left="283"/>
+        <w:jc w:val="left"/>
+      </w:pPr>
+      <w:r>
+        <w:rPr>
+          <w:rFonts w:ascii="Consolas" w:hAnsi="Consolas" w:eastAsia="Consolas"/>
+          <w:sz w:val="20"/>
+        </w:rPr>
+        <w:t xml:space="preserve">            vvec[VOWEL_CLASSES.index(cls)] = VOWEL_CLASS_WEIGHT</w:t>
+      </w:r>
+    </w:p>
+    <w:p>
+      <w:pPr>
+        <w:spacing w:line="240" w:lineRule="auto" w:after="0" w:before="0"/>
+        <w:ind w:firstLine="0" w:left="283"/>
+        <w:jc w:val="left"/>
+      </w:pPr>
+      <w:r>
+        <w:rPr>
+          <w:rFonts w:ascii="Consolas" w:hAnsi="Consolas" w:eastAsia="Consolas"/>
+          <w:sz w:val="20"/>
+        </w:rPr>
+        <w:t xml:space="preserve">            vvec[len(VOWEL_CLASSES):] = np.multiply(VOWEL_ARTIC[cls],</w:t>
+      </w:r>
+    </w:p>
+    <w:p>
+      <w:pPr>
+        <w:spacing w:line="240" w:lineRule="auto" w:after="0" w:before="0"/>
+        <w:ind w:firstLine="0" w:left="283"/>
+        <w:jc w:val="left"/>
+      </w:pPr>
+      <w:r>
+        <w:rPr>
+          <w:rFonts w:ascii="Consolas" w:hAnsi="Consolas" w:eastAsia="Consolas"/>
+          <w:sz w:val="20"/>
+        </w:rPr>
+        <w:t xml:space="preserve">                                                    VOWEL_ARTIC_WEIGHT)</w:t>
+      </w:r>
+    </w:p>
+    <w:p>
+      <w:pPr>
+        <w:spacing w:line="240" w:lineRule="auto" w:after="0" w:before="0"/>
+        <w:ind w:firstLine="0" w:left="283"/>
+        <w:jc w:val="left"/>
+      </w:pPr>
+      <w:r>
+        <w:rPr>
+          <w:rFonts w:ascii="Consolas" w:hAnsi="Consolas" w:eastAsia="Consolas"/>
+          <w:sz w:val="20"/>
+        </w:rPr>
+        <w:t xml:space="preserve">            if ch in SOFTENING_VOWELS:</w:t>
+      </w:r>
+    </w:p>
+    <w:p>
+      <w:pPr>
+        <w:spacing w:line="240" w:lineRule="auto" w:after="0" w:before="0"/>
+        <w:ind w:firstLine="0" w:left="283"/>
+        <w:jc w:val="left"/>
+      </w:pPr>
+      <w:r>
+        <w:rPr>
+          <w:rFonts w:ascii="Consolas" w:hAnsi="Consolas" w:eastAsia="Consolas"/>
+          <w:sz w:val="20"/>
+        </w:rPr>
+        <w:t xml:space="preserve">                soft = 1.0</w:t>
+      </w:r>
+    </w:p>
+    <w:p>
+      <w:pPr>
+        <w:spacing w:line="240" w:lineRule="auto" w:after="0" w:before="0"/>
+        <w:ind w:firstLine="0" w:left="283"/>
+        <w:jc w:val="left"/>
+      </w:pPr>
+      <w:r>
+        <w:rPr>
+          <w:rFonts w:ascii="Consolas" w:hAnsi="Consolas" w:eastAsia="Consolas"/>
+          <w:sz w:val="20"/>
+        </w:rPr>
+        <w:t xml:space="preserve">        elif ch == 'ь':</w:t>
+      </w:r>
+    </w:p>
+    <w:p>
+      <w:pPr>
+        <w:spacing w:line="240" w:lineRule="auto" w:after="0" w:before="0"/>
+        <w:ind w:firstLine="0" w:left="283"/>
+        <w:jc w:val="left"/>
+      </w:pPr>
+      <w:r>
+        <w:rPr>
+          <w:rFonts w:ascii="Consolas" w:hAnsi="Consolas" w:eastAsia="Consolas"/>
+          <w:sz w:val="20"/>
+        </w:rPr>
+        <w:t xml:space="preserve">            soft = 1.0</w:t>
+      </w:r>
+    </w:p>
+    <w:p>
+      <w:pPr>
+        <w:spacing w:line="240" w:lineRule="auto" w:after="0" w:before="0"/>
+        <w:ind w:firstLine="0" w:left="283"/>
+        <w:jc w:val="left"/>
+      </w:pPr>
+      <w:r>
+        <w:rPr>
+          <w:rFonts w:ascii="Consolas" w:hAnsi="Consolas" w:eastAsia="Consolas"/>
+          <w:sz w:val="20"/>
+        </w:rPr>
+        <w:t xml:space="preserve">        else:</w:t>
+      </w:r>
+    </w:p>
+    <w:p>
+      <w:pPr>
+        <w:spacing w:line="240" w:lineRule="auto" w:after="0" w:before="0"/>
+        <w:ind w:firstLine="0" w:left="283"/>
+        <w:jc w:val="left"/>
+      </w:pPr>
+      <w:r>
+        <w:rPr>
+          <w:rFonts w:ascii="Consolas" w:hAnsi="Consolas" w:eastAsia="Consolas"/>
+          <w:sz w:val="20"/>
+        </w:rPr>
+        <w:t xml:space="preserve">            f = CONS_FEATURES.get(ch)            # согласные: «мешок» признаков</w:t>
+      </w:r>
+    </w:p>
+    <w:p>
+      <w:pPr>
+        <w:spacing w:line="240" w:lineRule="auto" w:after="0" w:before="0"/>
+        <w:ind w:firstLine="0" w:left="283"/>
+        <w:jc w:val="left"/>
+      </w:pPr>
+      <w:r>
+        <w:rPr>
+          <w:rFonts w:ascii="Consolas" w:hAnsi="Consolas" w:eastAsia="Consolas"/>
+          <w:sz w:val="20"/>
+        </w:rPr>
+        <w:t xml:space="preserve">            if f is not None:</w:t>
+      </w:r>
+    </w:p>
+    <w:p>
+      <w:pPr>
+        <w:spacing w:line="240" w:lineRule="auto" w:after="0" w:before="0"/>
+        <w:ind w:firstLine="0" w:left="283"/>
+        <w:jc w:val="left"/>
+      </w:pPr>
+      <w:r>
+        <w:rPr>
+          <w:rFonts w:ascii="Consolas" w:hAnsi="Consolas" w:eastAsia="Consolas"/>
+          <w:sz w:val="20"/>
+        </w:rPr>
+        <w:t xml:space="preserve">                cvec[:CONS_DIM] += f</w:t>
+      </w:r>
+    </w:p>
+    <w:p>
+      <w:pPr>
+        <w:spacing w:line="240" w:lineRule="auto" w:after="0" w:before="0"/>
+        <w:ind w:firstLine="0" w:left="283"/>
+        <w:jc w:val="left"/>
+      </w:pPr>
+      <w:r>
+        <w:rPr>
+          <w:rFonts w:ascii="Consolas" w:hAnsi="Consolas" w:eastAsia="Consolas"/>
+          <w:sz w:val="20"/>
+        </w:rPr>
+        <w:t xml:space="preserve">    cvec[CONS_DIM] = soft * SOFT_WEIGHT</w:t>
+      </w:r>
+    </w:p>
+    <w:p>
+      <w:pPr>
+        <w:spacing w:line="240" w:lineRule="auto" w:after="0" w:before="0"/>
+        <w:ind w:firstLine="0" w:left="283"/>
+        <w:jc w:val="left"/>
+      </w:pPr>
+      <w:r>
+        <w:rPr>
+          <w:rFonts w:ascii="Consolas" w:hAnsi="Consolas" w:eastAsia="Consolas"/>
+          <w:sz w:val="20"/>
+        </w:rPr>
+        <w:t xml:space="preserve">    return vvec, cvec</w:t>
+      </w:r>
+    </w:p>
+    <w:p>
+      <w:pPr>
+        <w:spacing w:line="240" w:lineRule="auto" w:after="0" w:before="0"/>
+        <w:ind w:firstLine="0" w:left="283"/>
+        <w:jc w:val="left"/>
+      </w:pPr>
+      <w:r>
+        <w:rPr>
+          <w:rFonts w:ascii="Consolas" w:hAnsi="Consolas" w:eastAsia="Consolas"/>
+          <w:sz w:val="20"/>
+        </w:rPr>
+        <w:t xml:space="preserve"> </w:t>
+      </w:r>
+    </w:p>
+    <w:p>
+      <w:pPr>
+        <w:spacing w:line="240" w:lineRule="auto" w:after="0" w:before="0"/>
+        <w:ind w:firstLine="0" w:left="283"/>
+        <w:jc w:val="left"/>
+      </w:pPr>
+      <w:r>
+        <w:rPr>
+          <w:rFonts w:ascii="Consolas" w:hAnsi="Consolas" w:eastAsia="Consolas"/>
+          <w:sz w:val="20"/>
+        </w:rPr>
+        <w:t xml:space="preserve"> </w:t>
+      </w:r>
+    </w:p>
+    <w:p>
+      <w:pPr>
+        <w:spacing w:line="240" w:lineRule="auto" w:after="0" w:before="0"/>
+        <w:ind w:firstLine="0" w:left="283"/>
+        <w:jc w:val="left"/>
+      </w:pPr>
+      <w:r>
+        <w:rPr>
+          <w:rFonts w:ascii="Consolas" w:hAnsi="Consolas" w:eastAsia="Consolas"/>
+          <w:sz w:val="20"/>
+        </w:rPr>
+        <w:t>def syllable_similarity(s1, s2, vowel_weight=0.6):</w:t>
+      </w:r>
+    </w:p>
+    <w:p>
+      <w:pPr>
+        <w:spacing w:line="240" w:lineRule="auto" w:after="0" w:before="0"/>
+        <w:ind w:firstLine="0" w:left="283"/>
+        <w:jc w:val="left"/>
+      </w:pPr>
+      <w:r>
+        <w:rPr>
+          <w:rFonts w:ascii="Consolas" w:hAnsi="Consolas" w:eastAsia="Consolas"/>
+          <w:sz w:val="20"/>
+        </w:rPr>
+        <w:t xml:space="preserve">    """Схожесть = vowel_weight*cos(гласные) + (1-vowel_weight)*cos(согласные)."""</w:t>
+      </w:r>
+    </w:p>
+    <w:p>
+      <w:pPr>
+        <w:spacing w:line="240" w:lineRule="auto" w:after="0" w:before="0"/>
+        <w:ind w:firstLine="0" w:left="283"/>
+        <w:jc w:val="left"/>
+      </w:pPr>
+      <w:r>
+        <w:rPr>
+          <w:rFonts w:ascii="Consolas" w:hAnsi="Consolas" w:eastAsia="Consolas"/>
+          <w:sz w:val="20"/>
+        </w:rPr>
+        <w:t xml:space="preserve">    v1, c1 = syllable_vector(s1)</w:t>
+      </w:r>
+    </w:p>
+    <w:p>
+      <w:pPr>
+        <w:spacing w:line="240" w:lineRule="auto" w:after="0" w:before="0"/>
+        <w:ind w:firstLine="0" w:left="283"/>
+        <w:jc w:val="left"/>
+      </w:pPr>
+      <w:r>
+        <w:rPr>
+          <w:rFonts w:ascii="Consolas" w:hAnsi="Consolas" w:eastAsia="Consolas"/>
+          <w:sz w:val="20"/>
+        </w:rPr>
+        <w:t xml:space="preserve">    v2, c2 = syllable_vector(s2)</w:t>
+      </w:r>
+    </w:p>
+    <w:p>
+      <w:pPr>
+        <w:spacing w:line="240" w:lineRule="auto" w:after="0" w:before="0"/>
+        <w:ind w:firstLine="0" w:left="283"/>
+        <w:jc w:val="left"/>
+      </w:pPr>
+      <w:r>
+        <w:rPr>
+          <w:rFonts w:ascii="Consolas" w:hAnsi="Consolas" w:eastAsia="Consolas"/>
+          <w:sz w:val="20"/>
+        </w:rPr>
+        <w:t xml:space="preserve">    return vowel_weight * _cosine(v1, v2) + (1.0 - vowel_weight) * _cosine(c1, c2)</w:t>
+      </w:r>
+    </w:p>
+    <w:p>
+      <w:pPr>
+        <w:spacing w:after="120"/>
+      </w:pPr>
+    </w:p>
+    <w:p>
+      <w:r>
+        <w:rPr>
+          <w:b w:val="0"/>
+        </w:rPr>
+        <w:t>Взаимодействие с ИИ построено как цикл «генерация — оценка — коррекция». Системный промпт и запрос best-of-N:</w:t>
+      </w:r>
+    </w:p>
+    <w:p>
+      <w:pPr>
+        <w:keepNext/>
+        <w:spacing w:before="120"/>
+        <w:ind w:firstLine="0"/>
+      </w:pPr>
+      <w:r>
+        <w:t>Листинг Б.5 — Системный промпт и промпт генерации (best-of-N)</w:t>
+      </w:r>
+    </w:p>
+    <w:p>
+      <w:pPr>
+        <w:spacing w:line="240" w:lineRule="auto" w:after="0" w:before="0"/>
+        <w:ind w:firstLine="0" w:left="283"/>
+        <w:jc w:val="left"/>
+      </w:pPr>
+      <w:r>
+        <w:rPr>
+          <w:rFonts w:ascii="Consolas" w:hAnsi="Consolas" w:eastAsia="Consolas"/>
+          <w:sz w:val="20"/>
+        </w:rPr>
+        <w:t>SYSTEM = (</w:t>
+      </w:r>
+    </w:p>
+    <w:p>
+      <w:pPr>
+        <w:spacing w:line="240" w:lineRule="auto" w:after="0" w:before="0"/>
+        <w:ind w:firstLine="0" w:left="283"/>
+        <w:jc w:val="left"/>
+      </w:pPr>
+      <w:r>
+        <w:rPr>
+          <w:rFonts w:ascii="Consolas" w:hAnsi="Consolas" w:eastAsia="Consolas"/>
+          <w:sz w:val="20"/>
+        </w:rPr>
+        <w:t xml:space="preserve">    "Ты — русский поэт. Сочиняешь силлабо-тонические рифмованные стихи. "</w:t>
+      </w:r>
+    </w:p>
+    <w:p>
+      <w:pPr>
+        <w:spacing w:line="240" w:lineRule="auto" w:after="0" w:before="0"/>
+        <w:ind w:firstLine="0" w:left="283"/>
+        <w:jc w:val="left"/>
+      </w:pPr>
+      <w:r>
+        <w:rPr>
+          <w:rFonts w:ascii="Consolas" w:hAnsi="Consolas" w:eastAsia="Consolas"/>
+          <w:sz w:val="20"/>
+        </w:rPr>
+        <w:t xml:space="preserve">    "Строго соблюдаешь заданные тему, стихотворный размер, число строк и "</w:t>
+      </w:r>
+    </w:p>
+    <w:p>
+      <w:pPr>
+        <w:spacing w:line="240" w:lineRule="auto" w:after="0" w:before="0"/>
+        <w:ind w:firstLine="0" w:left="283"/>
+        <w:jc w:val="left"/>
+      </w:pPr>
+      <w:r>
+        <w:rPr>
+          <w:rFonts w:ascii="Consolas" w:hAnsi="Consolas" w:eastAsia="Consolas"/>
+          <w:sz w:val="20"/>
+        </w:rPr>
+        <w:t xml:space="preserve">    "схему рифмовки. Отвечаешь только в запрошенном формате JSON, без пояснений."</w:t>
+      </w:r>
+    </w:p>
+    <w:p>
+      <w:pPr>
+        <w:spacing w:line="240" w:lineRule="auto" w:after="0" w:before="0"/>
+        <w:ind w:firstLine="0" w:left="283"/>
+        <w:jc w:val="left"/>
+      </w:pPr>
+      <w:r>
+        <w:rPr>
+          <w:rFonts w:ascii="Consolas" w:hAnsi="Consolas" w:eastAsia="Consolas"/>
+          <w:sz w:val="20"/>
+        </w:rPr>
+        <w:t>)</w:t>
+      </w:r>
+    </w:p>
+    <w:p>
+      <w:pPr>
+        <w:spacing w:line="240" w:lineRule="auto" w:after="0" w:before="0"/>
+        <w:ind w:firstLine="0" w:left="283"/>
+        <w:jc w:val="left"/>
+      </w:pPr>
+      <w:r>
+        <w:rPr>
+          <w:rFonts w:ascii="Consolas" w:hAnsi="Consolas" w:eastAsia="Consolas"/>
+          <w:sz w:val="20"/>
+        </w:rPr>
+        <w:t xml:space="preserve"> </w:t>
+      </w:r>
+    </w:p>
+    <w:p>
+      <w:pPr>
+        <w:spacing w:line="240" w:lineRule="auto" w:after="0" w:before="0"/>
+        <w:ind w:firstLine="0" w:left="283"/>
+        <w:jc w:val="left"/>
+      </w:pPr>
+      <w:r>
+        <w:rPr>
+          <w:rFonts w:ascii="Consolas" w:hAnsi="Consolas" w:eastAsia="Consolas"/>
+          <w:sz w:val="20"/>
+        </w:rPr>
+        <w:t># generate(): best-of-N — за один вызов модель выдаёт N разных вариантов</w:t>
+      </w:r>
+    </w:p>
+    <w:p>
+      <w:pPr>
+        <w:spacing w:line="240" w:lineRule="auto" w:after="0" w:before="0"/>
+        <w:ind w:firstLine="0" w:left="283"/>
+        <w:jc w:val="left"/>
+      </w:pPr>
+      <w:r>
+        <w:rPr>
+          <w:rFonts w:ascii="Consolas" w:hAnsi="Consolas" w:eastAsia="Consolas"/>
+          <w:sz w:val="20"/>
+        </w:rPr>
+        <w:t>user = (</w:t>
+      </w:r>
+    </w:p>
+    <w:p>
+      <w:pPr>
+        <w:spacing w:line="240" w:lineRule="auto" w:after="0" w:before="0"/>
+        <w:ind w:firstLine="0" w:left="283"/>
+        <w:jc w:val="left"/>
+      </w:pPr>
+      <w:r>
+        <w:rPr>
+          <w:rFonts w:ascii="Consolas" w:hAnsi="Consolas" w:eastAsia="Consolas"/>
+          <w:sz w:val="20"/>
+        </w:rPr>
+        <w:t xml:space="preserve">    f"Сочини {n} РАЗНЫХ вариантов стихотворения.\n"</w:t>
+      </w:r>
+    </w:p>
+    <w:p>
+      <w:pPr>
+        <w:spacing w:line="240" w:lineRule="auto" w:after="0" w:before="0"/>
+        <w:ind w:firstLine="0" w:left="283"/>
+        <w:jc w:val="left"/>
+      </w:pPr>
+      <w:r>
+        <w:rPr>
+          <w:rFonts w:ascii="Consolas" w:hAnsi="Consolas" w:eastAsia="Consolas"/>
+          <w:sz w:val="20"/>
+        </w:rPr>
+        <w:t xml:space="preserve">    f"Тема: {theme}\n"</w:t>
+      </w:r>
+    </w:p>
+    <w:p>
+      <w:pPr>
+        <w:spacing w:line="240" w:lineRule="auto" w:after="0" w:before="0"/>
+        <w:ind w:firstLine="0" w:left="283"/>
+        <w:jc w:val="left"/>
+      </w:pPr>
+      <w:r>
+        <w:rPr>
+          <w:rFonts w:ascii="Consolas" w:hAnsi="Consolas" w:eastAsia="Consolas"/>
+          <w:sz w:val="20"/>
+        </w:rPr>
+        <w:t xml:space="preserve">    f"Размер: {params.meter}\n"</w:t>
+      </w:r>
+    </w:p>
+    <w:p>
+      <w:pPr>
+        <w:spacing w:line="240" w:lineRule="auto" w:after="0" w:before="0"/>
+        <w:ind w:firstLine="0" w:left="283"/>
+        <w:jc w:val="left"/>
+      </w:pPr>
+      <w:r>
+        <w:rPr>
+          <w:rFonts w:ascii="Consolas" w:hAnsi="Consolas" w:eastAsia="Consolas"/>
+          <w:sz w:val="20"/>
+        </w:rPr>
+        <w:t xml:space="preserve">    f"Число строк в каждом: {params.n_lines}\n"</w:t>
+      </w:r>
+    </w:p>
+    <w:p>
+      <w:pPr>
+        <w:spacing w:line="240" w:lineRule="auto" w:after="0" w:before="0"/>
+        <w:ind w:firstLine="0" w:left="283"/>
+        <w:jc w:val="left"/>
+      </w:pPr>
+      <w:r>
+        <w:rPr>
+          <w:rFonts w:ascii="Consolas" w:hAnsi="Consolas" w:eastAsia="Consolas"/>
+          <w:sz w:val="20"/>
+        </w:rPr>
+        <w:t xml:space="preserve">    f"Схема рифмовки: {params.scheme}\n"</w:t>
+      </w:r>
+    </w:p>
+    <w:p>
+      <w:pPr>
+        <w:spacing w:line="240" w:lineRule="auto" w:after="0" w:before="0"/>
+        <w:ind w:firstLine="0" w:left="283"/>
+        <w:jc w:val="left"/>
+      </w:pPr>
+      <w:r>
+        <w:rPr>
+          <w:rFonts w:ascii="Consolas" w:hAnsi="Consolas" w:eastAsia="Consolas"/>
+          <w:sz w:val="20"/>
+        </w:rPr>
+        <w:t xml:space="preserve">    f"Каждый вариант — ровно {params.n_lines} строк, строки разделяй '\n'. "</w:t>
+      </w:r>
+    </w:p>
+    <w:p>
+      <w:pPr>
+        <w:spacing w:line="240" w:lineRule="auto" w:after="0" w:before="0"/>
+        <w:ind w:firstLine="0" w:left="283"/>
+        <w:jc w:val="left"/>
+      </w:pPr>
+      <w:r>
+        <w:rPr>
+          <w:rFonts w:ascii="Consolas" w:hAnsi="Consolas" w:eastAsia="Consolas"/>
+          <w:sz w:val="20"/>
+        </w:rPr>
+        <w:t xml:space="preserve">    f"Добивайся точной рифмы по схеме {params.scheme}."</w:t>
+      </w:r>
+    </w:p>
+    <w:p>
+      <w:pPr>
+        <w:spacing w:line="240" w:lineRule="auto" w:after="0" w:before="0"/>
+        <w:ind w:firstLine="0" w:left="283"/>
+        <w:jc w:val="left"/>
+      </w:pPr>
+      <w:r>
+        <w:rPr>
+          <w:rFonts w:ascii="Consolas" w:hAnsi="Consolas" w:eastAsia="Consolas"/>
+          <w:sz w:val="20"/>
+        </w:rPr>
+        <w:t>)</w:t>
+      </w:r>
+    </w:p>
+    <w:p>
+      <w:pPr>
+        <w:spacing w:after="120"/>
+      </w:pPr>
+    </w:p>
+    <w:p>
+      <w:r>
+        <w:rPr>
+          <w:b w:val="0"/>
+        </w:rPr>
+        <w:t>Самокоррекция: модели передаётся разбор рифмы детектора с указанием, какие окончания сохранить, а какие переписать.</w:t>
+      </w:r>
+    </w:p>
+    <w:p>
+      <w:pPr>
+        <w:keepNext/>
+        <w:spacing w:before="120"/>
+        <w:ind w:firstLine="0"/>
+      </w:pPr>
+      <w:r>
+        <w:t>Листинг Б.6 — Промпт самокоррекции по обратной связи детектора</w:t>
+      </w:r>
+    </w:p>
+    <w:p>
+      <w:pPr>
+        <w:spacing w:line="240" w:lineRule="auto" w:after="0" w:before="0"/>
+        <w:ind w:firstLine="0" w:left="283"/>
+        <w:jc w:val="left"/>
+      </w:pPr>
+      <w:r>
+        <w:rPr>
+          <w:rFonts w:ascii="Consolas" w:hAnsi="Consolas" w:eastAsia="Consolas"/>
+          <w:sz w:val="20"/>
+        </w:rPr>
+        <w:t># improve(): переписать стих, улучшив рифму по разбору детектора</w:t>
+      </w:r>
+    </w:p>
+    <w:p>
+      <w:pPr>
+        <w:spacing w:line="240" w:lineRule="auto" w:after="0" w:before="0"/>
+        <w:ind w:firstLine="0" w:left="283"/>
+        <w:jc w:val="left"/>
+      </w:pPr>
+      <w:r>
+        <w:rPr>
+          <w:rFonts w:ascii="Consolas" w:hAnsi="Consolas" w:eastAsia="Consolas"/>
+          <w:sz w:val="20"/>
+        </w:rPr>
+        <w:t>user = (</w:t>
+      </w:r>
+    </w:p>
+    <w:p>
+      <w:pPr>
+        <w:spacing w:line="240" w:lineRule="auto" w:after="0" w:before="0"/>
+        <w:ind w:firstLine="0" w:left="283"/>
+        <w:jc w:val="left"/>
+      </w:pPr>
+      <w:r>
+        <w:rPr>
+          <w:rFonts w:ascii="Consolas" w:hAnsi="Consolas" w:eastAsia="Consolas"/>
+          <w:sz w:val="20"/>
+        </w:rPr>
+        <w:t xml:space="preserve">    "Вот стихотворение и разбор его рифмы:\n\n"</w:t>
+      </w:r>
+    </w:p>
+    <w:p>
+      <w:pPr>
+        <w:spacing w:line="240" w:lineRule="auto" w:after="0" w:before="0"/>
+        <w:ind w:firstLine="0" w:left="283"/>
+        <w:jc w:val="left"/>
+      </w:pPr>
+      <w:r>
+        <w:rPr>
+          <w:rFonts w:ascii="Consolas" w:hAnsi="Consolas" w:eastAsia="Consolas"/>
+          <w:sz w:val="20"/>
+        </w:rPr>
+        <w:t xml:space="preserve">    f"СТИХ:\n{text}\n\n"</w:t>
+      </w:r>
+    </w:p>
+    <w:p>
+      <w:pPr>
+        <w:spacing w:line="240" w:lineRule="auto" w:after="0" w:before="0"/>
+        <w:ind w:firstLine="0" w:left="283"/>
+        <w:jc w:val="left"/>
+      </w:pPr>
+      <w:r>
+        <w:rPr>
+          <w:rFonts w:ascii="Consolas" w:hAnsi="Consolas" w:eastAsia="Consolas"/>
+          <w:sz w:val="20"/>
+        </w:rPr>
+        <w:t xml:space="preserve">    f"РАЗБОР: {feedback}\n\n"</w:t>
+      </w:r>
+    </w:p>
+    <w:p>
+      <w:pPr>
+        <w:spacing w:line="240" w:lineRule="auto" w:after="0" w:before="0"/>
+        <w:ind w:firstLine="0" w:left="283"/>
+        <w:jc w:val="left"/>
+      </w:pPr>
+      <w:r>
+        <w:rPr>
+          <w:rFonts w:ascii="Consolas" w:hAnsi="Consolas" w:eastAsia="Consolas"/>
+          <w:sz w:val="20"/>
+        </w:rPr>
+        <w:t xml:space="preserve">    "Перепиши стихотворение, улучшив рифму: СОХРАНИ хорошо рифмующиеся "</w:t>
+      </w:r>
+    </w:p>
+    <w:p>
+      <w:pPr>
+        <w:spacing w:line="240" w:lineRule="auto" w:after="0" w:before="0"/>
+        <w:ind w:firstLine="0" w:left="283"/>
+        <w:jc w:val="left"/>
+      </w:pPr>
+      <w:r>
+        <w:rPr>
+          <w:rFonts w:ascii="Consolas" w:hAnsi="Consolas" w:eastAsia="Consolas"/>
+          <w:sz w:val="20"/>
+        </w:rPr>
+        <w:t xml:space="preserve">    "окончания, перепиши только плохие строки. Обязательно обеспечь: "</w:t>
+      </w:r>
+    </w:p>
+    <w:p>
+      <w:pPr>
+        <w:spacing w:line="240" w:lineRule="auto" w:after="0" w:before="0"/>
+        <w:ind w:firstLine="0" w:left="283"/>
+        <w:jc w:val="left"/>
+      </w:pPr>
+      <w:r>
+        <w:rPr>
+          <w:rFonts w:ascii="Consolas" w:hAnsi="Consolas" w:eastAsia="Consolas"/>
+          <w:sz w:val="20"/>
+        </w:rPr>
+        <w:t xml:space="preserve">    "естественную читаемость (живой порядок слов, без неуклюжих инверсий "</w:t>
+      </w:r>
+    </w:p>
+    <w:p>
+      <w:pPr>
+        <w:spacing w:line="240" w:lineRule="auto" w:after="0" w:before="0"/>
+        <w:ind w:firstLine="0" w:left="283"/>
+        <w:jc w:val="left"/>
+      </w:pPr>
+      <w:r>
+        <w:rPr>
+          <w:rFonts w:ascii="Consolas" w:hAnsi="Consolas" w:eastAsia="Consolas"/>
+          <w:sz w:val="20"/>
+        </w:rPr>
+        <w:t xml:space="preserve">    "ради рифмы), связный смысл, точную рифму по схеме "</w:t>
+      </w:r>
+    </w:p>
+    <w:p>
+      <w:pPr>
+        <w:spacing w:line="240" w:lineRule="auto" w:after="0" w:before="0"/>
+        <w:ind w:firstLine="0" w:left="283"/>
+        <w:jc w:val="left"/>
+      </w:pPr>
+      <w:r>
+        <w:rPr>
+          <w:rFonts w:ascii="Consolas" w:hAnsi="Consolas" w:eastAsia="Consolas"/>
+          <w:sz w:val="20"/>
+        </w:rPr>
+        <w:t xml:space="preserve">    f"{params.scheme}, выдержанный размер {params.meter} и ровно "</w:t>
+      </w:r>
+    </w:p>
+    <w:p>
+      <w:pPr>
+        <w:spacing w:line="240" w:lineRule="auto" w:after="0" w:before="0"/>
+        <w:ind w:firstLine="0" w:left="283"/>
+        <w:jc w:val="left"/>
+      </w:pPr>
+      <w:r>
+        <w:rPr>
+          <w:rFonts w:ascii="Consolas" w:hAnsi="Consolas" w:eastAsia="Consolas"/>
+          <w:sz w:val="20"/>
+        </w:rPr>
+        <w:t xml:space="preserve">    f"{params.n_lines} строк. Сохрани тему «{theme}»."</w:t>
+      </w:r>
+    </w:p>
+    <w:p>
+      <w:pPr>
+        <w:spacing w:line="240" w:lineRule="auto" w:after="0" w:before="0"/>
+        <w:ind w:firstLine="0" w:left="283"/>
+        <w:jc w:val="left"/>
+      </w:pPr>
+      <w:r>
+        <w:rPr>
+          <w:rFonts w:ascii="Consolas" w:hAnsi="Consolas" w:eastAsia="Consolas"/>
+          <w:sz w:val="20"/>
+        </w:rPr>
+        <w:t>)</w:t>
+      </w:r>
+    </w:p>
+    <w:p>
+      <w:pPr>
+        <w:spacing w:after="120"/>
+      </w:pPr>
     </w:p>
     <w:sectPr>
       <w:footerReference w:type="default" r:id="rId9"/>
@@ -5328,7 +7449,7 @@
       <w:b/>
       <w:bCs/>
       <w:color w:val="000000"/>
-      <w:sz w:val="28"/>
+      <w:sz w:val="32"/>
       <w:szCs w:val="28"/>
     </w:rPr>
   </w:style>

</xml_diff>

<commit_message>
feat: add gantt diagramm
</commit_message>
<xml_diff>
--- a/docs/practice/Отчёт_учебная_практика.docx
+++ b/docs/practice/Отчёт_учебная_практика.docx
@@ -642,7 +642,7 @@
       </w:r>
       <w:r>
         <w:tab/>
-        <w:t>14</w:t>
+        <w:t>13</w:t>
       </w:r>
     </w:p>
     <w:p>
@@ -810,7 +810,7 @@
         <w:rPr>
           <w:b/>
         </w:rPr>
-        <w:t>ПРИЛОЖЕНИЕ А. Интерфейс приложения «Rhymer»</w:t>
+        <w:t>ПРИЛОЖЕНИЕ А. Диаграмма Ганта и интерфейс приложения «Rhymer»</w:t>
       </w:r>
       <w:r>
         <w:tab/>
@@ -4890,7 +4890,7 @@
         <w:pageBreakBefore/>
       </w:pPr>
       <w:r>
-        <w:t>ПРИЛОЖЕНИЕ А. Интерфейс приложения «Rhymer»</w:t>
+        <w:t>ПРИЛОЖЕНИЕ А. Диаграмма Ганта и интерфейс приложения «Rhymer»</w:t>
       </w:r>
     </w:p>
     <w:p>
@@ -4910,7 +4910,7 @@
         <w:rPr>
           <w:b w:val="0"/>
         </w:rPr>
-        <w:t>Прототип «Rhymer» реализован как десктоп-приложение на PySide6. Ниже приведены экранные снимки основных режимов работы: генерации стиха, его улучшения по обратной связи детектора, а также оценки рифмы двумя взаимозаменяемыми детекторами (RPST и авторский алгоритм на потенциале Юкавы).</w:t>
+        <w:t>Ниже приведены диаграмма Ганта плана работы над ВКР (глава 2) и экранные снимки прототипа «Rhymer» — десктоп-приложения на PySide6: генерация стиха, его улучшение по обратной связи детектора и оценка рифмы двумя взаимозаменяемыми детекторами (RPST и авторский алгоритм на потенциале Юкавы).</w:t>
       </w:r>
     </w:p>
     <w:p>
@@ -4922,7 +4922,7 @@
       <w:r>
         <w:drawing>
           <wp:inline xmlns:a="http://schemas.openxmlformats.org/drawingml/2006/main" xmlns:pic="http://schemas.openxmlformats.org/drawingml/2006/picture">
-            <wp:extent cx="5760000" cy="4642531"/>
+            <wp:extent cx="5760000" cy="3853735"/>
             <wp:docPr id="1" name="Picture 1"/>
             <wp:cNvGraphicFramePr>
               <a:graphicFrameLocks noChangeAspect="1"/>
@@ -4931,7 +4931,7 @@
               <a:graphicData uri="http://schemas.openxmlformats.org/drawingml/2006/picture">
                 <pic:pic>
                   <pic:nvPicPr>
-                    <pic:cNvPr id="0" name="Generation.png"/>
+                    <pic:cNvPr id="0" name="gantt_vkr.png"/>
                     <pic:cNvPicPr/>
                   </pic:nvPicPr>
                   <pic:blipFill>
@@ -4943,7 +4943,7 @@
                   <pic:spPr>
                     <a:xfrm>
                       <a:off x="0" y="0"/>
-                      <a:ext cx="5760000" cy="4642531"/>
+                      <a:ext cx="5760000" cy="3853735"/>
                     </a:xfrm>
                     <a:prstGeom prst="rect"/>
                   </pic:spPr>
@@ -4961,7 +4961,15 @@
         <w:jc w:val="center"/>
       </w:pPr>
       <w:r>
-        <w:t>Рисунок А.1 — Вкладка «Генерация»: тема, размер, схема рифмовки и сгенерированный стих</w:t>
+        <w:t>Рисунок А.1 — Диаграмма Ганта плана работы над ВКР (красным выделены задания учебной практики с дедлайнами; ромб — защита ВКР)</w:t>
+      </w:r>
+    </w:p>
+    <w:p>
+      <w:r>
+        <w:rPr>
+          <w:b w:val="0"/>
+        </w:rPr>
+        <w:t>Исходный текст диаграммы в формате mermaid и помесячный план — в репозитории проекта (docs/practice/02_plan_gantt.md).</w:t>
       </w:r>
     </w:p>
     <w:p>
@@ -4982,7 +4990,7 @@
               <a:graphicData uri="http://schemas.openxmlformats.org/drawingml/2006/picture">
                 <pic:pic>
                   <pic:nvPicPr>
-                    <pic:cNvPr id="0" name="ImprovingGeneration.png"/>
+                    <pic:cNvPr id="0" name="Generation.png"/>
                     <pic:cNvPicPr/>
                   </pic:nvPicPr>
                   <pic:blipFill>
@@ -5012,7 +5020,7 @@
         <w:jc w:val="center"/>
       </w:pPr>
       <w:r>
-        <w:t>Рисунок А.2 — Улучшение стиха: самокоррекция по разбору рифмы (best-of-N с одним проходом правки)</w:t>
+        <w:t>Рисунок А.2 — Вкладка «Генерация»: тема, размер, схема рифмовки и сгенерированный стих</w:t>
       </w:r>
     </w:p>
     <w:p>
@@ -5033,7 +5041,7 @@
               <a:graphicData uri="http://schemas.openxmlformats.org/drawingml/2006/picture">
                 <pic:pic>
                   <pic:nvPicPr>
-                    <pic:cNvPr id="0" name="RhymeAnalisisRPST.png"/>
+                    <pic:cNvPr id="0" name="ImprovingGeneration.png"/>
                     <pic:cNvPicPr/>
                   </pic:nvPicPr>
                   <pic:blipFill>
@@ -5063,7 +5071,7 @@
         <w:jc w:val="center"/>
       </w:pPr>
       <w:r>
-        <w:t>Рисунок А.3 — Оценка рифмы детектором RPST с подсветкой рифмующихся окончаний</w:t>
+        <w:t>Рисунок А.3 — Улучшение стиха: самокоррекция по разбору рифмы (best-of-N с одним проходом правки)</w:t>
       </w:r>
     </w:p>
     <w:p>
@@ -5084,7 +5092,7 @@
               <a:graphicData uri="http://schemas.openxmlformats.org/drawingml/2006/picture">
                 <pic:pic>
                   <pic:nvPicPr>
-                    <pic:cNvPr id="0" name="RhymeAnalisisYukawa.png"/>
+                    <pic:cNvPr id="0" name="RhymeAnalisisRPST.png"/>
                     <pic:cNvPicPr/>
                   </pic:nvPicPr>
                   <pic:blipFill>
@@ -5114,7 +5122,7 @@
         <w:jc w:val="center"/>
       </w:pPr>
       <w:r>
-        <w:t>Рисунок А.4 — Оценка рифмы авторским детектором на потенциале Юкавы (группы рифм — компоненты связности графа)</w:t>
+        <w:t>Рисунок А.4 — Оценка рифмы детектором RPST с подсветкой рифмующихся окончаний</w:t>
       </w:r>
     </w:p>
     <w:p>
@@ -5135,7 +5143,7 @@
               <a:graphicData uri="http://schemas.openxmlformats.org/drawingml/2006/picture">
                 <pic:pic>
                   <pic:nvPicPr>
-                    <pic:cNvPr id="0" name="RhymeAnalisisDarkTheme.png"/>
+                    <pic:cNvPr id="0" name="RhymeAnalisisYukawa.png"/>
                     <pic:cNvPicPr/>
                   </pic:nvPicPr>
                   <pic:blipFill>
@@ -5165,7 +5173,7 @@
         <w:jc w:val="center"/>
       </w:pPr>
       <w:r>
-        <w:t>Рисунок А.5 — Тёмная тема интерфейса</w:t>
+        <w:t>Рисунок А.5 — Оценка рифмы авторским детектором на потенциале Юкавы (группы рифм — компоненты связности графа)</w:t>
       </w:r>
     </w:p>
     <w:p>
@@ -5177,8 +5185,59 @@
       <w:r>
         <w:drawing>
           <wp:inline xmlns:a="http://schemas.openxmlformats.org/drawingml/2006/main" xmlns:pic="http://schemas.openxmlformats.org/drawingml/2006/picture">
+            <wp:extent cx="5760000" cy="4642531"/>
+            <wp:docPr id="6" name="Picture 6"/>
+            <wp:cNvGraphicFramePr>
+              <a:graphicFrameLocks noChangeAspect="1"/>
+            </wp:cNvGraphicFramePr>
+            <a:graphic>
+              <a:graphicData uri="http://schemas.openxmlformats.org/drawingml/2006/picture">
+                <pic:pic>
+                  <pic:nvPicPr>
+                    <pic:cNvPr id="0" name="RhymeAnalisisDarkTheme.png"/>
+                    <pic:cNvPicPr/>
+                  </pic:nvPicPr>
+                  <pic:blipFill>
+                    <a:blip r:embed="rId15"/>
+                    <a:stretch>
+                      <a:fillRect/>
+                    </a:stretch>
+                  </pic:blipFill>
+                  <pic:spPr>
+                    <a:xfrm>
+                      <a:off x="0" y="0"/>
+                      <a:ext cx="5760000" cy="4642531"/>
+                    </a:xfrm>
+                    <a:prstGeom prst="rect"/>
+                  </pic:spPr>
+                </pic:pic>
+              </a:graphicData>
+            </a:graphic>
+          </wp:inline>
+        </w:drawing>
+      </w:r>
+    </w:p>
+    <w:p>
+      <w:pPr>
+        <w:spacing w:after="240" w:line="240" w:lineRule="auto"/>
+        <w:ind w:firstLine="0"/>
+        <w:jc w:val="center"/>
+      </w:pPr>
+      <w:r>
+        <w:t>Рисунок А.6 — Тёмная тема интерфейса</w:t>
+      </w:r>
+    </w:p>
+    <w:p>
+      <w:pPr>
+        <w:spacing w:before="120"/>
+        <w:ind w:firstLine="0"/>
+        <w:jc w:val="center"/>
+      </w:pPr>
+      <w:r>
+        <w:drawing>
+          <wp:inline xmlns:a="http://schemas.openxmlformats.org/drawingml/2006/main" xmlns:pic="http://schemas.openxmlformats.org/drawingml/2006/picture">
             <wp:extent cx="3600000" cy="3184615"/>
-            <wp:docPr id="6" name="Picture 6"/>
+            <wp:docPr id="7" name="Picture 7"/>
             <wp:cNvGraphicFramePr>
               <a:graphicFrameLocks noChangeAspect="1"/>
             </wp:cNvGraphicFramePr>
@@ -5190,7 +5249,7 @@
                     <pic:cNvPicPr/>
                   </pic:nvPicPr>
                   <pic:blipFill>
-                    <a:blip r:embed="rId15"/>
+                    <a:blip r:embed="rId16"/>
                     <a:stretch>
                       <a:fillRect/>
                     </a:stretch>
@@ -5216,15 +5275,7 @@
         <w:jc w:val="center"/>
       </w:pPr>
       <w:r>
-        <w:t>Рисунок А.6 — Настройки провайдера и API-ключей (Claude, Gemini, DeepSeek)</w:t>
-      </w:r>
-    </w:p>
-    <w:p>
-      <w:r>
-        <w:rPr>
-          <w:b w:val="0"/>
-        </w:rPr>
-        <w:t>Диаграмма Ганта плана работы над ВКР подготовлена в формате mermaid (исходный текст — в репозитории проекта, docs/practice/02_plan_gantt.md) и может быть экспортирована в PNG/SVG для вставки в пояснительную записку ВКР.</w:t>
+        <w:t>Рисунок А.7 — Настройки провайдера и API-ключей (Claude, Gemini, DeepSeek)</w:t>
       </w:r>
     </w:p>
     <w:p>
@@ -7445,7 +7496,7 @@
       <w:outlineLvl w:val="0"/>
     </w:pPr>
     <w:rPr>
-      <w:rFonts w:asciiTheme="majorHAnsi" w:eastAsiaTheme="majorEastAsia" w:hAnsiTheme="majorHAnsi" w:cstheme="majorBidi" w:ascii="Times New Roman" w:hAnsi="Times New Roman" w:eastAsia="Times New Roman"/>
+      <w:rFonts w:ascii="Times New Roman" w:hAnsi="Times New Roman" w:eastAsia="Times New Roman" w:cs="Times New Roman"/>
       <w:b/>
       <w:bCs/>
       <w:color w:val="000000"/>
@@ -7471,7 +7522,7 @@
       <w:outlineLvl w:val="1"/>
     </w:pPr>
     <w:rPr>
-      <w:rFonts w:asciiTheme="majorHAnsi" w:eastAsiaTheme="majorEastAsia" w:hAnsiTheme="majorHAnsi" w:cstheme="majorBidi" w:ascii="Times New Roman" w:hAnsi="Times New Roman" w:eastAsia="Times New Roman"/>
+      <w:rFonts w:ascii="Times New Roman" w:hAnsi="Times New Roman" w:eastAsia="Times New Roman" w:cs="Times New Roman"/>
       <w:b/>
       <w:bCs/>
       <w:color w:val="000000"/>

</xml_diff>

<commit_message>
add(docs): links to applications in report text
</commit_message>
<xml_diff>
--- a/docs/practice/Отчёт_учебная_практика.docx
+++ b/docs/practice/Отчёт_учебная_практика.docx
@@ -298,7 +298,7 @@
           <w:b/>
           <w:sz w:val="32"/>
         </w:rPr>
-        <w:t>АННОТАЦИЯ</w:t>
+        <w:t>Аннотация</w:t>
       </w:r>
     </w:p>
     <w:p>
@@ -330,7 +330,7 @@
         <w:rPr>
           <w:b w:val="0"/>
         </w:rPr>
-        <w:t>Объём отчёта — 34 с., 5 таблиц, рисунков и листингов — в приложениях, 48 использованных источников, 2 приложения.</w:t>
+        <w:t>Объём отчёта — 32 с., 5 таблиц, рисунков и листингов — в приложениях, 48 использованных источников, 2 приложения.</w:t>
       </w:r>
     </w:p>
     <w:p>
@@ -353,7 +353,7 @@
           <w:b/>
           <w:sz w:val="32"/>
         </w:rPr>
-        <w:t>ABSTRACT</w:t>
+        <w:t>Abstract</w:t>
       </w:r>
     </w:p>
     <w:p>
@@ -390,7 +390,7 @@
         <w:rPr>
           <w:b/>
         </w:rPr>
-        <w:t>СОДЕРЖАНИЕ</w:t>
+        <w:t>Содержание</w:t>
       </w:r>
     </w:p>
     <w:p>
@@ -405,7 +405,7 @@
         <w:rPr>
           <w:b/>
         </w:rPr>
-        <w:t>ВВЕДЕНИЕ</w:t>
+        <w:t>Введение</w:t>
       </w:r>
       <w:r>
         <w:tab/>
@@ -495,7 +495,7 @@
       </w:r>
       <w:r>
         <w:tab/>
-        <w:t>10</w:t>
+        <w:t>9</w:t>
       </w:r>
     </w:p>
     <w:p>
@@ -511,7 +511,7 @@
       </w:r>
       <w:r>
         <w:tab/>
-        <w:t>10</w:t>
+        <w:t>9</w:t>
       </w:r>
     </w:p>
     <w:p>
@@ -527,7 +527,7 @@
       </w:r>
       <w:r>
         <w:tab/>
-        <w:t>10</w:t>
+        <w:t>9</w:t>
       </w:r>
     </w:p>
     <w:p>
@@ -543,7 +543,7 @@
       </w:r>
       <w:r>
         <w:tab/>
-        <w:t>11</w:t>
+        <w:t>10</w:t>
       </w:r>
     </w:p>
     <w:p>
@@ -562,7 +562,7 @@
       </w:r>
       <w:r>
         <w:tab/>
-        <w:t>12</w:t>
+        <w:t>11</w:t>
       </w:r>
     </w:p>
     <w:p>
@@ -578,7 +578,7 @@
       </w:r>
       <w:r>
         <w:tab/>
-        <w:t>12</w:t>
+        <w:t>11</w:t>
       </w:r>
     </w:p>
     <w:p>
@@ -594,7 +594,7 @@
       </w:r>
       <w:r>
         <w:tab/>
-        <w:t>12</w:t>
+        <w:t>11</w:t>
       </w:r>
     </w:p>
     <w:p>
@@ -610,7 +610,7 @@
       </w:r>
       <w:r>
         <w:tab/>
-        <w:t>13</w:t>
+        <w:t>12</w:t>
       </w:r>
     </w:p>
     <w:p>
@@ -626,7 +626,7 @@
       </w:r>
       <w:r>
         <w:tab/>
-        <w:t>13</w:t>
+        <w:t>12</w:t>
       </w:r>
     </w:p>
     <w:p>
@@ -642,7 +642,7 @@
       </w:r>
       <w:r>
         <w:tab/>
-        <w:t>13</w:t>
+        <w:t>12</w:t>
       </w:r>
     </w:p>
     <w:p>
@@ -661,7 +661,7 @@
       </w:r>
       <w:r>
         <w:tab/>
-        <w:t>15</w:t>
+        <w:t>14</w:t>
       </w:r>
     </w:p>
     <w:p>
@@ -677,7 +677,7 @@
       </w:r>
       <w:r>
         <w:tab/>
-        <w:t>15</w:t>
+        <w:t>14</w:t>
       </w:r>
     </w:p>
     <w:p>
@@ -693,7 +693,7 @@
       </w:r>
       <w:r>
         <w:tab/>
-        <w:t>15</w:t>
+        <w:t>14</w:t>
       </w:r>
     </w:p>
     <w:p>
@@ -709,7 +709,7 @@
       </w:r>
       <w:r>
         <w:tab/>
-        <w:t>16</w:t>
+        <w:t>15</w:t>
       </w:r>
     </w:p>
     <w:p>
@@ -725,7 +725,7 @@
       </w:r>
       <w:r>
         <w:tab/>
-        <w:t>16</w:t>
+        <w:t>15</w:t>
       </w:r>
     </w:p>
     <w:p>
@@ -741,7 +741,7 @@
       </w:r>
       <w:r>
         <w:tab/>
-        <w:t>16</w:t>
+        <w:t>15</w:t>
       </w:r>
     </w:p>
     <w:p>
@@ -757,7 +757,7 @@
       </w:r>
       <w:r>
         <w:tab/>
-        <w:t>17</w:t>
+        <w:t>16</w:t>
       </w:r>
     </w:p>
     <w:p>
@@ -772,11 +772,11 @@
         <w:rPr>
           <w:b/>
         </w:rPr>
-        <w:t>ЗАКЛЮЧЕНИЕ</w:t>
+        <w:t>Заключение</w:t>
       </w:r>
       <w:r>
         <w:tab/>
-        <w:t>19</w:t>
+        <w:t>18</w:t>
       </w:r>
     </w:p>
     <w:p>
@@ -791,11 +791,11 @@
         <w:rPr>
           <w:b/>
         </w:rPr>
-        <w:t>СПИСОК ИСПОЛЬЗОВАННЫХ ИСТОЧНИКОВ</w:t>
+        <w:t>Приложение А. Диаграмма Ганта и интерфейс приложения «Rhymer»</w:t>
       </w:r>
       <w:r>
         <w:tab/>
-        <w:t>20</w:t>
+        <w:t>19</w:t>
       </w:r>
     </w:p>
     <w:p>
@@ -810,11 +810,11 @@
         <w:rPr>
           <w:b/>
         </w:rPr>
-        <w:t>ПРИЛОЖЕНИЕ А. Диаграмма Ганта и интерфейс приложения «Rhymer»</w:t>
+        <w:t>Приложение Б. Ключевые фрагменты исходного кода</w:t>
       </w:r>
       <w:r>
         <w:tab/>
-        <w:t>24</w:t>
+        <w:t>25</w:t>
       </w:r>
     </w:p>
     <w:p>
@@ -829,11 +829,11 @@
         <w:rPr>
           <w:b/>
         </w:rPr>
-        <w:t>ПРИЛОЖЕНИЕ Б. Ключевые фрагменты исходного кода</w:t>
+        <w:t>Список использованных источников</w:t>
       </w:r>
       <w:r>
         <w:tab/>
-        <w:t>30</w:t>
+        <w:t>29</w:t>
       </w:r>
     </w:p>
     <w:p>
@@ -842,7 +842,7 @@
         <w:pageBreakBefore/>
       </w:pPr>
       <w:r>
-        <w:t>ВВЕДЕНИЕ</w:t>
+        <w:t>Введение</w:t>
       </w:r>
     </w:p>
     <w:p>
@@ -935,7 +935,7 @@
         <w:rPr>
           <w:b w:val="0"/>
         </w:rPr>
-        <w:t>Отчёт состоит из введения, четырёх глав, заключения, списка использованных источников и приложения. Глава 1 посвящена обзору источников, глава 2 — плану-графику работы, глава 3 — работе с данными, глава 4 — спецификации системы и прототипу.</w:t>
+        <w:t>Отчёт состоит из введения, четырёх глав, заключения, списка использованных источников и двух приложений. Глава 1 посвящена обзору источников, глава 2 — плану-графику работы, глава 3 — работе с данными, глава 4 — спецификации системы и прототипу. В приложении А приведены диаграмма Ганта и экранные снимки прототипа, в приложении Б — ключевые фрагменты исходного кода.</w:t>
       </w:r>
     </w:p>
     <w:p>
@@ -1041,7 +1041,7 @@
         <w:rPr>
           <w:b w:val="0"/>
         </w:rPr>
-        <w:t>Период обучения в магистратуре — сентябрь 2025 — июнь 2027 (четыре семестра). Учебная практика первого года соответствует разработке прототипа конвейера и подготовке исследовательских материалов. Ниже приведён помесячный план по курсам и контрольные точки; диаграмма Ганта вынесена в приложение А.</w:t>
+        <w:t>Период обучения в магистратуре — сентябрь 2025 — июнь 2027 (четыре семестра). Учебная практика первого года соответствует разработке прототипа конвейера и подготовке исследовательских материалов. Ниже приведён помесячный план по курсам (таблицы 1 и 2) и контрольные точки; диаграмма Ганта вынесена в приложение А.</w:t>
       </w:r>
     </w:p>
     <w:p>
@@ -1068,9 +1068,9 @@
         <w:tblLook w:firstColumn="1" w:firstRow="1" w:lastColumn="0" w:lastRow="0" w:noHBand="0" w:noVBand="1" w:val="04A0"/>
       </w:tblPr>
       <w:tblGrid>
-        <w:gridCol w:w="3118"/>
-        <w:gridCol w:w="3118"/>
-        <w:gridCol w:w="3118"/>
+        <w:gridCol w:w="3213"/>
+        <w:gridCol w:w="3213"/>
+        <w:gridCol w:w="3213"/>
       </w:tblGrid>
       <w:tr>
         <w:tc>
@@ -1798,9 +1798,9 @@
         <w:tblLook w:firstColumn="1" w:firstRow="1" w:lastColumn="0" w:lastRow="0" w:noHBand="0" w:noVBand="1" w:val="04A0"/>
       </w:tblPr>
       <w:tblGrid>
-        <w:gridCol w:w="3118"/>
-        <w:gridCol w:w="3118"/>
-        <w:gridCol w:w="3118"/>
+        <w:gridCol w:w="3213"/>
+        <w:gridCol w:w="3213"/>
+        <w:gridCol w:w="3213"/>
       </w:tblGrid>
       <w:tr>
         <w:tc>
@@ -2497,6 +2497,14 @@
       </w:r>
     </w:p>
     <w:p>
+      <w:r>
+        <w:rPr>
+          <w:b w:val="0"/>
+        </w:rPr>
+        <w:t>Рассмотренные наборы данных - кандидаты и их основные характеристики (язык, объём, наличие разметки и лицензия) сведены в таблице 3.</w:t>
+      </w:r>
+    </w:p>
+    <w:p>
       <w:pPr>
         <w:ind w:firstLine="0"/>
       </w:pPr>
@@ -2512,11 +2520,11 @@
         <w:tblLook w:firstColumn="1" w:firstRow="1" w:lastColumn="0" w:lastRow="0" w:noHBand="0" w:noVBand="1" w:val="04A0"/>
       </w:tblPr>
       <w:tblGrid>
-        <w:gridCol w:w="1871"/>
-        <w:gridCol w:w="1871"/>
-        <w:gridCol w:w="1871"/>
-        <w:gridCol w:w="1871"/>
-        <w:gridCol w:w="1871"/>
+        <w:gridCol w:w="1928"/>
+        <w:gridCol w:w="1928"/>
+        <w:gridCol w:w="1928"/>
+        <w:gridCol w:w="1928"/>
+        <w:gridCol w:w="1928"/>
       </w:tblGrid>
       <w:tr>
         <w:tc>
@@ -3516,6 +3524,14 @@
       </w:r>
     </w:p>
     <w:p>
+      <w:r>
+        <w:rPr>
+          <w:b w:val="0"/>
+        </w:rPr>
+        <w:t>Используемые в работе метрики качества, их определения и назначение приведены в таблице 4.</w:t>
+      </w:r>
+    </w:p>
+    <w:p>
       <w:pPr>
         <w:ind w:firstLine="0"/>
       </w:pPr>
@@ -3531,9 +3547,9 @@
         <w:tblLook w:firstColumn="1" w:firstRow="1" w:lastColumn="0" w:lastRow="0" w:noHBand="0" w:noVBand="1" w:val="04A0"/>
       </w:tblPr>
       <w:tblGrid>
-        <w:gridCol w:w="3118"/>
-        <w:gridCol w:w="3118"/>
-        <w:gridCol w:w="3118"/>
+        <w:gridCol w:w="3213"/>
+        <w:gridCol w:w="3213"/>
+        <w:gridCol w:w="3213"/>
       </w:tblGrid>
       <w:tr>
         <w:tc>
@@ -3966,6 +3982,14 @@
       </w:r>
     </w:p>
     <w:p>
+      <w:r>
+        <w:rPr>
+          <w:b w:val="0"/>
+        </w:rPr>
+        <w:t>Требования к программному окружению прототипа приведены в таблице 5.</w:t>
+      </w:r>
+    </w:p>
+    <w:p>
       <w:pPr>
         <w:ind w:firstLine="0"/>
       </w:pPr>
@@ -3981,8 +4005,8 @@
         <w:tblLook w:firstColumn="1" w:firstRow="1" w:lastColumn="0" w:lastRow="0" w:noHBand="0" w:noVBand="1" w:val="04A0"/>
       </w:tblPr>
       <w:tblGrid>
-        <w:gridCol w:w="4677"/>
-        <w:gridCol w:w="4677"/>
+        <w:gridCol w:w="4819"/>
+        <w:gridCol w:w="4819"/>
       </w:tblGrid>
       <w:tr>
         <w:tc>
@@ -4347,7 +4371,7 @@
         <w:rPr>
           <w:b w:val="0"/>
         </w:rPr>
-        <w:t>Первый детектор — обёртка над RPST: разметка ударений, определение размера и схемы рифмовки, оценка поэтичности, сравнение рифмующихся хвостов и расчёт точности по схеме. Второй — авторский алгоритм на потенциале Юкавы: стихотворение рассматривается как поток волн, сила созвучия слогов экранируется расстоянием, эффект резонанса усиливает созвучные цепочки, а группы рифм выделяются как компоненты связности графа. Ядро схожести слогов — фонетическая векторизация: каждый слог кодируется вектором артикуляционных признаков (отдельно блок гласной и блок согласных), а близость измеряется косинусом, так что основной вклад дают гласные, а согласные добавляют созвучие (аллитерацию). Интерфейс приложения, настройки провайдера и сохранение сессий показаны в приложении А.</w:t>
+        <w:t>Первый детектор — обёртка над RPST: разметка ударений, определение размера и схемы рифмовки, оценка поэтичности, сравнение рифмующихся хвостов и расчёт точности по схеме. Второй — авторский алгоритм на потенциале Юкавы: стихотворение рассматривается как поток волн, сила созвучия слогов экранируется расстоянием, эффект резонанса усиливает созвучные цепочки, а группы рифм выделяются как компоненты связности графа. Ядро схожести слогов — фонетическая векторизация: каждый слог кодируется вектором артикуляционных признаков (отдельно блок гласной и блок согласных), а близость измеряется косинусом, так что основной вклад дают гласные, а согласные добавляют созвучие (аллитерацию). Интерфейс приложения, настройки провайдера и сохранение сессий показаны в приложении А. Ключевые фрагменты исходного кода детектора — экранирующее ядро Юкавы, сборка матрицы связей слогов, энергия слога и фонетическая векторизация — приведены в приложении Б (листинги Б.1-Б.4).</w:t>
       </w:r>
     </w:p>
     <w:p>
@@ -4407,7 +4431,7 @@
         <w:rPr>
           <w:b w:val="0"/>
         </w:rPr>
-        <w:t>Таким образом языковая модель выступает инструментом, а решения о том, что исправлять, принимаются на основе численных метрик качества рифмы. Это отличает подход от простого промптинга и делает результат воспроизводимым и измеримым.</w:t>
+        <w:t>Таким образом языковая модель выступает инструментом, а решения о том, что исправлять, принимаются на основе численных метрик качества рифмы. Это отличает подход от простого промптинга и делает результат воспроизводимым и измеримым. Системный промпт, промпт генерации (best-of-N) и промпт самокоррекции по обратной связи детектора приведены в приложении Б (листинги Б.5, Б.6).</w:t>
       </w:r>
     </w:p>
     <w:p>
@@ -4416,7 +4440,7 @@
         <w:pageBreakBefore/>
       </w:pPr>
       <w:r>
-        <w:t>ЗАКЛЮЧЕНИЕ</w:t>
+        <w:t>Заключение</w:t>
       </w:r>
     </w:p>
     <w:p>
@@ -4447,454 +4471,20 @@
       <w:pPr>
         <w:pStyle w:val="Heading1"/>
         <w:pageBreakBefore/>
-      </w:pPr>
-      <w:r>
-        <w:t>СПИСОК ИСПОЛЬЗОВАННЫХ ИСТОЧНИКОВ</w:t>
-      </w:r>
-    </w:p>
-    <w:p>
-      <w:pPr>
-        <w:spacing w:line="360" w:lineRule="auto"/>
-        <w:ind w:left="425" w:hanging="425"/>
-      </w:pPr>
-      <w:r>
-        <w:t>1. Ghazvininejad M., Shi X., Choi Y., Knight K. Generating Topical Poetry // EMNLP 2016. URL: https://aclanthology.org/D16-1126/.</w:t>
-      </w:r>
-    </w:p>
-    <w:p>
-      <w:pPr>
-        <w:spacing w:line="360" w:lineRule="auto"/>
-        <w:ind w:left="425" w:hanging="425"/>
-      </w:pPr>
-      <w:r>
-        <w:t>2. Ghazvininejad M., Shi X., Priyadarshi J., Knight K. Hafez: an Interactive Poetry Generation System // ACL 2017 (Demo). URL: https://aclanthology.org/P17-4008/.</w:t>
-      </w:r>
-    </w:p>
-    <w:p>
-      <w:pPr>
-        <w:spacing w:line="360" w:lineRule="auto"/>
-        <w:ind w:left="425" w:hanging="425"/>
-      </w:pPr>
-      <w:r>
-        <w:t>3. Lau J. H., Cohn T., Baldwin T., Brooke J., Hammond A. Deep-speare: A Joint Neural Model of Poetic Language, Meter and Rhyme // ACL 2018. arXiv:1807.03491. URL: https://arxiv.org/pdf/1807.03491.</w:t>
-      </w:r>
-    </w:p>
-    <w:p>
-      <w:pPr>
-        <w:spacing w:line="360" w:lineRule="auto"/>
-        <w:ind w:left="425" w:hanging="425"/>
-      </w:pPr>
-      <w:r>
-        <w:t>4. Belouadi J., Eger S. ByGPT5: End-to-End Style-conditioned Poetry Generation with Token-free Language Models // ACL 2023 Findings. arXiv:2212.10474. URL: https://arxiv.org/abs/2212.10474.</w:t>
-      </w:r>
-    </w:p>
-    <w:p>
-      <w:pPr>
-        <w:spacing w:line="360" w:lineRule="auto"/>
-        <w:ind w:left="425" w:hanging="425"/>
-      </w:pPr>
-      <w:r>
-        <w:t>5. Lee S. W. et al. GPoeT-2: A GPT-2 Based Poem Generator. arXiv:2205.08847. URL: https://arxiv.org/abs/2205.08847.</w:t>
-      </w:r>
-    </w:p>
-    <w:p>
-      <w:pPr>
-        <w:spacing w:line="360" w:lineRule="auto"/>
-        <w:ind w:left="425" w:hanging="425"/>
-      </w:pPr>
-      <w:r>
-        <w:t>6. Wang J., Zhang X., Zhou Y., Suh C., Rudin C. There Once Was a Really Bad Poet, It Was Automated but You Didn't Know It // TACL 2021. arXiv:2103.03775. URL: https://arxiv.org/abs/2103.03775.</w:t>
-      </w:r>
-    </w:p>
-    <w:p>
-      <w:pPr>
-        <w:spacing w:line="360" w:lineRule="auto"/>
-        <w:ind w:left="425" w:hanging="425"/>
-      </w:pPr>
-      <w:r>
-        <w:t>7. Ormazabal A., Artetxe M., Soroa A., Labaka G., Agirre E. PoeLM: A Meter- and Rhyme-Controllable Language Model for Unsupervised Poetry Generation // EMNLP 2022 Findings. arXiv:2205.12206. URL: https://arxiv.org/abs/2205.12206.</w:t>
-      </w:r>
-    </w:p>
-    <w:p>
-      <w:pPr>
-        <w:spacing w:line="360" w:lineRule="auto"/>
-        <w:ind w:left="425" w:hanging="425"/>
-      </w:pPr>
-      <w:r>
-        <w:t>8. Belouadi J., Eger S. Let the Poem Hit the Rhythm: Beat-Aligned Poetry Generation. arXiv:2406.10174. URL: https://arxiv.org/html/2406.10174.</w:t>
-      </w:r>
-    </w:p>
-    <w:p>
-      <w:pPr>
-        <w:spacing w:line="360" w:lineRule="auto"/>
-        <w:ind w:left="425" w:hanging="425"/>
-      </w:pPr>
-      <w:r>
-        <w:t>9. Zmitrovich D. et al. A Family of Pretrained Transformer Language Models for Russian. arXiv:2309.10931. URL: https://github.com/ai-forever/ru-gpts.</w:t>
-      </w:r>
-    </w:p>
-    <w:p>
-      <w:pPr>
-        <w:spacing w:line="360" w:lineRule="auto"/>
-        <w:ind w:left="425" w:hanging="425"/>
-      </w:pPr>
-      <w:r>
-        <w:t>10. AI Forever (Sber). ruGPT-3.5-13B. Hugging Face. URL: https://huggingface.co/ai-forever/ruGPT-3.5-13B.</w:t>
-      </w:r>
-    </w:p>
-    <w:p>
-      <w:pPr>
-        <w:spacing w:line="360" w:lineRule="auto"/>
-        <w:ind w:left="425" w:hanging="425"/>
-      </w:pPr>
-      <w:r>
-        <w:t>11. Shliazhko O. et al. mGPT: Few-Shot Learners Go Multilingual. arXiv:2204.07580. URL: https://arxiv.org/abs/2204.07580.</w:t>
-      </w:r>
-    </w:p>
-    <w:p>
-      <w:pPr>
-        <w:spacing w:line="360" w:lineRule="auto"/>
-        <w:ind w:left="425" w:hanging="425"/>
-      </w:pPr>
-      <w:r>
-        <w:t>12. Yandex. YaLM-100B. GitHub, 2022. URL: https://github.com/yandex/YaLM-100B.</w:t>
-      </w:r>
-    </w:p>
-    <w:p>
-      <w:pPr>
-        <w:spacing w:line="360" w:lineRule="auto"/>
-        <w:ind w:left="425" w:hanging="425"/>
-      </w:pPr>
-      <w:r>
-        <w:t>13. Nikolich A. et al. Vikhr: Open-Source Instruction-Tuned LLMs for Russian. arXiv:2405.13929. URL: https://arxiv.org/abs/2405.13929.</w:t>
-      </w:r>
-    </w:p>
-    <w:p>
-      <w:pPr>
-        <w:spacing w:line="360" w:lineRule="auto"/>
-        <w:ind w:left="425" w:hanging="425"/>
-      </w:pPr>
-      <w:r>
-        <w:t>14. Gusev I. saiga_llama3_8b. Hugging Face. URL: https://huggingface.co/IlyaGusev/saiga_llama3_8b.</w:t>
-      </w:r>
-    </w:p>
-    <w:p>
-      <w:pPr>
-        <w:spacing w:line="360" w:lineRule="auto"/>
-        <w:ind w:left="425" w:hanging="425"/>
-      </w:pPr>
-      <w:r>
-        <w:t>15. Mukhamedshina D. et al. GigaChat Family: Efficient Russian Language Modeling Through MoE. arXiv:2506.09440. URL: https://arxiv.org/abs/2506.09440.</w:t>
-      </w:r>
-    </w:p>
-    <w:p>
-      <w:pPr>
-        <w:spacing w:line="360" w:lineRule="auto"/>
-        <w:ind w:left="425" w:hanging="425"/>
-      </w:pPr>
-      <w:r>
-        <w:t>16. Fenogenova A. et al. MERA: A Comprehensive LLM Evaluation in Russian. arXiv:2401.04531. URL: https://arxiv.org/abs/2401.04531.</w:t>
-      </w:r>
-    </w:p>
-    <w:p>
-      <w:pPr>
-        <w:spacing w:line="360" w:lineRule="auto"/>
-        <w:ind w:left="425" w:hanging="425"/>
-      </w:pPr>
-      <w:r>
-        <w:t>17. Koziev I. Automated Evaluation of Meter and Rhyme in Russian Generative and Human-Authored Poetry. arXiv:2502.20931, 2025. URL: https://arxiv.org/abs/2502.20931.</w:t>
-      </w:r>
-    </w:p>
-    <w:p>
-      <w:pPr>
-        <w:spacing w:line="360" w:lineRule="auto"/>
-        <w:ind w:left="425" w:hanging="425"/>
-      </w:pPr>
-      <w:r>
-        <w:t>18. Koziev I. RussianPoetryScansionTool. GitHub. URL: https://github.com/Koziev/RussianPoetryScansionTool.</w:t>
-      </w:r>
-    </w:p>
-    <w:p>
-      <w:pPr>
-        <w:spacing w:line="360" w:lineRule="auto"/>
-        <w:ind w:left="425" w:hanging="425"/>
-      </w:pPr>
-      <w:r>
-        <w:t>19. Koziev I. ArsPoetica. Hugging Face. URL: https://huggingface.co/datasets/inkoziev/ArsPoetica.</w:t>
-      </w:r>
-    </w:p>
-    <w:p>
-      <w:pPr>
-        <w:spacing w:line="360" w:lineRule="auto"/>
-        <w:ind w:left="425" w:hanging="425"/>
-      </w:pPr>
-      <w:r>
-        <w:t>20. Koziev I. Rifma. GitHub. URL: https://github.com/Koziev/Rifma.</w:t>
-      </w:r>
-    </w:p>
-    <w:p>
-      <w:pPr>
-        <w:spacing w:line="360" w:lineRule="auto"/>
-        <w:ind w:left="425" w:hanging="425"/>
-      </w:pPr>
-      <w:r>
-        <w:t>21. Plecháč P. A Collocation-Driven Method of Discovering Rhymes // Taming the Corpus. Springer, 2018. URL: https://github.com/versotym/rhymetagger.</w:t>
-      </w:r>
-    </w:p>
-    <w:p>
-      <w:pPr>
-        <w:spacing w:line="360" w:lineRule="auto"/>
-        <w:ind w:left="425" w:hanging="425"/>
-      </w:pPr>
-      <w:r>
-        <w:t>22. Plecháč P. et al. Training Data Size Sensitivity in Unsupervised Rhyme Recognition. arXiv:2604.08156. URL: https://arxiv.org/abs/2604.08156v1.</w:t>
-      </w:r>
-    </w:p>
-    <w:p>
-      <w:pPr>
-        <w:spacing w:line="360" w:lineRule="auto"/>
-        <w:ind w:left="425" w:hanging="425"/>
-      </w:pPr>
-      <w:r>
-        <w:t>23. Koziev I. rupostagger — POS Tagger for Russian. GitHub. URL: https://github.com/Koziev/rupostagger.</w:t>
-      </w:r>
-    </w:p>
-    <w:p>
-      <w:pPr>
-        <w:spacing w:line="360" w:lineRule="auto"/>
-        <w:ind w:left="425" w:hanging="425"/>
-      </w:pPr>
-      <w:r>
-        <w:t>24. Koziev I. rutokenizer. GitHub. URL: https://github.com/Koziev/rutokenizer.</w:t>
-      </w:r>
-    </w:p>
-    <w:p>
-      <w:pPr>
-        <w:spacing w:line="360" w:lineRule="auto"/>
-        <w:ind w:left="425" w:hanging="425"/>
-      </w:pPr>
-      <w:r>
-        <w:t>25. Dathathri S. et al. Plug and Play Language Models // ICLR 2020. arXiv:1912.02164. URL: https://arxiv.org/abs/1912.02164.</w:t>
-      </w:r>
-    </w:p>
-    <w:p>
-      <w:pPr>
-        <w:spacing w:line="360" w:lineRule="auto"/>
-        <w:ind w:left="425" w:hanging="425"/>
-      </w:pPr>
-      <w:r>
-        <w:t>26. Yang K., Klein D. FUDGE: Controlled Text Generation With Future Discriminators // NAACL 2021. arXiv:2104.05218. URL: https://arxiv.org/abs/2104.05218.</w:t>
-      </w:r>
-    </w:p>
-    <w:p>
-      <w:pPr>
-        <w:spacing w:line="360" w:lineRule="auto"/>
-        <w:ind w:left="425" w:hanging="425"/>
-      </w:pPr>
-      <w:r>
-        <w:t>27. Hokamp C., Liu Q. Lexically Constrained Decoding Using Grid Beam Search. arXiv:1704.07138. URL: https://arxiv.org/abs/1704.07138.</w:t>
-      </w:r>
-    </w:p>
-    <w:p>
-      <w:pPr>
-        <w:spacing w:line="360" w:lineRule="auto"/>
-        <w:ind w:left="425" w:hanging="425"/>
-      </w:pPr>
-      <w:r>
-        <w:t>28. Qin L. et al. COLD Decoding: Energy-based Constrained Text Generation. arXiv:2202.11705. URL: https://arxiv.org/pdf/2202.11705.</w:t>
-      </w:r>
-    </w:p>
-    <w:p>
-      <w:pPr>
-        <w:spacing w:line="360" w:lineRule="auto"/>
-        <w:ind w:left="425" w:hanging="425"/>
-      </w:pPr>
-      <w:r>
-        <w:t>29. Lu X. et al. NeuroLogic Decoding. arXiv:2010.12884. URL: https://arxiv.org/pdf/2010.12884v1.</w:t>
-      </w:r>
-    </w:p>
-    <w:p>
-      <w:pPr>
-        <w:spacing w:line="360" w:lineRule="auto"/>
-        <w:ind w:left="425" w:hanging="425"/>
-      </w:pPr>
-      <w:r>
-        <w:t>30. Manurung R., Ranta A. et al. «Poetic» Statistical Machine Translation: Rhyme and Meter // EMNLP 2010. URL: https://aclanthology.org/D10-1016.pdf.</w:t>
-      </w:r>
-    </w:p>
-    <w:p>
-      <w:pPr>
-        <w:spacing w:line="360" w:lineRule="auto"/>
-        <w:ind w:left="425" w:hanging="425"/>
-      </w:pPr>
-      <w:r>
-        <w:t>31. Huang S. et al. The N+ Implementation Details of RLHF with PPO (TL;DR). arXiv:2403.17031. URL: https://arxiv.org/pdf/2403.17031.</w:t>
-      </w:r>
-    </w:p>
-    <w:p>
-      <w:pPr>
-        <w:spacing w:line="360" w:lineRule="auto"/>
-        <w:ind w:left="425" w:hanging="425"/>
-      </w:pPr>
-      <w:r>
-        <w:t>32. Casas N. et al. Generate and Revise: Reinforcement Learning in Neural Poetry. arXiv:2102.04114. URL: https://arxiv.org/abs/2102.04114.</w:t>
-      </w:r>
-    </w:p>
-    <w:p>
-      <w:pPr>
-        <w:spacing w:line="360" w:lineRule="auto"/>
-        <w:ind w:left="425" w:hanging="425"/>
-      </w:pPr>
-      <w:r>
-        <w:t>33. Casas N. et al. Creative Data Generation: A Review Focusing on Text and Poetry. arXiv:2305.08493. URL: https://arxiv.org/pdf/2305.08493.</w:t>
-      </w:r>
-    </w:p>
-    <w:p>
-      <w:pPr>
-        <w:spacing w:line="360" w:lineRule="auto"/>
-        <w:ind w:left="425" w:hanging="425"/>
-      </w:pPr>
-      <w:r>
-        <w:t>34. Lee H. et al. RLAIF vs. RLHF: Scaling Reinforcement Learning from Human Feedback with AI Feedback. arXiv:2309.00267. URL: https://arxiv.org/html/2309.00267v3.</w:t>
-      </w:r>
-    </w:p>
-    <w:p>
-      <w:pPr>
-        <w:spacing w:line="360" w:lineRule="auto"/>
-        <w:ind w:left="425" w:hanging="425"/>
-      </w:pPr>
-      <w:r>
-        <w:t>35. Regularized Best-of-N Sampling with MBR Objective for Language Model Alignment. arXiv:2404.01054. URL: https://arxiv.org/abs/2404.01054.</w:t>
-      </w:r>
-    </w:p>
-    <w:p>
-      <w:pPr>
-        <w:spacing w:line="360" w:lineRule="auto"/>
-        <w:ind w:left="425" w:hanging="425"/>
-      </w:pPr>
-      <w:r>
-        <w:t>36. Belouadi J., Eger S. Evaluating Diversity in Automatic Poetry Generation. arXiv:2406.15267. URL: https://arxiv.org/html/2406.15267v1.</w:t>
-      </w:r>
-    </w:p>
-    <w:p>
-      <w:pPr>
-        <w:spacing w:line="360" w:lineRule="auto"/>
-        <w:ind w:left="425" w:hanging="425"/>
-      </w:pPr>
-      <w:r>
-        <w:t>37. POEMetric: The Last Stanza of Humanity. arXiv:2604.03695. URL: https://arxiv.org/html/2604.03695v1.</w:t>
-      </w:r>
-    </w:p>
-    <w:p>
-      <w:pPr>
-        <w:spacing w:line="360" w:lineRule="auto"/>
-        <w:ind w:left="425" w:hanging="425"/>
-      </w:pPr>
-      <w:r>
-        <w:t>38. Introducing Aspects of Creativity in Automatic Poetry Generation. arXiv:2002.02511. URL: https://arxiv.org/pdf/2002.02511.</w:t>
-      </w:r>
-    </w:p>
-    <w:p>
-      <w:pPr>
-        <w:spacing w:line="360" w:lineRule="auto"/>
-        <w:ind w:left="425" w:hanging="425"/>
-      </w:pPr>
-      <w:r>
-        <w:t>39. Manurung R. et al. Autonomous Haiku Generation. arXiv:1906.08733. URL: https://arxiv.org/pdf/1906.08733.</w:t>
-      </w:r>
-    </w:p>
-    <w:p>
-      <w:pPr>
-        <w:spacing w:line="360" w:lineRule="auto"/>
-        <w:ind w:left="425" w:hanging="425"/>
-      </w:pPr>
-      <w:r>
-        <w:t>40. Gusev I. stihi_ru. Hugging Face. URL: https://huggingface.co/datasets/IlyaGusev/stihi_ru.</w:t>
-      </w:r>
-    </w:p>
-    <w:p>
-      <w:pPr>
-        <w:spacing w:line="360" w:lineRule="auto"/>
-        <w:ind w:left="425" w:hanging="425"/>
-      </w:pPr>
-      <w:r>
-        <w:t>41. Поэтический подкорпус Национального корпуса русского языка (НКРЯ). URL: https://ruscorpora.ru/page/corpus-poetic-index/.</w:t>
-      </w:r>
-    </w:p>
-    <w:p>
-      <w:pPr>
-        <w:spacing w:line="360" w:lineRule="auto"/>
-        <w:ind w:left="425" w:hanging="425"/>
-      </w:pPr>
-      <w:r>
-        <w:t>42. PULPO: a multilingual poetry corpus. Hugging Face. URL: https://huggingface.co/datasets/linhd-postdata/pulpo.</w:t>
-      </w:r>
-    </w:p>
-    <w:p>
-      <w:pPr>
-        <w:spacing w:line="360" w:lineRule="auto"/>
-        <w:ind w:left="425" w:hanging="425"/>
-      </w:pPr>
-      <w:r>
-        <w:t>43. Parrish A. Gutenberg Poetry Corpus (CC0). GitHub. URL: https://github.com/aparrish/gutenberg-poetry-corpus.</w:t>
-      </w:r>
-    </w:p>
-    <w:p>
-      <w:pPr>
-        <w:spacing w:line="360" w:lineRule="auto"/>
-        <w:ind w:left="425" w:hanging="425"/>
-      </w:pPr>
-      <w:r>
-        <w:t>44. Mikolov T., Chen K., Corrado G., Dean J. Efficient Estimation of Word Representations in Vector Space. arXiv:1301.3781. URL: https://arxiv.org/abs/1301.3781.</w:t>
-      </w:r>
-    </w:p>
-    <w:p>
-      <w:pPr>
-        <w:spacing w:line="360" w:lineRule="auto"/>
-        <w:ind w:left="425" w:hanging="425"/>
-      </w:pPr>
-      <w:r>
-        <w:t>45. Bojanowski P., Grave E., Joulin A., Mikolov T. Enriching Word Vectors with Subword Information // TACL 2017. arXiv:1607.04606. URL: https://arxiv.org/abs/1607.04606.</w:t>
-      </w:r>
-    </w:p>
-    <w:p>
-      <w:pPr>
-        <w:spacing w:line="360" w:lineRule="auto"/>
-        <w:ind w:left="425" w:hanging="425"/>
-      </w:pPr>
-      <w:r>
-        <w:t>46. Devlin J., Chang M.-W., Lee K., Toutanova K. BERT: Pre-training of Deep Bidirectional Transformers for Language Understanding // NAACL 2019. arXiv:1810.04805. URL: https://arxiv.org/abs/1810.04805.</w:t>
-      </w:r>
-    </w:p>
-    <w:p>
-      <w:pPr>
-        <w:spacing w:line="360" w:lineRule="auto"/>
-        <w:ind w:left="425" w:hanging="425"/>
-      </w:pPr>
-      <w:r>
-        <w:t>47. ГОСТ Р 7.0.100–2018. Библиографическая запись. Библиографическое описание. М.: Стандартинформ, 2018.</w:t>
-      </w:r>
-    </w:p>
-    <w:p>
-      <w:pPr>
-        <w:spacing w:line="360" w:lineRule="auto"/>
-        <w:ind w:left="425" w:hanging="425"/>
-      </w:pPr>
-      <w:r>
-        <w:t>48. ГОСТ 7.32–2017. Отчёт о научно-исследовательской работе. Структура и правила оформления. М.: Стандартинформ, 2017.</w:t>
-      </w:r>
-    </w:p>
-    <w:p>
-      <w:pPr>
-        <w:pStyle w:val="Heading1"/>
-        <w:pageBreakBefore/>
-      </w:pPr>
-      <w:r>
-        <w:t>ПРИЛОЖЕНИЕ А. Диаграмма Ганта и интерфейс приложения «Rhymer»</w:t>
-      </w:r>
-    </w:p>
-    <w:p>
-      <w:pPr>
+        <w:spacing w:after="0"/>
+        <w:ind w:firstLine="0"/>
+        <w:jc w:val="center"/>
+      </w:pPr>
+      <w:r>
+        <w:rPr>
+          <w:b/>
+        </w:rPr>
+        <w:t>Приложение А</w:t>
+      </w:r>
+    </w:p>
+    <w:p>
+      <w:pPr>
+        <w:spacing w:after="120"/>
         <w:ind w:firstLine="0"/>
         <w:jc w:val="center"/>
       </w:pPr>
@@ -4903,6 +4493,21 @@
           <w:i/>
         </w:rPr>
         <w:t>(справочное)</w:t>
+      </w:r>
+    </w:p>
+    <w:p>
+      <w:pPr>
+        <w:keepNext/>
+        <w:spacing w:after="240"/>
+        <w:ind w:firstLine="0"/>
+        <w:jc w:val="center"/>
+      </w:pPr>
+      <w:r>
+        <w:rPr>
+          <w:b/>
+          <w:sz w:val="28"/>
+        </w:rPr>
+        <w:t>Диаграмма Ганта и интерфейс приложения «Rhymer»</w:t>
       </w:r>
     </w:p>
     <w:p>
@@ -5282,13 +4887,20 @@
       <w:pPr>
         <w:pStyle w:val="Heading1"/>
         <w:pageBreakBefore/>
-      </w:pPr>
-      <w:r>
-        <w:t>ПРИЛОЖЕНИЕ Б. Ключевые фрагменты исходного кода</w:t>
-      </w:r>
-    </w:p>
-    <w:p>
-      <w:pPr>
+        <w:spacing w:after="0"/>
+        <w:ind w:firstLine="0"/>
+        <w:jc w:val="center"/>
+      </w:pPr>
+      <w:r>
+        <w:rPr>
+          <w:b/>
+        </w:rPr>
+        <w:t>Приложение Б</w:t>
+      </w:r>
+    </w:p>
+    <w:p>
+      <w:pPr>
+        <w:spacing w:after="120"/>
         <w:ind w:firstLine="0"/>
         <w:jc w:val="center"/>
       </w:pPr>
@@ -5297,6 +4909,21 @@
           <w:i/>
         </w:rPr>
         <w:t>(справочное)</w:t>
+      </w:r>
+    </w:p>
+    <w:p>
+      <w:pPr>
+        <w:keepNext/>
+        <w:spacing w:after="240"/>
+        <w:ind w:firstLine="0"/>
+        <w:jc w:val="center"/>
+      </w:pPr>
+      <w:r>
+        <w:rPr>
+          <w:b/>
+          <w:sz w:val="28"/>
+        </w:rPr>
+        <w:t>Ключевые фрагменты исходного кода</w:t>
       </w:r>
     </w:p>
     <w:p>
@@ -7027,10 +6654,451 @@
         <w:spacing w:after="120"/>
       </w:pPr>
     </w:p>
+    <w:p>
+      <w:pPr>
+        <w:pStyle w:val="Heading1"/>
+        <w:pageBreakBefore/>
+      </w:pPr>
+      <w:r>
+        <w:t>Список использованных источников</w:t>
+      </w:r>
+    </w:p>
+    <w:p>
+      <w:pPr>
+        <w:spacing w:line="360" w:lineRule="auto"/>
+        <w:ind w:left="425" w:hanging="425"/>
+      </w:pPr>
+      <w:r>
+        <w:t>1 Ghazvininejad M., Shi X., Choi Y., Knight K. Generating Topical Poetry // EMNLP 2016. URL: https://aclanthology.org/D16-1126/.</w:t>
+      </w:r>
+    </w:p>
+    <w:p>
+      <w:pPr>
+        <w:spacing w:line="360" w:lineRule="auto"/>
+        <w:ind w:left="425" w:hanging="425"/>
+      </w:pPr>
+      <w:r>
+        <w:t>2 Ghazvininejad M., Shi X., Priyadarshi J., Knight K. Hafez: an Interactive Poetry Generation System // ACL 2017 (Demo). URL: https://aclanthology.org/P17-4008/.</w:t>
+      </w:r>
+    </w:p>
+    <w:p>
+      <w:pPr>
+        <w:spacing w:line="360" w:lineRule="auto"/>
+        <w:ind w:left="425" w:hanging="425"/>
+      </w:pPr>
+      <w:r>
+        <w:t>3 Lau J. H., Cohn T., Baldwin T., Brooke J., Hammond A. Deep-speare: A Joint Neural Model of Poetic Language, Meter and Rhyme // ACL 2018. arXiv:1807.03491. URL: https://arxiv.org/pdf/1807.03491.</w:t>
+      </w:r>
+    </w:p>
+    <w:p>
+      <w:pPr>
+        <w:spacing w:line="360" w:lineRule="auto"/>
+        <w:ind w:left="425" w:hanging="425"/>
+      </w:pPr>
+      <w:r>
+        <w:t>4 Belouadi J., Eger S. ByGPT5: End-to-End Style-conditioned Poetry Generation with Token-free Language Models // ACL 2023 Findings. arXiv:2212.10474. URL: https://arxiv.org/abs/2212.10474.</w:t>
+      </w:r>
+    </w:p>
+    <w:p>
+      <w:pPr>
+        <w:spacing w:line="360" w:lineRule="auto"/>
+        <w:ind w:left="425" w:hanging="425"/>
+      </w:pPr>
+      <w:r>
+        <w:t>5 Lee S. W. et al. GPoeT-2: A GPT-2 Based Poem Generator. arXiv:2205.08847. URL: https://arxiv.org/abs/2205.08847.</w:t>
+      </w:r>
+    </w:p>
+    <w:p>
+      <w:pPr>
+        <w:spacing w:line="360" w:lineRule="auto"/>
+        <w:ind w:left="425" w:hanging="425"/>
+      </w:pPr>
+      <w:r>
+        <w:t>6 Wang J., Zhang X., Zhou Y., Suh C., Rudin C. There Once Was a Really Bad Poet, It Was Automated but You Didn't Know It // TACL 2021. arXiv:2103.03775. URL: https://arxiv.org/abs/2103.03775.</w:t>
+      </w:r>
+    </w:p>
+    <w:p>
+      <w:pPr>
+        <w:spacing w:line="360" w:lineRule="auto"/>
+        <w:ind w:left="425" w:hanging="425"/>
+      </w:pPr>
+      <w:r>
+        <w:t>7 Ormazabal A., Artetxe M., Soroa A., Labaka G., Agirre E. PoeLM: A Meter- and Rhyme-Controllable Language Model for Unsupervised Poetry Generation // EMNLP 2022 Findings. arXiv:2205.12206. URL: https://arxiv.org/abs/2205.12206.</w:t>
+      </w:r>
+    </w:p>
+    <w:p>
+      <w:pPr>
+        <w:spacing w:line="360" w:lineRule="auto"/>
+        <w:ind w:left="425" w:hanging="425"/>
+      </w:pPr>
+      <w:r>
+        <w:t>8 Belouadi J., Eger S. Let the Poem Hit the Rhythm: Beat-Aligned Poetry Generation. arXiv:2406.10174. URL: https://arxiv.org/html/2406.10174.</w:t>
+      </w:r>
+    </w:p>
+    <w:p>
+      <w:pPr>
+        <w:spacing w:line="360" w:lineRule="auto"/>
+        <w:ind w:left="425" w:hanging="425"/>
+      </w:pPr>
+      <w:r>
+        <w:t>9 Zmitrovich D. et al. A Family of Pretrained Transformer Language Models for Russian. arXiv:2309.10931. URL: https://github.com/ai-forever/ru-gpts.</w:t>
+      </w:r>
+    </w:p>
+    <w:p>
+      <w:pPr>
+        <w:spacing w:line="360" w:lineRule="auto"/>
+        <w:ind w:left="425" w:hanging="425"/>
+      </w:pPr>
+      <w:r>
+        <w:t>10 AI Forever (Sber). ruGPT-3.5-13B. Hugging Face. URL: https://huggingface.co/ai-forever/ruGPT-3.5-13B.</w:t>
+      </w:r>
+    </w:p>
+    <w:p>
+      <w:pPr>
+        <w:spacing w:line="360" w:lineRule="auto"/>
+        <w:ind w:left="425" w:hanging="425"/>
+      </w:pPr>
+      <w:r>
+        <w:t>11 Shliazhko O. et al. mGPT: Few-Shot Learners Go Multilingual. arXiv:2204.07580. URL: https://arxiv.org/abs/2204.07580.</w:t>
+      </w:r>
+    </w:p>
+    <w:p>
+      <w:pPr>
+        <w:spacing w:line="360" w:lineRule="auto"/>
+        <w:ind w:left="425" w:hanging="425"/>
+      </w:pPr>
+      <w:r>
+        <w:t>12 Yandex. YaLM-100B. GitHub, 2022. URL: https://github.com/yandex/YaLM-100B.</w:t>
+      </w:r>
+    </w:p>
+    <w:p>
+      <w:pPr>
+        <w:spacing w:line="360" w:lineRule="auto"/>
+        <w:ind w:left="425" w:hanging="425"/>
+      </w:pPr>
+      <w:r>
+        <w:t>13 Nikolich A. et al. Vikhr: Open-Source Instruction-Tuned LLMs for Russian. arXiv:2405.13929. URL: https://arxiv.org/abs/2405.13929.</w:t>
+      </w:r>
+    </w:p>
+    <w:p>
+      <w:pPr>
+        <w:spacing w:line="360" w:lineRule="auto"/>
+        <w:ind w:left="425" w:hanging="425"/>
+      </w:pPr>
+      <w:r>
+        <w:t>14 Gusev I. saiga_llama3_8b. Hugging Face. URL: https://huggingface.co/IlyaGusev/saiga_llama3_8b.</w:t>
+      </w:r>
+    </w:p>
+    <w:p>
+      <w:pPr>
+        <w:spacing w:line="360" w:lineRule="auto"/>
+        <w:ind w:left="425" w:hanging="425"/>
+      </w:pPr>
+      <w:r>
+        <w:t>15 Mukhamedshina D. et al. GigaChat Family: Efficient Russian Language Modeling Through MoE. arXiv:2506.09440. URL: https://arxiv.org/abs/2506.09440.</w:t>
+      </w:r>
+    </w:p>
+    <w:p>
+      <w:pPr>
+        <w:spacing w:line="360" w:lineRule="auto"/>
+        <w:ind w:left="425" w:hanging="425"/>
+      </w:pPr>
+      <w:r>
+        <w:t>16 Fenogenova A. et al. MERA: A Comprehensive LLM Evaluation in Russian. arXiv:2401.04531. URL: https://arxiv.org/abs/2401.04531.</w:t>
+      </w:r>
+    </w:p>
+    <w:p>
+      <w:pPr>
+        <w:spacing w:line="360" w:lineRule="auto"/>
+        <w:ind w:left="425" w:hanging="425"/>
+      </w:pPr>
+      <w:r>
+        <w:t>17 Koziev I. Automated Evaluation of Meter and Rhyme in Russian Generative and Human-Authored Poetry. arXiv:2502.20931, 2025. URL: https://arxiv.org/abs/2502.20931.</w:t>
+      </w:r>
+    </w:p>
+    <w:p>
+      <w:pPr>
+        <w:spacing w:line="360" w:lineRule="auto"/>
+        <w:ind w:left="425" w:hanging="425"/>
+      </w:pPr>
+      <w:r>
+        <w:t>18 Koziev I. RussianPoetryScansionTool. GitHub. URL: https://github.com/Koziev/RussianPoetryScansionTool.</w:t>
+      </w:r>
+    </w:p>
+    <w:p>
+      <w:pPr>
+        <w:spacing w:line="360" w:lineRule="auto"/>
+        <w:ind w:left="425" w:hanging="425"/>
+      </w:pPr>
+      <w:r>
+        <w:t>19 Koziev I. ArsPoetica. Hugging Face. URL: https://huggingface.co/datasets/inkoziev/ArsPoetica.</w:t>
+      </w:r>
+    </w:p>
+    <w:p>
+      <w:pPr>
+        <w:spacing w:line="360" w:lineRule="auto"/>
+        <w:ind w:left="425" w:hanging="425"/>
+      </w:pPr>
+      <w:r>
+        <w:t>20 Koziev I. Rifma. GitHub. URL: https://github.com/Koziev/Rifma.</w:t>
+      </w:r>
+    </w:p>
+    <w:p>
+      <w:pPr>
+        <w:spacing w:line="360" w:lineRule="auto"/>
+        <w:ind w:left="425" w:hanging="425"/>
+      </w:pPr>
+      <w:r>
+        <w:t>21 Plecháč P. A Collocation-Driven Method of Discovering Rhymes // Taming the Corpus. Springer, 2018. URL: https://github.com/versotym/rhymetagger.</w:t>
+      </w:r>
+    </w:p>
+    <w:p>
+      <w:pPr>
+        <w:spacing w:line="360" w:lineRule="auto"/>
+        <w:ind w:left="425" w:hanging="425"/>
+      </w:pPr>
+      <w:r>
+        <w:t>22 Plecháč P. et al. Training Data Size Sensitivity in Unsupervised Rhyme Recognition. arXiv:2604.08156. URL: https://arxiv.org/abs/2604.08156v1.</w:t>
+      </w:r>
+    </w:p>
+    <w:p>
+      <w:pPr>
+        <w:spacing w:line="360" w:lineRule="auto"/>
+        <w:ind w:left="425" w:hanging="425"/>
+      </w:pPr>
+      <w:r>
+        <w:t>23 Koziev I. rupostagger — POS Tagger for Russian. GitHub. URL: https://github.com/Koziev/rupostagger.</w:t>
+      </w:r>
+    </w:p>
+    <w:p>
+      <w:pPr>
+        <w:spacing w:line="360" w:lineRule="auto"/>
+        <w:ind w:left="425" w:hanging="425"/>
+      </w:pPr>
+      <w:r>
+        <w:t>24 Koziev I. rutokenizer. GitHub. URL: https://github.com/Koziev/rutokenizer.</w:t>
+      </w:r>
+    </w:p>
+    <w:p>
+      <w:pPr>
+        <w:spacing w:line="360" w:lineRule="auto"/>
+        <w:ind w:left="425" w:hanging="425"/>
+      </w:pPr>
+      <w:r>
+        <w:t>25 Dathathri S. et al. Plug and Play Language Models // ICLR 2020. arXiv:1912.02164. URL: https://arxiv.org/abs/1912.02164.</w:t>
+      </w:r>
+    </w:p>
+    <w:p>
+      <w:pPr>
+        <w:spacing w:line="360" w:lineRule="auto"/>
+        <w:ind w:left="425" w:hanging="425"/>
+      </w:pPr>
+      <w:r>
+        <w:t>26 Yang K., Klein D. FUDGE: Controlled Text Generation With Future Discriminators // NAACL 2021. arXiv:2104.05218. URL: https://arxiv.org/abs/2104.05218.</w:t>
+      </w:r>
+    </w:p>
+    <w:p>
+      <w:pPr>
+        <w:spacing w:line="360" w:lineRule="auto"/>
+        <w:ind w:left="425" w:hanging="425"/>
+      </w:pPr>
+      <w:r>
+        <w:t>27 Hokamp C., Liu Q. Lexically Constrained Decoding Using Grid Beam Search. arXiv:1704.07138. URL: https://arxiv.org/abs/1704.07138.</w:t>
+      </w:r>
+    </w:p>
+    <w:p>
+      <w:pPr>
+        <w:spacing w:line="360" w:lineRule="auto"/>
+        <w:ind w:left="425" w:hanging="425"/>
+      </w:pPr>
+      <w:r>
+        <w:t>28 Qin L. et al. COLD Decoding: Energy-based Constrained Text Generation. arXiv:2202.11705. URL: https://arxiv.org/pdf/2202.11705.</w:t>
+      </w:r>
+    </w:p>
+    <w:p>
+      <w:pPr>
+        <w:spacing w:line="360" w:lineRule="auto"/>
+        <w:ind w:left="425" w:hanging="425"/>
+      </w:pPr>
+      <w:r>
+        <w:t>29 Lu X. et al. NeuroLogic Decoding. arXiv:2010.12884. URL: https://arxiv.org/pdf/2010.12884v1.</w:t>
+      </w:r>
+    </w:p>
+    <w:p>
+      <w:pPr>
+        <w:spacing w:line="360" w:lineRule="auto"/>
+        <w:ind w:left="425" w:hanging="425"/>
+      </w:pPr>
+      <w:r>
+        <w:t>30 Manurung R., Ranta A. et al. «Poetic» Statistical Machine Translation: Rhyme and Meter // EMNLP 2010. URL: https://aclanthology.org/D10-1016.pdf.</w:t>
+      </w:r>
+    </w:p>
+    <w:p>
+      <w:pPr>
+        <w:spacing w:line="360" w:lineRule="auto"/>
+        <w:ind w:left="425" w:hanging="425"/>
+      </w:pPr>
+      <w:r>
+        <w:t>31 Huang S. et al. The N+ Implementation Details of RLHF with PPO (TL;DR). arXiv:2403.17031. URL: https://arxiv.org/pdf/2403.17031.</w:t>
+      </w:r>
+    </w:p>
+    <w:p>
+      <w:pPr>
+        <w:spacing w:line="360" w:lineRule="auto"/>
+        <w:ind w:left="425" w:hanging="425"/>
+      </w:pPr>
+      <w:r>
+        <w:t>32 Casas N. et al. Generate and Revise: Reinforcement Learning in Neural Poetry. arXiv:2102.04114. URL: https://arxiv.org/abs/2102.04114.</w:t>
+      </w:r>
+    </w:p>
+    <w:p>
+      <w:pPr>
+        <w:spacing w:line="360" w:lineRule="auto"/>
+        <w:ind w:left="425" w:hanging="425"/>
+      </w:pPr>
+      <w:r>
+        <w:t>33 Casas N. et al. Creative Data Generation: A Review Focusing on Text and Poetry. arXiv:2305.08493. URL: https://arxiv.org/pdf/2305.08493.</w:t>
+      </w:r>
+    </w:p>
+    <w:p>
+      <w:pPr>
+        <w:spacing w:line="360" w:lineRule="auto"/>
+        <w:ind w:left="425" w:hanging="425"/>
+      </w:pPr>
+      <w:r>
+        <w:t>34 Lee H. et al. RLAIF vs. RLHF: Scaling Reinforcement Learning from Human Feedback with AI Feedback. arXiv:2309.00267. URL: https://arxiv.org/html/2309.00267v3.</w:t>
+      </w:r>
+    </w:p>
+    <w:p>
+      <w:pPr>
+        <w:spacing w:line="360" w:lineRule="auto"/>
+        <w:ind w:left="425" w:hanging="425"/>
+      </w:pPr>
+      <w:r>
+        <w:t>35 Regularized Best-of-N Sampling with MBR Objective for Language Model Alignment. arXiv:2404.01054. URL: https://arxiv.org/abs/2404.01054.</w:t>
+      </w:r>
+    </w:p>
+    <w:p>
+      <w:pPr>
+        <w:spacing w:line="360" w:lineRule="auto"/>
+        <w:ind w:left="425" w:hanging="425"/>
+      </w:pPr>
+      <w:r>
+        <w:t>36 Belouadi J., Eger S. Evaluating Diversity in Automatic Poetry Generation. arXiv:2406.15267. URL: https://arxiv.org/html/2406.15267v1.</w:t>
+      </w:r>
+    </w:p>
+    <w:p>
+      <w:pPr>
+        <w:spacing w:line="360" w:lineRule="auto"/>
+        <w:ind w:left="425" w:hanging="425"/>
+      </w:pPr>
+      <w:r>
+        <w:t>37 POEMetric: The Last Stanza of Humanity. arXiv:2604.03695. URL: https://arxiv.org/html/2604.03695v1.</w:t>
+      </w:r>
+    </w:p>
+    <w:p>
+      <w:pPr>
+        <w:spacing w:line="360" w:lineRule="auto"/>
+        <w:ind w:left="425" w:hanging="425"/>
+      </w:pPr>
+      <w:r>
+        <w:t>38 Introducing Aspects of Creativity in Automatic Poetry Generation. arXiv:2002.02511. URL: https://arxiv.org/pdf/2002.02511.</w:t>
+      </w:r>
+    </w:p>
+    <w:p>
+      <w:pPr>
+        <w:spacing w:line="360" w:lineRule="auto"/>
+        <w:ind w:left="425" w:hanging="425"/>
+      </w:pPr>
+      <w:r>
+        <w:t>39 Manurung R. et al. Autonomous Haiku Generation. arXiv:1906.08733. URL: https://arxiv.org/pdf/1906.08733.</w:t>
+      </w:r>
+    </w:p>
+    <w:p>
+      <w:pPr>
+        <w:spacing w:line="360" w:lineRule="auto"/>
+        <w:ind w:left="425" w:hanging="425"/>
+      </w:pPr>
+      <w:r>
+        <w:t>40 Gusev I. stihi_ru. Hugging Face. URL: https://huggingface.co/datasets/IlyaGusev/stihi_ru.</w:t>
+      </w:r>
+    </w:p>
+    <w:p>
+      <w:pPr>
+        <w:spacing w:line="360" w:lineRule="auto"/>
+        <w:ind w:left="425" w:hanging="425"/>
+      </w:pPr>
+      <w:r>
+        <w:t>41 Поэтический подкорпус Национального корпуса русского языка (НКРЯ). URL: https://ruscorpora.ru/page/corpus-poetic-index/.</w:t>
+      </w:r>
+    </w:p>
+    <w:p>
+      <w:pPr>
+        <w:spacing w:line="360" w:lineRule="auto"/>
+        <w:ind w:left="425" w:hanging="425"/>
+      </w:pPr>
+      <w:r>
+        <w:t>42 PULPO: a multilingual poetry corpus. Hugging Face. URL: https://huggingface.co/datasets/linhd-postdata/pulpo.</w:t>
+      </w:r>
+    </w:p>
+    <w:p>
+      <w:pPr>
+        <w:spacing w:line="360" w:lineRule="auto"/>
+        <w:ind w:left="425" w:hanging="425"/>
+      </w:pPr>
+      <w:r>
+        <w:t>43 Parrish A. Gutenberg Poetry Corpus (CC0). GitHub. URL: https://github.com/aparrish/gutenberg-poetry-corpus.</w:t>
+      </w:r>
+    </w:p>
+    <w:p>
+      <w:pPr>
+        <w:spacing w:line="360" w:lineRule="auto"/>
+        <w:ind w:left="425" w:hanging="425"/>
+      </w:pPr>
+      <w:r>
+        <w:t>44 Mikolov T., Chen K., Corrado G., Dean J. Efficient Estimation of Word Representations in Vector Space. arXiv:1301.3781. URL: https://arxiv.org/abs/1301.3781.</w:t>
+      </w:r>
+    </w:p>
+    <w:p>
+      <w:pPr>
+        <w:spacing w:line="360" w:lineRule="auto"/>
+        <w:ind w:left="425" w:hanging="425"/>
+      </w:pPr>
+      <w:r>
+        <w:t>45 Bojanowski P., Grave E., Joulin A., Mikolov T. Enriching Word Vectors with Subword Information // TACL 2017. arXiv:1607.04606. URL: https://arxiv.org/abs/1607.04606.</w:t>
+      </w:r>
+    </w:p>
+    <w:p>
+      <w:pPr>
+        <w:spacing w:line="360" w:lineRule="auto"/>
+        <w:ind w:left="425" w:hanging="425"/>
+      </w:pPr>
+      <w:r>
+        <w:t>46 Devlin J., Chang M.-W., Lee K., Toutanova K. BERT: Pre-training of Deep Bidirectional Transformers for Language Understanding // NAACL 2019. arXiv:1810.04805. URL: https://arxiv.org/abs/1810.04805.</w:t>
+      </w:r>
+    </w:p>
+    <w:p>
+      <w:pPr>
+        <w:spacing w:line="360" w:lineRule="auto"/>
+        <w:ind w:left="425" w:hanging="425"/>
+      </w:pPr>
+      <w:r>
+        <w:t>47 ГОСТ Р 7.0.100–2018. Библиографическая запись. Библиографическое описание. М.: Стандартинформ, 2018.</w:t>
+      </w:r>
+    </w:p>
+    <w:p>
+      <w:pPr>
+        <w:spacing w:line="360" w:lineRule="auto"/>
+        <w:ind w:left="425" w:hanging="425"/>
+      </w:pPr>
+      <w:r>
+        <w:t>48 ГОСТ 7.32–2017. Отчёт о научно-исследовательской работе. Структура и правила оформления. М.: Стандартинформ, 2017.</w:t>
+      </w:r>
+    </w:p>
     <w:sectPr>
       <w:footerReference w:type="default" r:id="rId9"/>
       <w:pgSz w:w="11906" w:h="16838"/>
-      <w:pgMar w:top="1134" w:right="850" w:bottom="1134" w:left="1701" w:header="720" w:footer="720" w:gutter="0"/>
+      <w:pgMar w:top="1134" w:right="567" w:bottom="1134" w:left="1701" w:header="720" w:footer="720" w:gutter="0"/>
       <w:cols w:space="720"/>
       <w:titlePg/>
       <w:docGrid w:linePitch="360"/>
@@ -7045,7 +7113,7 @@
     <w:pPr>
       <w:pStyle w:val="Footer"/>
       <w:ind w:firstLine="0"/>
-      <w:jc w:val="center"/>
+      <w:jc w:val="right"/>
     </w:pPr>
     <w:r>
       <w:rPr>

</xml_diff>

<commit_message>
add(docs): lists of terms, gost links, abbreviations
</commit_message>
<xml_diff>
--- a/docs/practice/Отчёт_учебная_практика.docx
+++ b/docs/practice/Отчёт_учебная_практика.docx
@@ -330,7 +330,7 @@
         <w:rPr>
           <w:b w:val="0"/>
         </w:rPr>
-        <w:t>Объём отчёта — 32 с., 5 таблиц, рисунков и листингов — в приложениях, 48 использованных источников, 2 приложения.</w:t>
+        <w:t>Объём отчёта — 35 с., 5 таблиц, рисунков и листингов — в приложениях, 48 использованных источников, 2 приложения.</w:t>
       </w:r>
     </w:p>
     <w:p>
@@ -405,7 +405,7 @@
         <w:rPr>
           <w:b/>
         </w:rPr>
-        <w:t>Введение</w:t>
+        <w:t>Нормативные ссылки</w:t>
       </w:r>
       <w:r>
         <w:tab/>
@@ -424,11 +424,68 @@
         <w:rPr>
           <w:b/>
         </w:rPr>
-        <w:t>Глава 1. Обзор источников и теоретические основы</w:t>
+        <w:t>Термины и определения</w:t>
+      </w:r>
+      <w:r>
+        <w:tab/>
+        <w:t>6</w:t>
+      </w:r>
+    </w:p>
+    <w:p>
+      <w:pPr>
+        <w:tabs>
+          <w:tab w:pos="9354" w:val="right" w:leader="dot"/>
+        </w:tabs>
+        <w:spacing w:line="360" w:lineRule="auto" w:after="0"/>
+        <w:ind w:firstLine="0" w:left="0"/>
+      </w:pPr>
+      <w:r>
+        <w:rPr>
+          <w:b/>
+        </w:rPr>
+        <w:t>Перечень сокращений</w:t>
       </w:r>
       <w:r>
         <w:tab/>
         <w:t>7</w:t>
+      </w:r>
+    </w:p>
+    <w:p>
+      <w:pPr>
+        <w:tabs>
+          <w:tab w:pos="9354" w:val="right" w:leader="dot"/>
+        </w:tabs>
+        <w:spacing w:line="360" w:lineRule="auto" w:after="0"/>
+        <w:ind w:firstLine="0" w:left="0"/>
+      </w:pPr>
+      <w:r>
+        <w:rPr>
+          <w:b/>
+        </w:rPr>
+        <w:t>Введение</w:t>
+      </w:r>
+      <w:r>
+        <w:tab/>
+        <w:t>8</w:t>
+      </w:r>
+    </w:p>
+    <w:p>
+      <w:pPr>
+        <w:tabs>
+          <w:tab w:pos="9354" w:val="right" w:leader="dot"/>
+        </w:tabs>
+        <w:spacing w:line="360" w:lineRule="auto" w:after="0"/>
+        <w:ind w:firstLine="0" w:left="0"/>
+      </w:pPr>
+      <w:r>
+        <w:rPr>
+          <w:b/>
+        </w:rPr>
+        <w:t>Глава 1. Обзор источников и теоретические основы</w:t>
+      </w:r>
+      <w:r>
+        <w:tab/>
+        <w:t>10</w:t>
       </w:r>
     </w:p>
     <w:p>
@@ -444,7 +501,7 @@
       </w:r>
       <w:r>
         <w:tab/>
-        <w:t>7</w:t>
+        <w:t>10</w:t>
       </w:r>
     </w:p>
     <w:p>
@@ -460,7 +517,7 @@
       </w:r>
       <w:r>
         <w:tab/>
-        <w:t>7</w:t>
+        <w:t>10</w:t>
       </w:r>
     </w:p>
     <w:p>
@@ -476,7 +533,7 @@
       </w:r>
       <w:r>
         <w:tab/>
-        <w:t>8</w:t>
+        <w:t>11</w:t>
       </w:r>
     </w:p>
     <w:p>
@@ -495,7 +552,7 @@
       </w:r>
       <w:r>
         <w:tab/>
-        <w:t>9</w:t>
+        <w:t>12</w:t>
       </w:r>
     </w:p>
     <w:p>
@@ -511,7 +568,7 @@
       </w:r>
       <w:r>
         <w:tab/>
-        <w:t>9</w:t>
+        <w:t>12</w:t>
       </w:r>
     </w:p>
     <w:p>
@@ -527,7 +584,7 @@
       </w:r>
       <w:r>
         <w:tab/>
-        <w:t>9</w:t>
+        <w:t>12</w:t>
       </w:r>
     </w:p>
     <w:p>
@@ -543,7 +600,7 @@
       </w:r>
       <w:r>
         <w:tab/>
-        <w:t>10</w:t>
+        <w:t>13</w:t>
       </w:r>
     </w:p>
     <w:p>
@@ -562,7 +619,7 @@
       </w:r>
       <w:r>
         <w:tab/>
-        <w:t>11</w:t>
+        <w:t>14</w:t>
       </w:r>
     </w:p>
     <w:p>
@@ -578,7 +635,7 @@
       </w:r>
       <w:r>
         <w:tab/>
-        <w:t>11</w:t>
+        <w:t>14</w:t>
       </w:r>
     </w:p>
     <w:p>
@@ -594,7 +651,7 @@
       </w:r>
       <w:r>
         <w:tab/>
-        <w:t>11</w:t>
+        <w:t>14</w:t>
       </w:r>
     </w:p>
     <w:p>
@@ -610,7 +667,7 @@
       </w:r>
       <w:r>
         <w:tab/>
-        <w:t>12</w:t>
+        <w:t>15</w:t>
       </w:r>
     </w:p>
     <w:p>
@@ -626,7 +683,7 @@
       </w:r>
       <w:r>
         <w:tab/>
-        <w:t>12</w:t>
+        <w:t>15</w:t>
       </w:r>
     </w:p>
     <w:p>
@@ -642,7 +699,7 @@
       </w:r>
       <w:r>
         <w:tab/>
-        <w:t>12</w:t>
+        <w:t>15</w:t>
       </w:r>
     </w:p>
     <w:p>
@@ -661,7 +718,7 @@
       </w:r>
       <w:r>
         <w:tab/>
-        <w:t>14</w:t>
+        <w:t>17</w:t>
       </w:r>
     </w:p>
     <w:p>
@@ -677,7 +734,7 @@
       </w:r>
       <w:r>
         <w:tab/>
-        <w:t>14</w:t>
+        <w:t>17</w:t>
       </w:r>
     </w:p>
     <w:p>
@@ -693,7 +750,7 @@
       </w:r>
       <w:r>
         <w:tab/>
-        <w:t>14</w:t>
+        <w:t>17</w:t>
       </w:r>
     </w:p>
     <w:p>
@@ -709,7 +766,7 @@
       </w:r>
       <w:r>
         <w:tab/>
-        <w:t>15</w:t>
+        <w:t>18</w:t>
       </w:r>
     </w:p>
     <w:p>
@@ -725,7 +782,7 @@
       </w:r>
       <w:r>
         <w:tab/>
-        <w:t>15</w:t>
+        <w:t>18</w:t>
       </w:r>
     </w:p>
     <w:p>
@@ -741,7 +798,7 @@
       </w:r>
       <w:r>
         <w:tab/>
-        <w:t>15</w:t>
+        <w:t>18</w:t>
       </w:r>
     </w:p>
     <w:p>
@@ -757,7 +814,7 @@
       </w:r>
       <w:r>
         <w:tab/>
-        <w:t>16</w:t>
+        <w:t>19</w:t>
       </w:r>
     </w:p>
     <w:p>
@@ -776,7 +833,7 @@
       </w:r>
       <w:r>
         <w:tab/>
-        <w:t>18</w:t>
+        <w:t>21</w:t>
       </w:r>
     </w:p>
     <w:p>
@@ -795,7 +852,7 @@
       </w:r>
       <w:r>
         <w:tab/>
-        <w:t>19</w:t>
+        <w:t>22</w:t>
       </w:r>
     </w:p>
     <w:p>
@@ -814,7 +871,7 @@
       </w:r>
       <w:r>
         <w:tab/>
-        <w:t>25</w:t>
+        <w:t>28</w:t>
       </w:r>
     </w:p>
     <w:p>
@@ -833,7 +890,441 @@
       </w:r>
       <w:r>
         <w:tab/>
-        <w:t>29</w:t>
+        <w:t>32</w:t>
+      </w:r>
+    </w:p>
+    <w:p>
+      <w:pPr>
+        <w:pStyle w:val="Heading1"/>
+        <w:pageBreakBefore/>
+      </w:pPr>
+      <w:r>
+        <w:t>Нормативные ссылки</w:t>
+      </w:r>
+    </w:p>
+    <w:p>
+      <w:r>
+        <w:rPr>
+          <w:b w:val="0"/>
+        </w:rPr>
+        <w:t>В настоящем отчёте использованы ссылки на следующие стандарты (СТО 1.701 п.4.7). Порядок - межгосударственные, затем государственные стандарты:</w:t>
+      </w:r>
+    </w:p>
+    <w:p>
+      <w:pPr>
+        <w:spacing w:line="360" w:lineRule="auto" w:after="0"/>
+        <w:ind w:left="425" w:hanging="425"/>
+      </w:pPr>
+      <w:r>
+        <w:rPr>
+          <w:b/>
+        </w:rPr>
+        <w:t>ГОСТ 7.32-2017</w:t>
+      </w:r>
+      <w:r>
+        <w:t xml:space="preserve"> — Система стандартов по информации, библиотечному и издательскому делу. Отчёт о научно-исследовательской работе. Структура и правила оформления.</w:t>
+      </w:r>
+    </w:p>
+    <w:p>
+      <w:pPr>
+        <w:spacing w:line="360" w:lineRule="auto" w:after="0"/>
+        <w:ind w:left="425" w:hanging="425"/>
+      </w:pPr>
+      <w:r>
+        <w:rPr>
+          <w:b/>
+        </w:rPr>
+        <w:t>ГОСТ Р 7.0.100-2018</w:t>
+      </w:r>
+      <w:r>
+        <w:t xml:space="preserve"> — Система стандартов по информации, библиотечному и издательскому делу. Библиографическая запись. Библиографическое описание. Общие требования и правила составления.</w:t>
+      </w:r>
+    </w:p>
+    <w:p>
+      <w:r>
+        <w:rPr>
+          <w:b w:val="0"/>
+        </w:rPr>
+        <w:t>Примечание - текст и приложения отчёта оформлены также по стандарту организации СТО 1.701-2010 «Текстовые документы. Общие требования к построению и оформлению».</w:t>
+      </w:r>
+    </w:p>
+    <w:p>
+      <w:pPr>
+        <w:pStyle w:val="Heading1"/>
+        <w:pageBreakBefore/>
+      </w:pPr>
+      <w:r>
+        <w:t>Термины и определения</w:t>
+      </w:r>
+    </w:p>
+    <w:p>
+      <w:r>
+        <w:rPr>
+          <w:b w:val="0"/>
+        </w:rPr>
+        <w:t>В настоящем отчёте применяют следующие термины с соответствующими определениями:</w:t>
+      </w:r>
+    </w:p>
+    <w:p>
+      <w:pPr>
+        <w:spacing w:line="360" w:lineRule="auto" w:after="0"/>
+        <w:ind w:left="425" w:hanging="425"/>
+      </w:pPr>
+      <w:r>
+        <w:rPr>
+          <w:b/>
+        </w:rPr>
+        <w:t>силлабо-тоническое стихосложение</w:t>
+      </w:r>
+      <w:r>
+        <w:t xml:space="preserve"> — система стихосложения, основанная на упорядоченном чередовании ударных и безударных слогов в строке.</w:t>
+      </w:r>
+    </w:p>
+    <w:p>
+      <w:pPr>
+        <w:spacing w:line="360" w:lineRule="auto" w:after="0"/>
+        <w:ind w:left="425" w:hanging="425"/>
+      </w:pPr>
+      <w:r>
+        <w:rPr>
+          <w:b/>
+        </w:rPr>
+        <w:t>стихотворный размер (метр)</w:t>
+      </w:r>
+      <w:r>
+        <w:t xml:space="preserve"> — закон чередования ударных и безударных слогов в строке (ямб, хорей, дактиль и т. д.).</w:t>
+      </w:r>
+    </w:p>
+    <w:p>
+      <w:pPr>
+        <w:spacing w:line="360" w:lineRule="auto" w:after="0"/>
+        <w:ind w:left="425" w:hanging="425"/>
+      </w:pPr>
+      <w:r>
+        <w:rPr>
+          <w:b/>
+        </w:rPr>
+        <w:t>рифма</w:t>
+      </w:r>
+      <w:r>
+        <w:t xml:space="preserve"> — созвучие окончаний стихотворных строк, начиная с последнего ударного слога.</w:t>
+      </w:r>
+    </w:p>
+    <w:p>
+      <w:pPr>
+        <w:spacing w:line="360" w:lineRule="auto" w:after="0"/>
+        <w:ind w:left="425" w:hanging="425"/>
+      </w:pPr>
+      <w:r>
+        <w:rPr>
+          <w:b/>
+        </w:rPr>
+        <w:t>клаузула</w:t>
+      </w:r>
+      <w:r>
+        <w:t xml:space="preserve"> — заключительная часть строки от последнего ударного слога; именно клаузулы сравниваются при оценке рифмы.</w:t>
+      </w:r>
+    </w:p>
+    <w:p>
+      <w:pPr>
+        <w:spacing w:line="360" w:lineRule="auto" w:after="0"/>
+        <w:ind w:left="425" w:hanging="425"/>
+      </w:pPr>
+      <w:r>
+        <w:rPr>
+          <w:b/>
+        </w:rPr>
+        <w:t>схема рифмовки</w:t>
+      </w:r>
+      <w:r>
+        <w:t xml:space="preserve"> — порядок чередования рифмующихся строк в строфе (например, ABAB - перекрёстная, AABB - смежная).</w:t>
+      </w:r>
+    </w:p>
+    <w:p>
+      <w:pPr>
+        <w:spacing w:line="360" w:lineRule="auto" w:after="0"/>
+        <w:ind w:left="425" w:hanging="425"/>
+      </w:pPr>
+      <w:r>
+        <w:rPr>
+          <w:b/>
+        </w:rPr>
+        <w:t>детектор рифмы</w:t>
+      </w:r>
+      <w:r>
+        <w:t xml:space="preserve"> — алгоритм, численно оценивающий созвучие окончаний строк и выделяющий группы рифмующихся слов.</w:t>
+      </w:r>
+    </w:p>
+    <w:p>
+      <w:pPr>
+        <w:spacing w:line="360" w:lineRule="auto" w:after="0"/>
+        <w:ind w:left="425" w:hanging="425"/>
+      </w:pPr>
+      <w:r>
+        <w:rPr>
+          <w:b/>
+        </w:rPr>
+        <w:t>потенциал Юкавы</w:t>
+      </w:r>
+      <w:r>
+        <w:t xml:space="preserve"> — экранированный потенциал вида e^(−λd)/d; в работе используется как ядро затухания силы связи слогов с ростом расстояния между ними.</w:t>
+      </w:r>
+    </w:p>
+    <w:p>
+      <w:pPr>
+        <w:spacing w:line="360" w:lineRule="auto" w:after="0"/>
+        <w:ind w:left="425" w:hanging="425"/>
+      </w:pPr>
+      <w:r>
+        <w:rPr>
+          <w:b/>
+        </w:rPr>
+        <w:t>фонетическая векторизация</w:t>
+      </w:r>
+      <w:r>
+        <w:t xml:space="preserve"> — представление слога числовым вектором артикуляционных признаков гласных и согласных для измерения созвучия.</w:t>
+      </w:r>
+    </w:p>
+    <w:p>
+      <w:pPr>
+        <w:spacing w:line="360" w:lineRule="auto" w:after="0"/>
+        <w:ind w:left="425" w:hanging="425"/>
+      </w:pPr>
+      <w:r>
+        <w:rPr>
+          <w:b/>
+        </w:rPr>
+        <w:t>best-of-N</w:t>
+      </w:r>
+      <w:r>
+        <w:t xml:space="preserve"> — стратегия отбора лучшего из N сгенерированных вариантов по значению оценочной функции.</w:t>
+      </w:r>
+    </w:p>
+    <w:p>
+      <w:pPr>
+        <w:spacing w:line="360" w:lineRule="auto" w:after="0"/>
+        <w:ind w:left="425" w:hanging="425"/>
+      </w:pPr>
+      <w:r>
+        <w:rPr>
+          <w:b/>
+        </w:rPr>
+        <w:t>самокоррекция</w:t>
+      </w:r>
+      <w:r>
+        <w:t xml:space="preserve"> — повторная правка сгенерированного текста языковой моделью по обратной связи (разбору) детектора рифмы.</w:t>
+      </w:r>
+    </w:p>
+    <w:p>
+      <w:pPr>
+        <w:pStyle w:val="Heading1"/>
+        <w:pageBreakBefore/>
+      </w:pPr>
+      <w:r>
+        <w:t>Перечень сокращений</w:t>
+      </w:r>
+    </w:p>
+    <w:p>
+      <w:r>
+        <w:rPr>
+          <w:b w:val="0"/>
+        </w:rPr>
+        <w:t>В настоящем отчёте применяют следующие сокращения и обозначения:</w:t>
+      </w:r>
+    </w:p>
+    <w:p>
+      <w:pPr>
+        <w:spacing w:line="360" w:lineRule="auto" w:after="0"/>
+        <w:ind w:left="425" w:hanging="425"/>
+      </w:pPr>
+      <w:r>
+        <w:rPr>
+          <w:b/>
+        </w:rPr>
+        <w:t>ВКР</w:t>
+      </w:r>
+      <w:r>
+        <w:t xml:space="preserve"> — выпускная квалификационная работа</w:t>
+      </w:r>
+    </w:p>
+    <w:p>
+      <w:pPr>
+        <w:spacing w:line="360" w:lineRule="auto" w:after="0"/>
+        <w:ind w:left="425" w:hanging="425"/>
+      </w:pPr>
+      <w:r>
+        <w:rPr>
+          <w:b/>
+        </w:rPr>
+        <w:t>ИИ</w:t>
+      </w:r>
+      <w:r>
+        <w:t xml:space="preserve"> — искусственный интеллект</w:t>
+      </w:r>
+    </w:p>
+    <w:p>
+      <w:pPr>
+        <w:spacing w:line="360" w:lineRule="auto" w:after="0"/>
+        <w:ind w:left="425" w:hanging="425"/>
+      </w:pPr>
+      <w:r>
+        <w:rPr>
+          <w:b/>
+        </w:rPr>
+        <w:t>LLM</w:t>
+      </w:r>
+      <w:r>
+        <w:t xml:space="preserve"> — большая языковая модель (Large Language Model)</w:t>
+      </w:r>
+    </w:p>
+    <w:p>
+      <w:pPr>
+        <w:spacing w:line="360" w:lineRule="auto" w:after="0"/>
+        <w:ind w:left="425" w:hanging="425"/>
+      </w:pPr>
+      <w:r>
+        <w:rPr>
+          <w:b/>
+        </w:rPr>
+        <w:t>NLP</w:t>
+      </w:r>
+      <w:r>
+        <w:t xml:space="preserve"> — обработка естественного языка (Natural Language Processing)</w:t>
+      </w:r>
+    </w:p>
+    <w:p>
+      <w:pPr>
+        <w:spacing w:line="360" w:lineRule="auto" w:after="0"/>
+        <w:ind w:left="425" w:hanging="425"/>
+      </w:pPr>
+      <w:r>
+        <w:rPr>
+          <w:b/>
+        </w:rPr>
+        <w:t>SOTA</w:t>
+      </w:r>
+      <w:r>
+        <w:t xml:space="preserve"> — современный уровень развития области, лучшие достигнутые результаты (State of the Art)</w:t>
+      </w:r>
+    </w:p>
+    <w:p>
+      <w:pPr>
+        <w:spacing w:line="360" w:lineRule="auto" w:after="0"/>
+        <w:ind w:left="425" w:hanging="425"/>
+      </w:pPr>
+      <w:r>
+        <w:rPr>
+          <w:b/>
+        </w:rPr>
+        <w:t>RPST</w:t>
+      </w:r>
+      <w:r>
+        <w:t xml:space="preserve"> — инструмент автоматического анализа русского стиха (Russian Poetry Scansion Tool)</w:t>
+      </w:r>
+    </w:p>
+    <w:p>
+      <w:pPr>
+        <w:spacing w:line="360" w:lineRule="auto" w:after="0"/>
+        <w:ind w:left="425" w:hanging="425"/>
+      </w:pPr>
+      <w:r>
+        <w:rPr>
+          <w:b/>
+        </w:rPr>
+        <w:t>RLHF</w:t>
+      </w:r>
+      <w:r>
+        <w:t xml:space="preserve"> — обучение с подкреплением на основе обратной связи человека (Reinforcement Learning from Human Feedback)</w:t>
+      </w:r>
+    </w:p>
+    <w:p>
+      <w:pPr>
+        <w:spacing w:line="360" w:lineRule="auto" w:after="0"/>
+        <w:ind w:left="425" w:hanging="425"/>
+      </w:pPr>
+      <w:r>
+        <w:rPr>
+          <w:b/>
+        </w:rPr>
+        <w:t>best-of-N</w:t>
+      </w:r>
+      <w:r>
+        <w:t xml:space="preserve"> — отбор лучшего из N сгенерированных вариантов</w:t>
+      </w:r>
+    </w:p>
+    <w:p>
+      <w:pPr>
+        <w:spacing w:line="360" w:lineRule="auto" w:after="0"/>
+        <w:ind w:left="425" w:hanging="425"/>
+      </w:pPr>
+      <w:r>
+        <w:rPr>
+          <w:b/>
+        </w:rPr>
+        <w:t>GUI</w:t>
+      </w:r>
+      <w:r>
+        <w:t xml:space="preserve"> — графический интерфейс пользователя (Graphical User Interface)</w:t>
+      </w:r>
+    </w:p>
+    <w:p>
+      <w:pPr>
+        <w:spacing w:line="360" w:lineRule="auto" w:after="0"/>
+        <w:ind w:left="425" w:hanging="425"/>
+      </w:pPr>
+      <w:r>
+        <w:rPr>
+          <w:b/>
+        </w:rPr>
+        <w:t>API</w:t>
+      </w:r>
+      <w:r>
+        <w:t xml:space="preserve"> — программный интерфейс приложения (Application Programming Interface)</w:t>
+      </w:r>
+    </w:p>
+    <w:p>
+      <w:pPr>
+        <w:spacing w:line="360" w:lineRule="auto" w:after="0"/>
+        <w:ind w:left="425" w:hanging="425"/>
+      </w:pPr>
+      <w:r>
+        <w:rPr>
+          <w:b/>
+        </w:rPr>
+        <w:t>НКРЯ</w:t>
+      </w:r>
+      <w:r>
+        <w:t xml:space="preserve"> — Национальный корпус русского языка</w:t>
+      </w:r>
+    </w:p>
+    <w:p>
+      <w:pPr>
+        <w:spacing w:line="360" w:lineRule="auto" w:after="0"/>
+        <w:ind w:left="425" w:hanging="425"/>
+      </w:pPr>
+      <w:r>
+        <w:rPr>
+          <w:b/>
+        </w:rPr>
+        <w:t>MERA</w:t>
+      </w:r>
+      <w:r>
+        <w:t xml:space="preserve"> — бенчмарк комплексной оценки русскоязычных языковых моделей</w:t>
+      </w:r>
+    </w:p>
+    <w:p>
+      <w:pPr>
+        <w:spacing w:line="360" w:lineRule="auto" w:after="0"/>
+        <w:ind w:left="425" w:hanging="425"/>
+      </w:pPr>
+      <w:r>
+        <w:rPr>
+          <w:b/>
+        </w:rPr>
+        <w:t>РИНЦ</w:t>
+      </w:r>
+      <w:r>
+        <w:t xml:space="preserve"> — Российский индекс научного цитирования</w:t>
       </w:r>
     </w:p>
     <w:p>

</xml_diff>

<commit_message>
fix(docs): title & overall view improved
</commit_message>
<xml_diff>
--- a/docs/practice/Отчёт_учебная_практика.docx
+++ b/docs/practice/Отчёт_учебная_практика.docx
@@ -104,6 +104,51 @@
         <w:spacing w:lineRule="auto" w:line="240" w:before="480" w:after="0"/>
         <w:ind w:hanging="0"/>
         <w:jc w:val="center"/>
+        <w:rPr>
+          <w:b/>
+          <w:sz w:val="32"/>
+        </w:rPr>
+      </w:pPr>
+      <w:r>
+        <w:rPr/>
+      </w:r>
+    </w:p>
+    <w:p>
+      <w:pPr>
+        <w:pStyle w:val="Normal"/>
+        <w:spacing w:lineRule="auto" w:line="240" w:before="480" w:after="0"/>
+        <w:ind w:hanging="0"/>
+        <w:jc w:val="center"/>
+        <w:rPr>
+          <w:b/>
+          <w:sz w:val="32"/>
+        </w:rPr>
+      </w:pPr>
+      <w:r>
+        <w:rPr/>
+      </w:r>
+    </w:p>
+    <w:p>
+      <w:pPr>
+        <w:pStyle w:val="Normal"/>
+        <w:spacing w:lineRule="auto" w:line="240" w:before="480" w:after="0"/>
+        <w:ind w:hanging="0"/>
+        <w:jc w:val="center"/>
+        <w:rPr>
+          <w:b/>
+          <w:sz w:val="32"/>
+        </w:rPr>
+      </w:pPr>
+      <w:r>
+        <w:rPr/>
+      </w:r>
+    </w:p>
+    <w:p>
+      <w:pPr>
+        <w:pStyle w:val="Normal"/>
+        <w:spacing w:lineRule="auto" w:line="240" w:before="480" w:after="0"/>
+        <w:ind w:hanging="0"/>
+        <w:jc w:val="center"/>
         <w:rPr/>
       </w:pPr>
       <w:r>
@@ -213,6 +258,21 @@
     <w:p>
       <w:pPr>
         <w:pStyle w:val="Normal"/>
+        <w:spacing w:lineRule="auto" w:line="240" w:before="0" w:after="960"/>
+        <w:ind w:hanging="0"/>
+        <w:jc w:val="center"/>
+        <w:rPr>
+          <w:b w:val="false"/>
+          <w:sz w:val="28"/>
+        </w:rPr>
+      </w:pPr>
+      <w:r>
+        <w:rPr/>
+      </w:r>
+    </w:p>
+    <w:p>
+      <w:pPr>
+        <w:pStyle w:val="Normal"/>
         <w:spacing w:lineRule="auto" w:line="240" w:before="0" w:after="0"/>
         <w:ind w:hanging="0"/>
         <w:jc w:val="right"/>
@@ -315,16 +375,16 @@
     <w:p>
       <w:pPr>
         <w:pStyle w:val="Normal"/>
-        <w:spacing w:before="960" w:after="0"/>
+        <w:spacing w:before="0" w:after="240"/>
         <w:ind w:hanging="0"/>
         <w:jc w:val="center"/>
-        <w:rPr/>
-      </w:pPr>
-      <w:r>
-        <w:rPr/>
-        <w:t>Великий Новгород</w:t>
-        <w:br/>
-        <w:t>2026</w:t>
+        <w:rPr>
+          <w:b/>
+          <w:sz w:val="32"/>
+        </w:rPr>
+      </w:pPr>
+      <w:r>
+        <w:rPr/>
       </w:r>
       <w:r>
         <w:br w:type="page"/>
@@ -333,7 +393,7 @@
     <w:p>
       <w:pPr>
         <w:pStyle w:val="Normal"/>
-        <w:spacing w:before="240" w:after="240"/>
+        <w:spacing w:before="0" w:after="240"/>
         <w:ind w:hanging="0"/>
         <w:jc w:val="center"/>
         <w:rPr/>
@@ -412,7 +472,7 @@
     <w:p>
       <w:pPr>
         <w:pStyle w:val="Normal"/>
-        <w:spacing w:before="240" w:after="240"/>
+        <w:spacing w:before="0" w:after="240"/>
         <w:ind w:hanging="0"/>
         <w:jc w:val="center"/>
         <w:rPr/>
@@ -467,6 +527,7 @@
     <w:p>
       <w:pPr>
         <w:pStyle w:val="Normal"/>
+        <w:spacing w:before="0" w:after="0"/>
         <w:ind w:hanging="0"/>
         <w:jc w:val="center"/>
         <w:rPr/>
@@ -1066,6 +1127,7 @@
     <w:p>
       <w:pPr>
         <w:pStyle w:val="Heading1"/>
+        <w:spacing w:before="0" w:after="240"/>
         <w:rPr/>
       </w:pPr>
       <w:r>
@@ -1139,6 +1201,7 @@
     <w:p>
       <w:pPr>
         <w:pStyle w:val="Heading1"/>
+        <w:spacing w:before="0" w:after="240"/>
         <w:rPr/>
       </w:pPr>
       <w:r>
@@ -1344,6 +1407,7 @@
     <w:p>
       <w:pPr>
         <w:pStyle w:val="Heading1"/>
+        <w:spacing w:before="0" w:after="240"/>
         <w:rPr/>
       </w:pPr>
       <w:r>
@@ -1603,6 +1667,7 @@
     <w:p>
       <w:pPr>
         <w:pStyle w:val="Heading1"/>
+        <w:spacing w:before="0" w:after="240"/>
         <w:rPr/>
       </w:pPr>
       <w:r>
@@ -1753,6 +1818,7 @@
     <w:p>
       <w:pPr>
         <w:pStyle w:val="Heading1"/>
+        <w:spacing w:before="0" w:after="240"/>
         <w:rPr/>
       </w:pPr>
       <w:r>
@@ -1880,6 +1946,7 @@
     <w:p>
       <w:pPr>
         <w:pStyle w:val="Heading1"/>
+        <w:spacing w:before="0" w:after="240"/>
         <w:rPr/>
       </w:pPr>
       <w:r>
@@ -1951,6 +2018,7 @@
             <w:pPr>
               <w:pStyle w:val="Normal"/>
               <w:widowControl/>
+              <w:suppressAutoHyphens w:val="true"/>
               <w:spacing w:lineRule="auto" w:line="240" w:before="0" w:after="0"/>
               <w:ind w:hanging="0"/>
               <w:jc w:val="center"/>
@@ -1981,6 +2049,7 @@
             <w:pPr>
               <w:pStyle w:val="Normal"/>
               <w:widowControl/>
+              <w:suppressAutoHyphens w:val="true"/>
               <w:spacing w:lineRule="auto" w:line="240" w:before="0" w:after="0"/>
               <w:ind w:hanging="0"/>
               <w:jc w:val="center"/>
@@ -2011,6 +2080,7 @@
             <w:pPr>
               <w:pStyle w:val="Normal"/>
               <w:widowControl/>
+              <w:suppressAutoHyphens w:val="true"/>
               <w:spacing w:lineRule="auto" w:line="240" w:before="0" w:after="0"/>
               <w:ind w:hanging="0"/>
               <w:jc w:val="center"/>
@@ -2044,6 +2114,7 @@
             <w:pPr>
               <w:pStyle w:val="Normal"/>
               <w:widowControl/>
+              <w:suppressAutoHyphens w:val="true"/>
               <w:spacing w:lineRule="auto" w:line="240" w:before="0" w:after="0"/>
               <w:ind w:hanging="0"/>
               <w:rPr>
@@ -2072,6 +2143,7 @@
             <w:pPr>
               <w:pStyle w:val="Normal"/>
               <w:widowControl/>
+              <w:suppressAutoHyphens w:val="true"/>
               <w:spacing w:lineRule="auto" w:line="240" w:before="0" w:after="0"/>
               <w:ind w:hanging="0"/>
               <w:rPr>
@@ -2100,6 +2172,7 @@
             <w:pPr>
               <w:pStyle w:val="Normal"/>
               <w:widowControl/>
+              <w:suppressAutoHyphens w:val="true"/>
               <w:spacing w:lineRule="auto" w:line="240" w:before="0" w:after="0"/>
               <w:ind w:hanging="0"/>
               <w:rPr>
@@ -2131,6 +2204,7 @@
             <w:pPr>
               <w:pStyle w:val="Normal"/>
               <w:widowControl/>
+              <w:suppressAutoHyphens w:val="true"/>
               <w:spacing w:lineRule="auto" w:line="240" w:before="0" w:after="0"/>
               <w:ind w:hanging="0"/>
               <w:rPr>
@@ -2159,6 +2233,7 @@
             <w:pPr>
               <w:pStyle w:val="Normal"/>
               <w:widowControl/>
+              <w:suppressAutoHyphens w:val="true"/>
               <w:spacing w:lineRule="auto" w:line="240" w:before="0" w:after="0"/>
               <w:ind w:hanging="0"/>
               <w:rPr>
@@ -2187,6 +2262,7 @@
             <w:pPr>
               <w:pStyle w:val="Normal"/>
               <w:widowControl/>
+              <w:suppressAutoHyphens w:val="true"/>
               <w:spacing w:lineRule="auto" w:line="240" w:before="0" w:after="0"/>
               <w:ind w:hanging="0"/>
               <w:rPr>
@@ -2218,6 +2294,7 @@
             <w:pPr>
               <w:pStyle w:val="Normal"/>
               <w:widowControl/>
+              <w:suppressAutoHyphens w:val="true"/>
               <w:spacing w:lineRule="auto" w:line="240" w:before="0" w:after="0"/>
               <w:ind w:hanging="0"/>
               <w:rPr>
@@ -2246,6 +2323,7 @@
             <w:pPr>
               <w:pStyle w:val="Normal"/>
               <w:widowControl/>
+              <w:suppressAutoHyphens w:val="true"/>
               <w:spacing w:lineRule="auto" w:line="240" w:before="0" w:after="0"/>
               <w:ind w:hanging="0"/>
               <w:rPr>
@@ -2274,6 +2352,7 @@
             <w:pPr>
               <w:pStyle w:val="Normal"/>
               <w:widowControl/>
+              <w:suppressAutoHyphens w:val="true"/>
               <w:spacing w:lineRule="auto" w:line="240" w:before="0" w:after="0"/>
               <w:ind w:hanging="0"/>
               <w:rPr>
@@ -2305,6 +2384,7 @@
             <w:pPr>
               <w:pStyle w:val="Normal"/>
               <w:widowControl/>
+              <w:suppressAutoHyphens w:val="true"/>
               <w:spacing w:lineRule="auto" w:line="240" w:before="0" w:after="0"/>
               <w:ind w:hanging="0"/>
               <w:rPr>
@@ -2333,6 +2413,7 @@
             <w:pPr>
               <w:pStyle w:val="Normal"/>
               <w:widowControl/>
+              <w:suppressAutoHyphens w:val="true"/>
               <w:spacing w:lineRule="auto" w:line="240" w:before="0" w:after="0"/>
               <w:ind w:hanging="0"/>
               <w:rPr>
@@ -2361,6 +2442,7 @@
             <w:pPr>
               <w:pStyle w:val="Normal"/>
               <w:widowControl/>
+              <w:suppressAutoHyphens w:val="true"/>
               <w:spacing w:lineRule="auto" w:line="240" w:before="0" w:after="0"/>
               <w:ind w:hanging="0"/>
               <w:rPr>
@@ -2392,6 +2474,7 @@
             <w:pPr>
               <w:pStyle w:val="Normal"/>
               <w:widowControl/>
+              <w:suppressAutoHyphens w:val="true"/>
               <w:spacing w:lineRule="auto" w:line="240" w:before="0" w:after="0"/>
               <w:ind w:hanging="0"/>
               <w:rPr>
@@ -2420,6 +2503,7 @@
             <w:pPr>
               <w:pStyle w:val="Normal"/>
               <w:widowControl/>
+              <w:suppressAutoHyphens w:val="true"/>
               <w:spacing w:lineRule="auto" w:line="240" w:before="0" w:after="0"/>
               <w:ind w:hanging="0"/>
               <w:rPr>
@@ -2448,6 +2532,7 @@
             <w:pPr>
               <w:pStyle w:val="Normal"/>
               <w:widowControl/>
+              <w:suppressAutoHyphens w:val="true"/>
               <w:spacing w:lineRule="auto" w:line="240" w:before="0" w:after="0"/>
               <w:ind w:hanging="0"/>
               <w:rPr>
@@ -2479,6 +2564,7 @@
             <w:pPr>
               <w:pStyle w:val="Normal"/>
               <w:widowControl/>
+              <w:suppressAutoHyphens w:val="true"/>
               <w:spacing w:lineRule="auto" w:line="240" w:before="0" w:after="0"/>
               <w:ind w:hanging="0"/>
               <w:rPr>
@@ -2507,6 +2593,7 @@
             <w:pPr>
               <w:pStyle w:val="Normal"/>
               <w:widowControl/>
+              <w:suppressAutoHyphens w:val="true"/>
               <w:spacing w:lineRule="auto" w:line="240" w:before="0" w:after="0"/>
               <w:ind w:hanging="0"/>
               <w:rPr>
@@ -2535,6 +2622,7 @@
             <w:pPr>
               <w:pStyle w:val="Normal"/>
               <w:widowControl/>
+              <w:suppressAutoHyphens w:val="true"/>
               <w:spacing w:lineRule="auto" w:line="240" w:before="0" w:after="0"/>
               <w:ind w:hanging="0"/>
               <w:rPr>
@@ -2566,6 +2654,7 @@
             <w:pPr>
               <w:pStyle w:val="Normal"/>
               <w:widowControl/>
+              <w:suppressAutoHyphens w:val="true"/>
               <w:spacing w:lineRule="auto" w:line="240" w:before="0" w:after="0"/>
               <w:ind w:hanging="0"/>
               <w:rPr>
@@ -2594,6 +2683,7 @@
             <w:pPr>
               <w:pStyle w:val="Normal"/>
               <w:widowControl/>
+              <w:suppressAutoHyphens w:val="true"/>
               <w:spacing w:lineRule="auto" w:line="240" w:before="0" w:after="0"/>
               <w:ind w:hanging="0"/>
               <w:rPr>
@@ -2622,6 +2712,7 @@
             <w:pPr>
               <w:pStyle w:val="Normal"/>
               <w:widowControl/>
+              <w:suppressAutoHyphens w:val="true"/>
               <w:spacing w:lineRule="auto" w:line="240" w:before="0" w:after="0"/>
               <w:ind w:hanging="0"/>
               <w:rPr>
@@ -2653,6 +2744,7 @@
             <w:pPr>
               <w:pStyle w:val="Normal"/>
               <w:widowControl/>
+              <w:suppressAutoHyphens w:val="true"/>
               <w:spacing w:lineRule="auto" w:line="240" w:before="0" w:after="0"/>
               <w:ind w:hanging="0"/>
               <w:rPr>
@@ -2681,6 +2773,7 @@
             <w:pPr>
               <w:pStyle w:val="Normal"/>
               <w:widowControl/>
+              <w:suppressAutoHyphens w:val="true"/>
               <w:spacing w:lineRule="auto" w:line="240" w:before="0" w:after="0"/>
               <w:ind w:hanging="0"/>
               <w:rPr>
@@ -2709,6 +2802,7 @@
             <w:pPr>
               <w:pStyle w:val="Normal"/>
               <w:widowControl/>
+              <w:suppressAutoHyphens w:val="true"/>
               <w:spacing w:lineRule="auto" w:line="240" w:before="0" w:after="0"/>
               <w:ind w:hanging="0"/>
               <w:rPr>
@@ -2740,6 +2834,7 @@
             <w:pPr>
               <w:pStyle w:val="Normal"/>
               <w:widowControl/>
+              <w:suppressAutoHyphens w:val="true"/>
               <w:spacing w:lineRule="auto" w:line="240" w:before="0" w:after="0"/>
               <w:ind w:hanging="0"/>
               <w:rPr>
@@ -2768,6 +2863,7 @@
             <w:pPr>
               <w:pStyle w:val="Normal"/>
               <w:widowControl/>
+              <w:suppressAutoHyphens w:val="true"/>
               <w:spacing w:lineRule="auto" w:line="240" w:before="0" w:after="0"/>
               <w:ind w:hanging="0"/>
               <w:rPr>
@@ -2796,6 +2892,7 @@
             <w:pPr>
               <w:pStyle w:val="Normal"/>
               <w:widowControl/>
+              <w:suppressAutoHyphens w:val="true"/>
               <w:spacing w:lineRule="auto" w:line="240" w:before="0" w:after="0"/>
               <w:ind w:hanging="0"/>
               <w:rPr>
@@ -2827,6 +2924,7 @@
             <w:pPr>
               <w:pStyle w:val="Normal"/>
               <w:widowControl/>
+              <w:suppressAutoHyphens w:val="true"/>
               <w:spacing w:lineRule="auto" w:line="240" w:before="0" w:after="0"/>
               <w:ind w:hanging="0"/>
               <w:rPr>
@@ -2855,6 +2953,7 @@
             <w:pPr>
               <w:pStyle w:val="Normal"/>
               <w:widowControl/>
+              <w:suppressAutoHyphens w:val="true"/>
               <w:spacing w:lineRule="auto" w:line="240" w:before="0" w:after="0"/>
               <w:ind w:hanging="0"/>
               <w:rPr>
@@ -2883,6 +2982,7 @@
             <w:pPr>
               <w:pStyle w:val="Normal"/>
               <w:widowControl/>
+              <w:suppressAutoHyphens w:val="true"/>
               <w:spacing w:lineRule="auto" w:line="240" w:before="0" w:after="0"/>
               <w:ind w:hanging="0"/>
               <w:rPr>
@@ -2914,6 +3014,7 @@
             <w:pPr>
               <w:pStyle w:val="Normal"/>
               <w:widowControl/>
+              <w:suppressAutoHyphens w:val="true"/>
               <w:spacing w:lineRule="auto" w:line="240" w:before="0" w:after="0"/>
               <w:ind w:hanging="0"/>
               <w:rPr>
@@ -2942,6 +3043,7 @@
             <w:pPr>
               <w:pStyle w:val="Normal"/>
               <w:widowControl/>
+              <w:suppressAutoHyphens w:val="true"/>
               <w:spacing w:lineRule="auto" w:line="240" w:before="0" w:after="0"/>
               <w:ind w:hanging="0"/>
               <w:rPr>
@@ -2970,6 +3072,7 @@
             <w:pPr>
               <w:pStyle w:val="Normal"/>
               <w:widowControl/>
+              <w:suppressAutoHyphens w:val="true"/>
               <w:spacing w:lineRule="auto" w:line="240" w:before="0" w:after="0"/>
               <w:ind w:hanging="0"/>
               <w:rPr>
@@ -3053,6 +3156,7 @@
             <w:pPr>
               <w:pStyle w:val="Normal"/>
               <w:widowControl/>
+              <w:suppressAutoHyphens w:val="true"/>
               <w:spacing w:lineRule="auto" w:line="240" w:before="0" w:after="0"/>
               <w:ind w:hanging="0"/>
               <w:jc w:val="center"/>
@@ -3083,6 +3187,7 @@
             <w:pPr>
               <w:pStyle w:val="Normal"/>
               <w:widowControl/>
+              <w:suppressAutoHyphens w:val="true"/>
               <w:spacing w:lineRule="auto" w:line="240" w:before="0" w:after="0"/>
               <w:ind w:hanging="0"/>
               <w:jc w:val="center"/>
@@ -3113,6 +3218,7 @@
             <w:pPr>
               <w:pStyle w:val="Normal"/>
               <w:widowControl/>
+              <w:suppressAutoHyphens w:val="true"/>
               <w:spacing w:lineRule="auto" w:line="240" w:before="0" w:after="0"/>
               <w:ind w:hanging="0"/>
               <w:jc w:val="center"/>
@@ -3146,6 +3252,7 @@
             <w:pPr>
               <w:pStyle w:val="Normal"/>
               <w:widowControl/>
+              <w:suppressAutoHyphens w:val="true"/>
               <w:spacing w:lineRule="auto" w:line="240" w:before="0" w:after="0"/>
               <w:ind w:hanging="0"/>
               <w:rPr>
@@ -3174,6 +3281,7 @@
             <w:pPr>
               <w:pStyle w:val="Normal"/>
               <w:widowControl/>
+              <w:suppressAutoHyphens w:val="true"/>
               <w:spacing w:lineRule="auto" w:line="240" w:before="0" w:after="0"/>
               <w:ind w:hanging="0"/>
               <w:rPr>
@@ -3202,6 +3310,7 @@
             <w:pPr>
               <w:pStyle w:val="Normal"/>
               <w:widowControl/>
+              <w:suppressAutoHyphens w:val="true"/>
               <w:spacing w:lineRule="auto" w:line="240" w:before="0" w:after="0"/>
               <w:ind w:hanging="0"/>
               <w:rPr>
@@ -3233,6 +3342,7 @@
             <w:pPr>
               <w:pStyle w:val="Normal"/>
               <w:widowControl/>
+              <w:suppressAutoHyphens w:val="true"/>
               <w:spacing w:lineRule="auto" w:line="240" w:before="0" w:after="0"/>
               <w:ind w:hanging="0"/>
               <w:rPr>
@@ -3261,6 +3371,7 @@
             <w:pPr>
               <w:pStyle w:val="Normal"/>
               <w:widowControl/>
+              <w:suppressAutoHyphens w:val="true"/>
               <w:spacing w:lineRule="auto" w:line="240" w:before="0" w:after="0"/>
               <w:ind w:hanging="0"/>
               <w:rPr>
@@ -3289,6 +3400,7 @@
             <w:pPr>
               <w:pStyle w:val="Normal"/>
               <w:widowControl/>
+              <w:suppressAutoHyphens w:val="true"/>
               <w:spacing w:lineRule="auto" w:line="240" w:before="0" w:after="0"/>
               <w:ind w:hanging="0"/>
               <w:rPr>
@@ -3320,6 +3432,7 @@
             <w:pPr>
               <w:pStyle w:val="Normal"/>
               <w:widowControl/>
+              <w:suppressAutoHyphens w:val="true"/>
               <w:spacing w:lineRule="auto" w:line="240" w:before="0" w:after="0"/>
               <w:ind w:hanging="0"/>
               <w:rPr>
@@ -3348,6 +3461,7 @@
             <w:pPr>
               <w:pStyle w:val="Normal"/>
               <w:widowControl/>
+              <w:suppressAutoHyphens w:val="true"/>
               <w:spacing w:lineRule="auto" w:line="240" w:before="0" w:after="0"/>
               <w:ind w:hanging="0"/>
               <w:rPr>
@@ -3376,6 +3490,7 @@
             <w:pPr>
               <w:pStyle w:val="Normal"/>
               <w:widowControl/>
+              <w:suppressAutoHyphens w:val="true"/>
               <w:spacing w:lineRule="auto" w:line="240" w:before="0" w:after="0"/>
               <w:ind w:hanging="0"/>
               <w:rPr>
@@ -3407,6 +3522,7 @@
             <w:pPr>
               <w:pStyle w:val="Normal"/>
               <w:widowControl/>
+              <w:suppressAutoHyphens w:val="true"/>
               <w:spacing w:lineRule="auto" w:line="240" w:before="0" w:after="0"/>
               <w:ind w:hanging="0"/>
               <w:rPr>
@@ -3435,6 +3551,7 @@
             <w:pPr>
               <w:pStyle w:val="Normal"/>
               <w:widowControl/>
+              <w:suppressAutoHyphens w:val="true"/>
               <w:spacing w:lineRule="auto" w:line="240" w:before="0" w:after="0"/>
               <w:ind w:hanging="0"/>
               <w:rPr>
@@ -3463,6 +3580,7 @@
             <w:pPr>
               <w:pStyle w:val="Normal"/>
               <w:widowControl/>
+              <w:suppressAutoHyphens w:val="true"/>
               <w:spacing w:lineRule="auto" w:line="240" w:before="0" w:after="0"/>
               <w:ind w:hanging="0"/>
               <w:rPr>
@@ -3494,6 +3612,7 @@
             <w:pPr>
               <w:pStyle w:val="Normal"/>
               <w:widowControl/>
+              <w:suppressAutoHyphens w:val="true"/>
               <w:spacing w:lineRule="auto" w:line="240" w:before="0" w:after="0"/>
               <w:ind w:hanging="0"/>
               <w:rPr>
@@ -3522,6 +3641,7 @@
             <w:pPr>
               <w:pStyle w:val="Normal"/>
               <w:widowControl/>
+              <w:suppressAutoHyphens w:val="true"/>
               <w:spacing w:lineRule="auto" w:line="240" w:before="0" w:after="0"/>
               <w:ind w:hanging="0"/>
               <w:rPr>
@@ -3550,6 +3670,7 @@
             <w:pPr>
               <w:pStyle w:val="Normal"/>
               <w:widowControl/>
+              <w:suppressAutoHyphens w:val="true"/>
               <w:spacing w:lineRule="auto" w:line="240" w:before="0" w:after="0"/>
               <w:ind w:hanging="0"/>
               <w:rPr>
@@ -3581,6 +3702,7 @@
             <w:pPr>
               <w:pStyle w:val="Normal"/>
               <w:widowControl/>
+              <w:suppressAutoHyphens w:val="true"/>
               <w:spacing w:lineRule="auto" w:line="240" w:before="0" w:after="0"/>
               <w:ind w:hanging="0"/>
               <w:rPr>
@@ -3609,6 +3731,7 @@
             <w:pPr>
               <w:pStyle w:val="Normal"/>
               <w:widowControl/>
+              <w:suppressAutoHyphens w:val="true"/>
               <w:spacing w:lineRule="auto" w:line="240" w:before="0" w:after="0"/>
               <w:ind w:hanging="0"/>
               <w:rPr>
@@ -3637,6 +3760,7 @@
             <w:pPr>
               <w:pStyle w:val="Normal"/>
               <w:widowControl/>
+              <w:suppressAutoHyphens w:val="true"/>
               <w:spacing w:lineRule="auto" w:line="240" w:before="0" w:after="0"/>
               <w:ind w:hanging="0"/>
               <w:rPr>
@@ -3668,6 +3792,7 @@
             <w:pPr>
               <w:pStyle w:val="Normal"/>
               <w:widowControl/>
+              <w:suppressAutoHyphens w:val="true"/>
               <w:spacing w:lineRule="auto" w:line="240" w:before="0" w:after="0"/>
               <w:ind w:hanging="0"/>
               <w:rPr>
@@ -3696,6 +3821,7 @@
             <w:pPr>
               <w:pStyle w:val="Normal"/>
               <w:widowControl/>
+              <w:suppressAutoHyphens w:val="true"/>
               <w:spacing w:lineRule="auto" w:line="240" w:before="0" w:after="0"/>
               <w:ind w:hanging="0"/>
               <w:rPr>
@@ -3724,6 +3850,7 @@
             <w:pPr>
               <w:pStyle w:val="Normal"/>
               <w:widowControl/>
+              <w:suppressAutoHyphens w:val="true"/>
               <w:spacing w:lineRule="auto" w:line="240" w:before="0" w:after="0"/>
               <w:ind w:hanging="0"/>
               <w:rPr>
@@ -3755,6 +3882,7 @@
             <w:pPr>
               <w:pStyle w:val="Normal"/>
               <w:widowControl/>
+              <w:suppressAutoHyphens w:val="true"/>
               <w:spacing w:lineRule="auto" w:line="240" w:before="0" w:after="0"/>
               <w:ind w:hanging="0"/>
               <w:rPr>
@@ -3783,6 +3911,7 @@
             <w:pPr>
               <w:pStyle w:val="Normal"/>
               <w:widowControl/>
+              <w:suppressAutoHyphens w:val="true"/>
               <w:spacing w:lineRule="auto" w:line="240" w:before="0" w:after="0"/>
               <w:ind w:hanging="0"/>
               <w:rPr>
@@ -3811,6 +3940,7 @@
             <w:pPr>
               <w:pStyle w:val="Normal"/>
               <w:widowControl/>
+              <w:suppressAutoHyphens w:val="true"/>
               <w:spacing w:lineRule="auto" w:line="240" w:before="0" w:after="0"/>
               <w:ind w:hanging="0"/>
               <w:rPr>
@@ -3842,6 +3972,7 @@
             <w:pPr>
               <w:pStyle w:val="Normal"/>
               <w:widowControl/>
+              <w:suppressAutoHyphens w:val="true"/>
               <w:spacing w:lineRule="auto" w:line="240" w:before="0" w:after="0"/>
               <w:ind w:hanging="0"/>
               <w:rPr>
@@ -3870,6 +4001,7 @@
             <w:pPr>
               <w:pStyle w:val="Normal"/>
               <w:widowControl/>
+              <w:suppressAutoHyphens w:val="true"/>
               <w:spacing w:lineRule="auto" w:line="240" w:before="0" w:after="0"/>
               <w:ind w:hanging="0"/>
               <w:rPr>
@@ -3898,6 +4030,7 @@
             <w:pPr>
               <w:pStyle w:val="Normal"/>
               <w:widowControl/>
+              <w:suppressAutoHyphens w:val="true"/>
               <w:spacing w:lineRule="auto" w:line="240" w:before="0" w:after="0"/>
               <w:ind w:hanging="0"/>
               <w:rPr>
@@ -4036,6 +4169,7 @@
     <w:p>
       <w:pPr>
         <w:pStyle w:val="Heading1"/>
+        <w:spacing w:before="0" w:after="240"/>
         <w:rPr/>
       </w:pPr>
       <w:r>
@@ -4131,6 +4265,7 @@
             <w:pPr>
               <w:pStyle w:val="Normal"/>
               <w:widowControl/>
+              <w:suppressAutoHyphens w:val="true"/>
               <w:spacing w:lineRule="auto" w:line="240" w:before="0" w:after="0"/>
               <w:ind w:hanging="0"/>
               <w:jc w:val="center"/>
@@ -4161,6 +4296,7 @@
             <w:pPr>
               <w:pStyle w:val="Normal"/>
               <w:widowControl/>
+              <w:suppressAutoHyphens w:val="true"/>
               <w:spacing w:lineRule="auto" w:line="240" w:before="0" w:after="0"/>
               <w:ind w:hanging="0"/>
               <w:jc w:val="center"/>
@@ -4191,6 +4327,7 @@
             <w:pPr>
               <w:pStyle w:val="Normal"/>
               <w:widowControl/>
+              <w:suppressAutoHyphens w:val="true"/>
               <w:spacing w:lineRule="auto" w:line="240" w:before="0" w:after="0"/>
               <w:ind w:hanging="0"/>
               <w:jc w:val="center"/>
@@ -4221,6 +4358,7 @@
             <w:pPr>
               <w:pStyle w:val="Normal"/>
               <w:widowControl/>
+              <w:suppressAutoHyphens w:val="true"/>
               <w:spacing w:lineRule="auto" w:line="240" w:before="0" w:after="0"/>
               <w:ind w:hanging="0"/>
               <w:jc w:val="center"/>
@@ -4251,6 +4389,7 @@
             <w:pPr>
               <w:pStyle w:val="Normal"/>
               <w:widowControl/>
+              <w:suppressAutoHyphens w:val="true"/>
               <w:spacing w:lineRule="auto" w:line="240" w:before="0" w:after="0"/>
               <w:ind w:hanging="0"/>
               <w:jc w:val="center"/>
@@ -4284,6 +4423,7 @@
             <w:pPr>
               <w:pStyle w:val="Normal"/>
               <w:widowControl/>
+              <w:suppressAutoHyphens w:val="true"/>
               <w:spacing w:lineRule="auto" w:line="240" w:before="0" w:after="0"/>
               <w:ind w:hanging="0"/>
               <w:rPr>
@@ -4312,6 +4452,7 @@
             <w:pPr>
               <w:pStyle w:val="Normal"/>
               <w:widowControl/>
+              <w:suppressAutoHyphens w:val="true"/>
               <w:spacing w:lineRule="auto" w:line="240" w:before="0" w:after="0"/>
               <w:ind w:hanging="0"/>
               <w:rPr>
@@ -4340,6 +4481,7 @@
             <w:pPr>
               <w:pStyle w:val="Normal"/>
               <w:widowControl/>
+              <w:suppressAutoHyphens w:val="true"/>
               <w:spacing w:lineRule="auto" w:line="240" w:before="0" w:after="0"/>
               <w:ind w:hanging="0"/>
               <w:rPr>
@@ -4368,6 +4510,7 @@
             <w:pPr>
               <w:pStyle w:val="Normal"/>
               <w:widowControl/>
+              <w:suppressAutoHyphens w:val="true"/>
               <w:spacing w:lineRule="auto" w:line="240" w:before="0" w:after="0"/>
               <w:ind w:hanging="0"/>
               <w:rPr>
@@ -4396,6 +4539,7 @@
             <w:pPr>
               <w:pStyle w:val="Normal"/>
               <w:widowControl/>
+              <w:suppressAutoHyphens w:val="true"/>
               <w:spacing w:lineRule="auto" w:line="240" w:before="0" w:after="0"/>
               <w:ind w:hanging="0"/>
               <w:rPr>
@@ -4427,6 +4571,7 @@
             <w:pPr>
               <w:pStyle w:val="Normal"/>
               <w:widowControl/>
+              <w:suppressAutoHyphens w:val="true"/>
               <w:spacing w:lineRule="auto" w:line="240" w:before="0" w:after="0"/>
               <w:ind w:hanging="0"/>
               <w:rPr>
@@ -4455,6 +4600,7 @@
             <w:pPr>
               <w:pStyle w:val="Normal"/>
               <w:widowControl/>
+              <w:suppressAutoHyphens w:val="true"/>
               <w:spacing w:lineRule="auto" w:line="240" w:before="0" w:after="0"/>
               <w:ind w:hanging="0"/>
               <w:rPr>
@@ -4483,6 +4629,7 @@
             <w:pPr>
               <w:pStyle w:val="Normal"/>
               <w:widowControl/>
+              <w:suppressAutoHyphens w:val="true"/>
               <w:spacing w:lineRule="auto" w:line="240" w:before="0" w:after="0"/>
               <w:ind w:hanging="0"/>
               <w:rPr>
@@ -4511,6 +4658,7 @@
             <w:pPr>
               <w:pStyle w:val="Normal"/>
               <w:widowControl/>
+              <w:suppressAutoHyphens w:val="true"/>
               <w:spacing w:lineRule="auto" w:line="240" w:before="0" w:after="0"/>
               <w:ind w:hanging="0"/>
               <w:rPr>
@@ -4539,6 +4687,7 @@
             <w:pPr>
               <w:pStyle w:val="Normal"/>
               <w:widowControl/>
+              <w:suppressAutoHyphens w:val="true"/>
               <w:spacing w:lineRule="auto" w:line="240" w:before="0" w:after="0"/>
               <w:ind w:hanging="0"/>
               <w:rPr>
@@ -4570,6 +4719,7 @@
             <w:pPr>
               <w:pStyle w:val="Normal"/>
               <w:widowControl/>
+              <w:suppressAutoHyphens w:val="true"/>
               <w:spacing w:lineRule="auto" w:line="240" w:before="0" w:after="0"/>
               <w:ind w:hanging="0"/>
               <w:rPr>
@@ -4598,6 +4748,7 @@
             <w:pPr>
               <w:pStyle w:val="Normal"/>
               <w:widowControl/>
+              <w:suppressAutoHyphens w:val="true"/>
               <w:spacing w:lineRule="auto" w:line="240" w:before="0" w:after="0"/>
               <w:ind w:hanging="0"/>
               <w:rPr>
@@ -4626,6 +4777,7 @@
             <w:pPr>
               <w:pStyle w:val="Normal"/>
               <w:widowControl/>
+              <w:suppressAutoHyphens w:val="true"/>
               <w:spacing w:lineRule="auto" w:line="240" w:before="0" w:after="0"/>
               <w:ind w:hanging="0"/>
               <w:rPr>
@@ -4654,6 +4806,7 @@
             <w:pPr>
               <w:pStyle w:val="Normal"/>
               <w:widowControl/>
+              <w:suppressAutoHyphens w:val="true"/>
               <w:spacing w:lineRule="auto" w:line="240" w:before="0" w:after="0"/>
               <w:ind w:hanging="0"/>
               <w:rPr>
@@ -4682,6 +4835,7 @@
             <w:pPr>
               <w:pStyle w:val="Normal"/>
               <w:widowControl/>
+              <w:suppressAutoHyphens w:val="true"/>
               <w:spacing w:lineRule="auto" w:line="240" w:before="0" w:after="0"/>
               <w:ind w:hanging="0"/>
               <w:rPr>
@@ -4713,6 +4867,7 @@
             <w:pPr>
               <w:pStyle w:val="Normal"/>
               <w:widowControl/>
+              <w:suppressAutoHyphens w:val="true"/>
               <w:spacing w:lineRule="auto" w:line="240" w:before="0" w:after="0"/>
               <w:ind w:hanging="0"/>
               <w:rPr>
@@ -4741,6 +4896,7 @@
             <w:pPr>
               <w:pStyle w:val="Normal"/>
               <w:widowControl/>
+              <w:suppressAutoHyphens w:val="true"/>
               <w:spacing w:lineRule="auto" w:line="240" w:before="0" w:after="0"/>
               <w:ind w:hanging="0"/>
               <w:rPr>
@@ -4769,6 +4925,7 @@
             <w:pPr>
               <w:pStyle w:val="Normal"/>
               <w:widowControl/>
+              <w:suppressAutoHyphens w:val="true"/>
               <w:spacing w:lineRule="auto" w:line="240" w:before="0" w:after="0"/>
               <w:ind w:hanging="0"/>
               <w:rPr>
@@ -4797,6 +4954,7 @@
             <w:pPr>
               <w:pStyle w:val="Normal"/>
               <w:widowControl/>
+              <w:suppressAutoHyphens w:val="true"/>
               <w:spacing w:lineRule="auto" w:line="240" w:before="0" w:after="0"/>
               <w:ind w:hanging="0"/>
               <w:rPr>
@@ -4825,6 +4983,7 @@
             <w:pPr>
               <w:pStyle w:val="Normal"/>
               <w:widowControl/>
+              <w:suppressAutoHyphens w:val="true"/>
               <w:spacing w:lineRule="auto" w:line="240" w:before="0" w:after="0"/>
               <w:ind w:hanging="0"/>
               <w:rPr>
@@ -4856,6 +5015,7 @@
             <w:pPr>
               <w:pStyle w:val="Normal"/>
               <w:widowControl/>
+              <w:suppressAutoHyphens w:val="true"/>
               <w:spacing w:lineRule="auto" w:line="240" w:before="0" w:after="0"/>
               <w:ind w:hanging="0"/>
               <w:rPr>
@@ -4884,6 +5044,7 @@
             <w:pPr>
               <w:pStyle w:val="Normal"/>
               <w:widowControl/>
+              <w:suppressAutoHyphens w:val="true"/>
               <w:spacing w:lineRule="auto" w:line="240" w:before="0" w:after="0"/>
               <w:ind w:hanging="0"/>
               <w:rPr>
@@ -4912,6 +5073,7 @@
             <w:pPr>
               <w:pStyle w:val="Normal"/>
               <w:widowControl/>
+              <w:suppressAutoHyphens w:val="true"/>
               <w:spacing w:lineRule="auto" w:line="240" w:before="0" w:after="0"/>
               <w:ind w:hanging="0"/>
               <w:rPr>
@@ -4940,6 +5102,7 @@
             <w:pPr>
               <w:pStyle w:val="Normal"/>
               <w:widowControl/>
+              <w:suppressAutoHyphens w:val="true"/>
               <w:spacing w:lineRule="auto" w:line="240" w:before="0" w:after="0"/>
               <w:ind w:hanging="0"/>
               <w:rPr>
@@ -4968,6 +5131,7 @@
             <w:pPr>
               <w:pStyle w:val="Normal"/>
               <w:widowControl/>
+              <w:suppressAutoHyphens w:val="true"/>
               <w:spacing w:lineRule="auto" w:line="240" w:before="0" w:after="0"/>
               <w:ind w:hanging="0"/>
               <w:rPr>
@@ -4999,6 +5163,7 @@
             <w:pPr>
               <w:pStyle w:val="Normal"/>
               <w:widowControl/>
+              <w:suppressAutoHyphens w:val="true"/>
               <w:spacing w:lineRule="auto" w:line="240" w:before="0" w:after="0"/>
               <w:ind w:hanging="0"/>
               <w:rPr>
@@ -5027,6 +5192,7 @@
             <w:pPr>
               <w:pStyle w:val="Normal"/>
               <w:widowControl/>
+              <w:suppressAutoHyphens w:val="true"/>
               <w:spacing w:lineRule="auto" w:line="240" w:before="0" w:after="0"/>
               <w:ind w:hanging="0"/>
               <w:rPr>
@@ -5055,6 +5221,7 @@
             <w:pPr>
               <w:pStyle w:val="Normal"/>
               <w:widowControl/>
+              <w:suppressAutoHyphens w:val="true"/>
               <w:spacing w:lineRule="auto" w:line="240" w:before="0" w:after="0"/>
               <w:ind w:hanging="0"/>
               <w:rPr>
@@ -5083,6 +5250,7 @@
             <w:pPr>
               <w:pStyle w:val="Normal"/>
               <w:widowControl/>
+              <w:suppressAutoHyphens w:val="true"/>
               <w:spacing w:lineRule="auto" w:line="240" w:before="0" w:after="0"/>
               <w:ind w:hanging="0"/>
               <w:rPr>
@@ -5111,6 +5279,7 @@
             <w:pPr>
               <w:pStyle w:val="Normal"/>
               <w:widowControl/>
+              <w:suppressAutoHyphens w:val="true"/>
               <w:spacing w:lineRule="auto" w:line="240" w:before="0" w:after="0"/>
               <w:ind w:hanging="0"/>
               <w:rPr>
@@ -5142,6 +5311,7 @@
             <w:pPr>
               <w:pStyle w:val="Normal"/>
               <w:widowControl/>
+              <w:suppressAutoHyphens w:val="true"/>
               <w:spacing w:lineRule="auto" w:line="240" w:before="0" w:after="0"/>
               <w:ind w:hanging="0"/>
               <w:rPr>
@@ -5170,6 +5340,7 @@
             <w:pPr>
               <w:pStyle w:val="Normal"/>
               <w:widowControl/>
+              <w:suppressAutoHyphens w:val="true"/>
               <w:spacing w:lineRule="auto" w:line="240" w:before="0" w:after="0"/>
               <w:ind w:hanging="0"/>
               <w:rPr>
@@ -5198,6 +5369,7 @@
             <w:pPr>
               <w:pStyle w:val="Normal"/>
               <w:widowControl/>
+              <w:suppressAutoHyphens w:val="true"/>
               <w:spacing w:lineRule="auto" w:line="240" w:before="0" w:after="0"/>
               <w:ind w:hanging="0"/>
               <w:rPr>
@@ -5226,6 +5398,7 @@
             <w:pPr>
               <w:pStyle w:val="Normal"/>
               <w:widowControl/>
+              <w:suppressAutoHyphens w:val="true"/>
               <w:spacing w:lineRule="auto" w:line="240" w:before="0" w:after="0"/>
               <w:ind w:hanging="0"/>
               <w:rPr>
@@ -5254,6 +5427,7 @@
             <w:pPr>
               <w:pStyle w:val="Normal"/>
               <w:widowControl/>
+              <w:suppressAutoHyphens w:val="true"/>
               <w:spacing w:lineRule="auto" w:line="240" w:before="0" w:after="0"/>
               <w:ind w:hanging="0"/>
               <w:rPr>
@@ -5527,6 +5701,7 @@
     <w:p>
       <w:pPr>
         <w:pStyle w:val="Heading1"/>
+        <w:spacing w:before="0" w:after="240"/>
         <w:rPr/>
       </w:pPr>
       <w:r>
@@ -5630,8 +5805,8 @@
       </w:tblPr>
       <w:tblGrid>
         <w:gridCol w:w="2437"/>
-        <w:gridCol w:w="4219"/>
-        <w:gridCol w:w="2700"/>
+        <w:gridCol w:w="4218"/>
+        <w:gridCol w:w="2701"/>
       </w:tblGrid>
       <w:tr>
         <w:trPr/>
@@ -5644,6 +5819,7 @@
             <w:pPr>
               <w:pStyle w:val="Normal"/>
               <w:widowControl/>
+              <w:suppressAutoHyphens w:val="true"/>
               <w:spacing w:lineRule="auto" w:line="240" w:before="0" w:after="0"/>
               <w:ind w:hanging="0"/>
               <w:jc w:val="center"/>
@@ -5667,13 +5843,14 @@
         </w:tc>
         <w:tc>
           <w:tcPr>
-            <w:tcW w:w="4219" w:type="dxa"/>
+            <w:tcW w:w="4218" w:type="dxa"/>
             <w:tcBorders/>
           </w:tcPr>
           <w:p>
             <w:pPr>
               <w:pStyle w:val="Normal"/>
               <w:widowControl/>
+              <w:suppressAutoHyphens w:val="true"/>
               <w:spacing w:lineRule="auto" w:line="240" w:before="0" w:after="0"/>
               <w:ind w:hanging="0"/>
               <w:jc w:val="center"/>
@@ -5697,13 +5874,14 @@
         </w:tc>
         <w:tc>
           <w:tcPr>
-            <w:tcW w:w="2700" w:type="dxa"/>
+            <w:tcW w:w="2701" w:type="dxa"/>
             <w:tcBorders/>
           </w:tcPr>
           <w:p>
             <w:pPr>
               <w:pStyle w:val="Normal"/>
               <w:widowControl/>
+              <w:suppressAutoHyphens w:val="true"/>
               <w:spacing w:lineRule="auto" w:line="240" w:before="0" w:after="0"/>
               <w:ind w:hanging="0"/>
               <w:jc w:val="center"/>
@@ -5737,6 +5915,7 @@
             <w:pPr>
               <w:pStyle w:val="Normal"/>
               <w:widowControl/>
+              <w:suppressAutoHyphens w:val="true"/>
               <w:spacing w:lineRule="auto" w:line="240" w:before="0" w:after="0"/>
               <w:ind w:hanging="0"/>
               <w:rPr>
@@ -5758,13 +5937,14 @@
         </w:tc>
         <w:tc>
           <w:tcPr>
-            <w:tcW w:w="4219" w:type="dxa"/>
+            <w:tcW w:w="4218" w:type="dxa"/>
             <w:tcBorders/>
           </w:tcPr>
           <w:p>
             <w:pPr>
               <w:pStyle w:val="Normal"/>
               <w:widowControl/>
+              <w:suppressAutoHyphens w:val="true"/>
               <w:spacing w:lineRule="auto" w:line="240" w:before="0" w:after="0"/>
               <w:ind w:hanging="0"/>
               <w:rPr>
@@ -5786,13 +5966,14 @@
         </w:tc>
         <w:tc>
           <w:tcPr>
-            <w:tcW w:w="2700" w:type="dxa"/>
+            <w:tcW w:w="2701" w:type="dxa"/>
             <w:tcBorders/>
           </w:tcPr>
           <w:p>
             <w:pPr>
               <w:pStyle w:val="Normal"/>
               <w:widowControl/>
+              <w:suppressAutoHyphens w:val="true"/>
               <w:spacing w:lineRule="auto" w:line="240" w:before="0" w:after="0"/>
               <w:ind w:hanging="0"/>
               <w:rPr>
@@ -5824,6 +6005,7 @@
             <w:pPr>
               <w:pStyle w:val="Normal"/>
               <w:widowControl/>
+              <w:suppressAutoHyphens w:val="true"/>
               <w:spacing w:lineRule="auto" w:line="240" w:before="0" w:after="0"/>
               <w:ind w:hanging="0"/>
               <w:rPr>
@@ -5845,13 +6027,14 @@
         </w:tc>
         <w:tc>
           <w:tcPr>
-            <w:tcW w:w="4219" w:type="dxa"/>
+            <w:tcW w:w="4218" w:type="dxa"/>
             <w:tcBorders/>
           </w:tcPr>
           <w:p>
             <w:pPr>
               <w:pStyle w:val="Normal"/>
               <w:widowControl/>
+              <w:suppressAutoHyphens w:val="true"/>
               <w:spacing w:lineRule="auto" w:line="240" w:before="0" w:after="0"/>
               <w:ind w:hanging="0"/>
               <w:rPr>
@@ -5873,13 +6056,14 @@
         </w:tc>
         <w:tc>
           <w:tcPr>
-            <w:tcW w:w="2700" w:type="dxa"/>
+            <w:tcW w:w="2701" w:type="dxa"/>
             <w:tcBorders/>
           </w:tcPr>
           <w:p>
             <w:pPr>
               <w:pStyle w:val="Normal"/>
               <w:widowControl/>
+              <w:suppressAutoHyphens w:val="true"/>
               <w:spacing w:lineRule="auto" w:line="240" w:before="0" w:after="0"/>
               <w:ind w:hanging="0"/>
               <w:rPr>
@@ -5911,6 +6095,7 @@
             <w:pPr>
               <w:pStyle w:val="Normal"/>
               <w:widowControl/>
+              <w:suppressAutoHyphens w:val="true"/>
               <w:spacing w:lineRule="auto" w:line="240" w:before="0" w:after="0"/>
               <w:ind w:hanging="0"/>
               <w:rPr>
@@ -5932,13 +6117,14 @@
         </w:tc>
         <w:tc>
           <w:tcPr>
-            <w:tcW w:w="4219" w:type="dxa"/>
+            <w:tcW w:w="4218" w:type="dxa"/>
             <w:tcBorders/>
           </w:tcPr>
           <w:p>
             <w:pPr>
               <w:pStyle w:val="Normal"/>
               <w:widowControl/>
+              <w:suppressAutoHyphens w:val="true"/>
               <w:spacing w:lineRule="auto" w:line="240" w:before="0" w:after="0"/>
               <w:ind w:hanging="0"/>
               <w:rPr>
@@ -5960,13 +6146,14 @@
         </w:tc>
         <w:tc>
           <w:tcPr>
-            <w:tcW w:w="2700" w:type="dxa"/>
+            <w:tcW w:w="2701" w:type="dxa"/>
             <w:tcBorders/>
           </w:tcPr>
           <w:p>
             <w:pPr>
               <w:pStyle w:val="Normal"/>
               <w:widowControl/>
+              <w:suppressAutoHyphens w:val="true"/>
               <w:spacing w:lineRule="auto" w:line="240" w:before="0" w:after="0"/>
               <w:ind w:hanging="0"/>
               <w:rPr>
@@ -5998,6 +6185,7 @@
             <w:pPr>
               <w:pStyle w:val="Normal"/>
               <w:widowControl/>
+              <w:suppressAutoHyphens w:val="true"/>
               <w:spacing w:lineRule="auto" w:line="240" w:before="0" w:after="0"/>
               <w:ind w:hanging="0"/>
               <w:rPr>
@@ -6019,13 +6207,14 @@
         </w:tc>
         <w:tc>
           <w:tcPr>
-            <w:tcW w:w="4219" w:type="dxa"/>
+            <w:tcW w:w="4218" w:type="dxa"/>
             <w:tcBorders/>
           </w:tcPr>
           <w:p>
             <w:pPr>
               <w:pStyle w:val="Normal"/>
               <w:widowControl/>
+              <w:suppressAutoHyphens w:val="true"/>
               <w:spacing w:lineRule="auto" w:line="240" w:before="0" w:after="0"/>
               <w:ind w:hanging="0"/>
               <w:rPr>
@@ -6047,13 +6236,14 @@
         </w:tc>
         <w:tc>
           <w:tcPr>
-            <w:tcW w:w="2700" w:type="dxa"/>
+            <w:tcW w:w="2701" w:type="dxa"/>
             <w:tcBorders/>
           </w:tcPr>
           <w:p>
             <w:pPr>
               <w:pStyle w:val="Normal"/>
               <w:widowControl/>
+              <w:suppressAutoHyphens w:val="true"/>
               <w:spacing w:lineRule="auto" w:line="240" w:before="0" w:after="0"/>
               <w:ind w:hanging="0"/>
               <w:rPr>
@@ -6085,6 +6275,7 @@
             <w:pPr>
               <w:pStyle w:val="Normal"/>
               <w:widowControl/>
+              <w:suppressAutoHyphens w:val="true"/>
               <w:spacing w:lineRule="auto" w:line="240" w:before="0" w:after="0"/>
               <w:ind w:hanging="0"/>
               <w:rPr>
@@ -6106,13 +6297,14 @@
         </w:tc>
         <w:tc>
           <w:tcPr>
-            <w:tcW w:w="4219" w:type="dxa"/>
+            <w:tcW w:w="4218" w:type="dxa"/>
             <w:tcBorders/>
           </w:tcPr>
           <w:p>
             <w:pPr>
               <w:pStyle w:val="Normal"/>
               <w:widowControl/>
+              <w:suppressAutoHyphens w:val="true"/>
               <w:spacing w:lineRule="auto" w:line="240" w:before="0" w:after="0"/>
               <w:ind w:hanging="0"/>
               <w:rPr>
@@ -6134,13 +6326,14 @@
         </w:tc>
         <w:tc>
           <w:tcPr>
-            <w:tcW w:w="2700" w:type="dxa"/>
+            <w:tcW w:w="2701" w:type="dxa"/>
             <w:tcBorders/>
           </w:tcPr>
           <w:p>
             <w:pPr>
               <w:pStyle w:val="Normal"/>
               <w:widowControl/>
+              <w:suppressAutoHyphens w:val="true"/>
               <w:spacing w:lineRule="auto" w:line="240" w:before="0" w:after="0"/>
               <w:ind w:hanging="0"/>
               <w:rPr>
@@ -6172,6 +6365,7 @@
             <w:pPr>
               <w:pStyle w:val="Normal"/>
               <w:widowControl/>
+              <w:suppressAutoHyphens w:val="true"/>
               <w:spacing w:lineRule="auto" w:line="240" w:before="0" w:after="0"/>
               <w:ind w:hanging="0"/>
               <w:rPr>
@@ -6193,13 +6387,14 @@
         </w:tc>
         <w:tc>
           <w:tcPr>
-            <w:tcW w:w="4219" w:type="dxa"/>
+            <w:tcW w:w="4218" w:type="dxa"/>
             <w:tcBorders/>
           </w:tcPr>
           <w:p>
             <w:pPr>
               <w:pStyle w:val="Normal"/>
               <w:widowControl/>
+              <w:suppressAutoHyphens w:val="true"/>
               <w:spacing w:lineRule="auto" w:line="240" w:before="0" w:after="0"/>
               <w:ind w:hanging="0"/>
               <w:rPr>
@@ -6221,13 +6416,14 @@
         </w:tc>
         <w:tc>
           <w:tcPr>
-            <w:tcW w:w="2700" w:type="dxa"/>
+            <w:tcW w:w="2701" w:type="dxa"/>
             <w:tcBorders/>
           </w:tcPr>
           <w:p>
             <w:pPr>
               <w:pStyle w:val="Normal"/>
               <w:widowControl/>
+              <w:suppressAutoHyphens w:val="true"/>
               <w:spacing w:lineRule="auto" w:line="240" w:before="0" w:after="0"/>
               <w:ind w:hanging="0"/>
               <w:rPr>
@@ -6312,6 +6508,7 @@
             <w:pPr>
               <w:pStyle w:val="Normal"/>
               <w:widowControl/>
+              <w:suppressAutoHyphens w:val="true"/>
               <w:spacing w:lineRule="auto" w:line="240" w:before="0" w:after="0"/>
               <w:ind w:hanging="0"/>
               <w:jc w:val="center"/>
@@ -6342,6 +6539,7 @@
             <w:pPr>
               <w:pStyle w:val="Normal"/>
               <w:widowControl/>
+              <w:suppressAutoHyphens w:val="true"/>
               <w:spacing w:lineRule="auto" w:line="240" w:before="0" w:after="0"/>
               <w:ind w:hanging="0"/>
               <w:jc w:val="center"/>
@@ -6375,6 +6573,7 @@
             <w:pPr>
               <w:pStyle w:val="Normal"/>
               <w:widowControl/>
+              <w:suppressAutoHyphens w:val="true"/>
               <w:spacing w:lineRule="auto" w:line="240" w:before="0" w:after="0"/>
               <w:ind w:hanging="0"/>
               <w:rPr>
@@ -6403,6 +6602,7 @@
             <w:pPr>
               <w:pStyle w:val="Normal"/>
               <w:widowControl/>
+              <w:suppressAutoHyphens w:val="true"/>
               <w:spacing w:lineRule="auto" w:line="240" w:before="0" w:after="0"/>
               <w:ind w:hanging="0"/>
               <w:rPr>
@@ -6434,6 +6634,7 @@
             <w:pPr>
               <w:pStyle w:val="Normal"/>
               <w:widowControl/>
+              <w:suppressAutoHyphens w:val="true"/>
               <w:spacing w:lineRule="auto" w:line="240" w:before="0" w:after="0"/>
               <w:ind w:hanging="0"/>
               <w:rPr>
@@ -6462,6 +6663,7 @@
             <w:pPr>
               <w:pStyle w:val="Normal"/>
               <w:widowControl/>
+              <w:suppressAutoHyphens w:val="true"/>
               <w:spacing w:lineRule="auto" w:line="240" w:before="0" w:after="0"/>
               <w:ind w:hanging="0"/>
               <w:rPr>
@@ -6493,6 +6695,7 @@
             <w:pPr>
               <w:pStyle w:val="Normal"/>
               <w:widowControl/>
+              <w:suppressAutoHyphens w:val="true"/>
               <w:spacing w:lineRule="auto" w:line="240" w:before="0" w:after="0"/>
               <w:ind w:hanging="0"/>
               <w:rPr>
@@ -6521,6 +6724,7 @@
             <w:pPr>
               <w:pStyle w:val="Normal"/>
               <w:widowControl/>
+              <w:suppressAutoHyphens w:val="true"/>
               <w:spacing w:lineRule="auto" w:line="240" w:before="0" w:after="0"/>
               <w:ind w:hanging="0"/>
               <w:rPr>
@@ -6552,6 +6756,7 @@
             <w:pPr>
               <w:pStyle w:val="Normal"/>
               <w:widowControl/>
+              <w:suppressAutoHyphens w:val="true"/>
               <w:spacing w:lineRule="auto" w:line="240" w:before="0" w:after="0"/>
               <w:ind w:hanging="0"/>
               <w:rPr>
@@ -6580,6 +6785,7 @@
             <w:pPr>
               <w:pStyle w:val="Normal"/>
               <w:widowControl/>
+              <w:suppressAutoHyphens w:val="true"/>
               <w:spacing w:lineRule="auto" w:line="240" w:before="0" w:after="0"/>
               <w:ind w:hanging="0"/>
               <w:rPr>
@@ -6611,6 +6817,7 @@
             <w:pPr>
               <w:pStyle w:val="Normal"/>
               <w:widowControl/>
+              <w:suppressAutoHyphens w:val="true"/>
               <w:spacing w:lineRule="auto" w:line="240" w:before="0" w:after="0"/>
               <w:ind w:hanging="0"/>
               <w:rPr>
@@ -6639,6 +6846,7 @@
             <w:pPr>
               <w:pStyle w:val="Normal"/>
               <w:widowControl/>
+              <w:suppressAutoHyphens w:val="true"/>
               <w:spacing w:lineRule="auto" w:line="240" w:before="0" w:after="0"/>
               <w:ind w:hanging="0"/>
               <w:rPr>
@@ -6670,6 +6878,7 @@
             <w:pPr>
               <w:pStyle w:val="Normal"/>
               <w:widowControl/>
+              <w:suppressAutoHyphens w:val="true"/>
               <w:spacing w:lineRule="auto" w:line="240" w:before="0" w:after="0"/>
               <w:ind w:hanging="0"/>
               <w:rPr>
@@ -6698,6 +6907,7 @@
             <w:pPr>
               <w:pStyle w:val="Normal"/>
               <w:widowControl/>
+              <w:suppressAutoHyphens w:val="true"/>
               <w:spacing w:lineRule="auto" w:line="240" w:before="0" w:after="0"/>
               <w:ind w:hanging="0"/>
               <w:rPr>
@@ -6729,6 +6939,7 @@
             <w:pPr>
               <w:pStyle w:val="Normal"/>
               <w:widowControl/>
+              <w:suppressAutoHyphens w:val="true"/>
               <w:spacing w:lineRule="auto" w:line="240" w:before="0" w:after="0"/>
               <w:ind w:hanging="0"/>
               <w:rPr>
@@ -6757,6 +6968,7 @@
             <w:pPr>
               <w:pStyle w:val="Normal"/>
               <w:widowControl/>
+              <w:suppressAutoHyphens w:val="true"/>
               <w:spacing w:lineRule="auto" w:line="240" w:before="0" w:after="0"/>
               <w:ind w:hanging="0"/>
               <w:rPr>
@@ -6936,6 +7148,7 @@
     <w:p>
       <w:pPr>
         <w:pStyle w:val="Heading1"/>
+        <w:spacing w:before="0" w:after="240"/>
         <w:rPr/>
       </w:pPr>
       <w:r>
@@ -6985,7 +7198,7 @@
     <w:p>
       <w:pPr>
         <w:pStyle w:val="Heading1"/>
-        <w:spacing w:before="240" w:after="0"/>
+        <w:spacing w:before="0" w:after="0"/>
         <w:ind w:hanging="0"/>
         <w:jc w:val="center"/>
         <w:rPr/>
@@ -7493,7 +7706,7 @@
     <w:p>
       <w:pPr>
         <w:pStyle w:val="Heading1"/>
-        <w:spacing w:before="240" w:after="0"/>
+        <w:spacing w:before="0" w:after="0"/>
         <w:ind w:hanging="0"/>
         <w:jc w:val="center"/>
         <w:rPr/>
@@ -10168,6 +10381,7 @@
     <w:p>
       <w:pPr>
         <w:pStyle w:val="Heading1"/>
+        <w:spacing w:before="0" w:after="240"/>
         <w:rPr/>
       </w:pPr>
       <w:r>
@@ -10805,7 +11019,7 @@
     </w:r>
     <w:r>
       <w:rPr/>
-      <w:t>21</w:t>
+      <w:t>34</w:t>
     </w:r>
     <w:r>
       <w:rPr/>
@@ -10819,11 +11033,17 @@
 <w:ftr xmlns:o="urn:schemas-microsoft-com:office:office" xmlns:r="http://schemas.openxmlformats.org/officeDocument/2006/relationships" xmlns:v="urn:schemas-microsoft-com:vml" xmlns:w="http://schemas.openxmlformats.org/wordprocessingml/2006/main" xmlns:w10="urn:schemas-microsoft-com:office:word" xmlns:wp="http://schemas.openxmlformats.org/drawingml/2006/wordprocessingDrawing" xmlns:wps="http://schemas.microsoft.com/office/word/2010/wordprocessingShape" xmlns:wpg="http://schemas.microsoft.com/office/word/2010/wordprocessingGroup" xmlns:mc="http://schemas.openxmlformats.org/markup-compatibility/2006" xmlns:wp14="http://schemas.microsoft.com/office/word/2010/wordprocessingDrawing" xmlns:w14="http://schemas.microsoft.com/office/word/2010/wordml" xmlns:w15="http://schemas.microsoft.com/office/word/2012/wordml" mc:Ignorable="w14 wp14 w15">
   <w:p>
     <w:pPr>
-      <w:pStyle w:val="Footer"/>
+      <w:pStyle w:val="Normal"/>
+      <w:spacing w:before="960" w:after="0"/>
+      <w:ind w:hanging="0"/>
+      <w:jc w:val="center"/>
       <w:rPr/>
     </w:pPr>
     <w:r>
       <w:rPr/>
+      <w:t>Великий Новгород</w:t>
+      <w:br/>
+      <w:t>2026</w:t>
     </w:r>
   </w:p>
 </w:ftr>
@@ -10858,6 +11078,7 @@
         </w:tabs>
         <w:ind w:left="1080" w:hanging="360"/>
       </w:pPr>
+      <w:rPr/>
     </w:lvl>
     <w:lvl w:ilvl="2">
       <w:start w:val="1"/>
@@ -10870,6 +11091,7 @@
         </w:tabs>
         <w:ind w:left="1440" w:hanging="360"/>
       </w:pPr>
+      <w:rPr/>
     </w:lvl>
     <w:lvl w:ilvl="3">
       <w:start w:val="1"/>
@@ -10882,6 +11104,7 @@
         </w:tabs>
         <w:ind w:left="1800" w:hanging="360"/>
       </w:pPr>
+      <w:rPr/>
     </w:lvl>
     <w:lvl w:ilvl="4">
       <w:start w:val="1"/>
@@ -10894,6 +11117,7 @@
         </w:tabs>
         <w:ind w:left="2160" w:hanging="360"/>
       </w:pPr>
+      <w:rPr/>
     </w:lvl>
     <w:lvl w:ilvl="5">
       <w:start w:val="1"/>
@@ -10906,6 +11130,7 @@
         </w:tabs>
         <w:ind w:left="2520" w:hanging="360"/>
       </w:pPr>
+      <w:rPr/>
     </w:lvl>
     <w:lvl w:ilvl="6">
       <w:start w:val="1"/>
@@ -10918,6 +11143,7 @@
         </w:tabs>
         <w:ind w:left="2880" w:hanging="360"/>
       </w:pPr>
+      <w:rPr/>
     </w:lvl>
     <w:lvl w:ilvl="7">
       <w:start w:val="1"/>
@@ -10930,6 +11156,7 @@
         </w:tabs>
         <w:ind w:left="3240" w:hanging="360"/>
       </w:pPr>
+      <w:rPr/>
     </w:lvl>
     <w:lvl w:ilvl="8">
       <w:start w:val="1"/>
@@ -10942,6 +11169,7 @@
         </w:tabs>
         <w:ind w:left="3600" w:hanging="360"/>
       </w:pPr>
+      <w:rPr/>
     </w:lvl>
   </w:abstractNum>
   <w:abstractNum w:abstractNumId="2">
@@ -10971,6 +11199,7 @@
         </w:tabs>
         <w:ind w:left="1080" w:hanging="360"/>
       </w:pPr>
+      <w:rPr/>
     </w:lvl>
     <w:lvl w:ilvl="2">
       <w:start w:val="1"/>
@@ -10983,6 +11212,7 @@
         </w:tabs>
         <w:ind w:left="1440" w:hanging="360"/>
       </w:pPr>
+      <w:rPr/>
     </w:lvl>
     <w:lvl w:ilvl="3">
       <w:start w:val="1"/>
@@ -10995,6 +11225,7 @@
         </w:tabs>
         <w:ind w:left="1800" w:hanging="360"/>
       </w:pPr>
+      <w:rPr/>
     </w:lvl>
     <w:lvl w:ilvl="4">
       <w:start w:val="1"/>
@@ -11007,6 +11238,7 @@
         </w:tabs>
         <w:ind w:left="2160" w:hanging="360"/>
       </w:pPr>
+      <w:rPr/>
     </w:lvl>
     <w:lvl w:ilvl="5">
       <w:start w:val="1"/>
@@ -11019,6 +11251,7 @@
         </w:tabs>
         <w:ind w:left="2520" w:hanging="360"/>
       </w:pPr>
+      <w:rPr/>
     </w:lvl>
     <w:lvl w:ilvl="6">
       <w:start w:val="1"/>
@@ -11031,6 +11264,7 @@
         </w:tabs>
         <w:ind w:left="2880" w:hanging="360"/>
       </w:pPr>
+      <w:rPr/>
     </w:lvl>
     <w:lvl w:ilvl="7">
       <w:start w:val="1"/>
@@ -11043,6 +11277,7 @@
         </w:tabs>
         <w:ind w:left="3240" w:hanging="360"/>
       </w:pPr>
+      <w:rPr/>
     </w:lvl>
     <w:lvl w:ilvl="8">
       <w:start w:val="1"/>
@@ -11055,6 +11290,7 @@
         </w:tabs>
         <w:ind w:left="3600" w:hanging="360"/>
       </w:pPr>
+      <w:rPr/>
     </w:lvl>
   </w:abstractNum>
   <w:abstractNum w:abstractNumId="3">
@@ -11084,6 +11320,7 @@
         </w:tabs>
         <w:ind w:left="1080" w:hanging="360"/>
       </w:pPr>
+      <w:rPr/>
     </w:lvl>
     <w:lvl w:ilvl="2">
       <w:start w:val="1"/>
@@ -11096,6 +11333,7 @@
         </w:tabs>
         <w:ind w:left="1440" w:hanging="360"/>
       </w:pPr>
+      <w:rPr/>
     </w:lvl>
     <w:lvl w:ilvl="3">
       <w:start w:val="1"/>
@@ -11108,6 +11346,7 @@
         </w:tabs>
         <w:ind w:left="1800" w:hanging="360"/>
       </w:pPr>
+      <w:rPr/>
     </w:lvl>
     <w:lvl w:ilvl="4">
       <w:start w:val="1"/>
@@ -11120,6 +11359,7 @@
         </w:tabs>
         <w:ind w:left="2160" w:hanging="360"/>
       </w:pPr>
+      <w:rPr/>
     </w:lvl>
     <w:lvl w:ilvl="5">
       <w:start w:val="1"/>
@@ -11132,6 +11372,7 @@
         </w:tabs>
         <w:ind w:left="2520" w:hanging="360"/>
       </w:pPr>
+      <w:rPr/>
     </w:lvl>
     <w:lvl w:ilvl="6">
       <w:start w:val="1"/>
@@ -11144,6 +11385,7 @@
         </w:tabs>
         <w:ind w:left="2880" w:hanging="360"/>
       </w:pPr>
+      <w:rPr/>
     </w:lvl>
     <w:lvl w:ilvl="7">
       <w:start w:val="1"/>
@@ -11156,6 +11398,7 @@
         </w:tabs>
         <w:ind w:left="3240" w:hanging="360"/>
       </w:pPr>
+      <w:rPr/>
     </w:lvl>
     <w:lvl w:ilvl="8">
       <w:start w:val="1"/>
@@ -11168,6 +11411,7 @@
         </w:tabs>
         <w:ind w:left="3600" w:hanging="360"/>
       </w:pPr>
+      <w:rPr/>
     </w:lvl>
   </w:abstractNum>
   <w:abstractNum w:abstractNumId="4">
@@ -11195,6 +11439,7 @@
         </w:tabs>
         <w:ind w:left="1080" w:hanging="360"/>
       </w:pPr>
+      <w:rPr/>
     </w:lvl>
     <w:lvl w:ilvl="2">
       <w:start w:val="1"/>
@@ -11207,6 +11452,7 @@
         </w:tabs>
         <w:ind w:left="1440" w:hanging="360"/>
       </w:pPr>
+      <w:rPr/>
     </w:lvl>
     <w:lvl w:ilvl="3">
       <w:start w:val="1"/>
@@ -11219,6 +11465,7 @@
         </w:tabs>
         <w:ind w:left="1800" w:hanging="360"/>
       </w:pPr>
+      <w:rPr/>
     </w:lvl>
     <w:lvl w:ilvl="4">
       <w:start w:val="1"/>
@@ -11231,6 +11478,7 @@
         </w:tabs>
         <w:ind w:left="2160" w:hanging="360"/>
       </w:pPr>
+      <w:rPr/>
     </w:lvl>
     <w:lvl w:ilvl="5">
       <w:start w:val="1"/>
@@ -11243,6 +11491,7 @@
         </w:tabs>
         <w:ind w:left="2520" w:hanging="360"/>
       </w:pPr>
+      <w:rPr/>
     </w:lvl>
     <w:lvl w:ilvl="6">
       <w:start w:val="1"/>
@@ -11255,6 +11504,7 @@
         </w:tabs>
         <w:ind w:left="2880" w:hanging="360"/>
       </w:pPr>
+      <w:rPr/>
     </w:lvl>
     <w:lvl w:ilvl="7">
       <w:start w:val="1"/>
@@ -11267,6 +11517,7 @@
         </w:tabs>
         <w:ind w:left="3240" w:hanging="360"/>
       </w:pPr>
+      <w:rPr/>
     </w:lvl>
     <w:lvl w:ilvl="8">
       <w:start w:val="1"/>
@@ -11279,6 +11530,7 @@
         </w:tabs>
         <w:ind w:left="3600" w:hanging="360"/>
       </w:pPr>
+      <w:rPr/>
     </w:lvl>
   </w:abstractNum>
   <w:abstractNum w:abstractNumId="5">
@@ -11306,6 +11558,7 @@
         </w:tabs>
         <w:ind w:left="1080" w:hanging="360"/>
       </w:pPr>
+      <w:rPr/>
     </w:lvl>
     <w:lvl w:ilvl="2">
       <w:start w:val="1"/>
@@ -11318,6 +11571,7 @@
         </w:tabs>
         <w:ind w:left="1440" w:hanging="360"/>
       </w:pPr>
+      <w:rPr/>
     </w:lvl>
     <w:lvl w:ilvl="3">
       <w:start w:val="1"/>
@@ -11330,6 +11584,7 @@
         </w:tabs>
         <w:ind w:left="1800" w:hanging="360"/>
       </w:pPr>
+      <w:rPr/>
     </w:lvl>
     <w:lvl w:ilvl="4">
       <w:start w:val="1"/>
@@ -11342,6 +11597,7 @@
         </w:tabs>
         <w:ind w:left="2160" w:hanging="360"/>
       </w:pPr>
+      <w:rPr/>
     </w:lvl>
     <w:lvl w:ilvl="5">
       <w:start w:val="1"/>
@@ -11354,6 +11610,7 @@
         </w:tabs>
         <w:ind w:left="2520" w:hanging="360"/>
       </w:pPr>
+      <w:rPr/>
     </w:lvl>
     <w:lvl w:ilvl="6">
       <w:start w:val="1"/>
@@ -11366,6 +11623,7 @@
         </w:tabs>
         <w:ind w:left="2880" w:hanging="360"/>
       </w:pPr>
+      <w:rPr/>
     </w:lvl>
     <w:lvl w:ilvl="7">
       <w:start w:val="1"/>
@@ -11378,6 +11636,7 @@
         </w:tabs>
         <w:ind w:left="3240" w:hanging="360"/>
       </w:pPr>
+      <w:rPr/>
     </w:lvl>
     <w:lvl w:ilvl="8">
       <w:start w:val="1"/>
@@ -11390,6 +11649,7 @@
         </w:tabs>
         <w:ind w:left="3600" w:hanging="360"/>
       </w:pPr>
+      <w:rPr/>
     </w:lvl>
   </w:abstractNum>
   <w:abstractNum w:abstractNumId="6">
@@ -11417,6 +11677,7 @@
         </w:tabs>
         <w:ind w:left="1080" w:hanging="360"/>
       </w:pPr>
+      <w:rPr/>
     </w:lvl>
     <w:lvl w:ilvl="2">
       <w:start w:val="1"/>
@@ -11429,6 +11690,7 @@
         </w:tabs>
         <w:ind w:left="1440" w:hanging="360"/>
       </w:pPr>
+      <w:rPr/>
     </w:lvl>
     <w:lvl w:ilvl="3">
       <w:start w:val="1"/>
@@ -11441,6 +11703,7 @@
         </w:tabs>
         <w:ind w:left="1800" w:hanging="360"/>
       </w:pPr>
+      <w:rPr/>
     </w:lvl>
     <w:lvl w:ilvl="4">
       <w:start w:val="1"/>
@@ -11453,6 +11716,7 @@
         </w:tabs>
         <w:ind w:left="2160" w:hanging="360"/>
       </w:pPr>
+      <w:rPr/>
     </w:lvl>
     <w:lvl w:ilvl="5">
       <w:start w:val="1"/>
@@ -11465,6 +11729,7 @@
         </w:tabs>
         <w:ind w:left="2520" w:hanging="360"/>
       </w:pPr>
+      <w:rPr/>
     </w:lvl>
     <w:lvl w:ilvl="6">
       <w:start w:val="1"/>
@@ -11477,6 +11742,7 @@
         </w:tabs>
         <w:ind w:left="2880" w:hanging="360"/>
       </w:pPr>
+      <w:rPr/>
     </w:lvl>
     <w:lvl w:ilvl="7">
       <w:start w:val="1"/>
@@ -11489,6 +11755,7 @@
         </w:tabs>
         <w:ind w:left="3240" w:hanging="360"/>
       </w:pPr>
+      <w:rPr/>
     </w:lvl>
     <w:lvl w:ilvl="8">
       <w:start w:val="1"/>
@@ -11501,6 +11768,7 @@
         </w:tabs>
         <w:ind w:left="3600" w:hanging="360"/>
       </w:pPr>
+      <w:rPr/>
     </w:lvl>
   </w:abstractNum>
   <w:abstractNum w:abstractNumId="7">
@@ -11651,7 +11919,7 @@
   <w:docDefaults>
     <w:rPrDefault>
       <w:rPr>
-        <w:rFonts w:ascii="Cambria" w:hAnsi="Cambria" w:eastAsia="ＭＳ 明朝" w:cs="" w:asciiTheme="minorHAnsi" w:cstheme="minorBidi" w:eastAsiaTheme="minorEastAsia" w:hAnsiTheme="minorHAnsi"/>
+        <w:rFonts w:ascii="Cambria" w:hAnsi="Cambria" w:eastAsia="" w:cs="" w:asciiTheme="minorHAnsi" w:cstheme="minorBidi" w:eastAsiaTheme="minorEastAsia" w:hAnsiTheme="minorHAnsi"/>
         <w:sz w:val="22"/>
         <w:szCs w:val="22"/>
         <w:lang w:val="en-US" w:eastAsia="en-US" w:bidi="ar-SA"/>
@@ -11808,6 +12076,7 @@
     <w:rsid w:val="00fc693f"/>
     <w:pPr>
       <w:widowControl/>
+      <w:suppressAutoHyphens w:val="true"/>
       <w:bidi w:val="0"/>
       <w:spacing w:lineRule="auto" w:line="360" w:before="0" w:after="0"/>
       <w:ind w:firstLine="709"/>
@@ -11889,7 +12158,7 @@
       <w:outlineLvl w:val="2"/>
     </w:pPr>
     <w:rPr>
-      <w:rFonts w:ascii="Calibri" w:hAnsi="Calibri" w:eastAsia="ＭＳ ゴシック" w:cs="" w:asciiTheme="majorHAnsi" w:cstheme="majorBidi" w:eastAsiaTheme="majorEastAsia" w:hAnsiTheme="majorHAnsi"/>
+      <w:rFonts w:ascii="Calibri" w:hAnsi="Calibri" w:eastAsia="" w:cs="" w:asciiTheme="majorHAnsi" w:cstheme="majorBidi" w:eastAsiaTheme="majorEastAsia" w:hAnsiTheme="majorHAnsi"/>
       <w:b/>
       <w:bCs/>
       <w:color w:themeColor="accent1" w:val="4F81BD"/>
@@ -11912,7 +12181,7 @@
       <w:outlineLvl w:val="3"/>
     </w:pPr>
     <w:rPr>
-      <w:rFonts w:ascii="Calibri" w:hAnsi="Calibri" w:eastAsia="ＭＳ ゴシック" w:cs="" w:asciiTheme="majorHAnsi" w:cstheme="majorBidi" w:eastAsiaTheme="majorEastAsia" w:hAnsiTheme="majorHAnsi"/>
+      <w:rFonts w:ascii="Calibri" w:hAnsi="Calibri" w:eastAsia="" w:cs="" w:asciiTheme="majorHAnsi" w:cstheme="majorBidi" w:eastAsiaTheme="majorEastAsia" w:hAnsiTheme="majorHAnsi"/>
       <w:b/>
       <w:bCs/>
       <w:i/>
@@ -11937,7 +12206,7 @@
       <w:outlineLvl w:val="4"/>
     </w:pPr>
     <w:rPr>
-      <w:rFonts w:ascii="Calibri" w:hAnsi="Calibri" w:eastAsia="ＭＳ ゴシック" w:cs="" w:asciiTheme="majorHAnsi" w:cstheme="majorBidi" w:eastAsiaTheme="majorEastAsia" w:hAnsiTheme="majorHAnsi"/>
+      <w:rFonts w:ascii="Calibri" w:hAnsi="Calibri" w:eastAsia="" w:cs="" w:asciiTheme="majorHAnsi" w:cstheme="majorBidi" w:eastAsiaTheme="majorEastAsia" w:hAnsiTheme="majorHAnsi"/>
       <w:color w:themeColor="accent1" w:themeShade="7f" w:val="243F60"/>
     </w:rPr>
   </w:style>
@@ -11958,7 +12227,7 @@
       <w:outlineLvl w:val="5"/>
     </w:pPr>
     <w:rPr>
-      <w:rFonts w:ascii="Calibri" w:hAnsi="Calibri" w:eastAsia="ＭＳ ゴシック" w:cs="" w:asciiTheme="majorHAnsi" w:cstheme="majorBidi" w:eastAsiaTheme="majorEastAsia" w:hAnsiTheme="majorHAnsi"/>
+      <w:rFonts w:ascii="Calibri" w:hAnsi="Calibri" w:eastAsia="" w:cs="" w:asciiTheme="majorHAnsi" w:cstheme="majorBidi" w:eastAsiaTheme="majorEastAsia" w:hAnsiTheme="majorHAnsi"/>
       <w:i/>
       <w:iCs/>
       <w:color w:themeColor="accent1" w:themeShade="7f" w:val="243F60"/>
@@ -11981,7 +12250,7 @@
       <w:outlineLvl w:val="6"/>
     </w:pPr>
     <w:rPr>
-      <w:rFonts w:ascii="Calibri" w:hAnsi="Calibri" w:eastAsia="ＭＳ ゴシック" w:cs="" w:asciiTheme="majorHAnsi" w:cstheme="majorBidi" w:eastAsiaTheme="majorEastAsia" w:hAnsiTheme="majorHAnsi"/>
+      <w:rFonts w:ascii="Calibri" w:hAnsi="Calibri" w:eastAsia="" w:cs="" w:asciiTheme="majorHAnsi" w:cstheme="majorBidi" w:eastAsiaTheme="majorEastAsia" w:hAnsiTheme="majorHAnsi"/>
       <w:i/>
       <w:iCs/>
       <w:color w:themeColor="text1" w:themeTint="bf" w:val="404040"/>
@@ -12004,7 +12273,7 @@
       <w:outlineLvl w:val="7"/>
     </w:pPr>
     <w:rPr>
-      <w:rFonts w:ascii="Calibri" w:hAnsi="Calibri" w:eastAsia="ＭＳ ゴシック" w:cs="" w:asciiTheme="majorHAnsi" w:cstheme="majorBidi" w:eastAsiaTheme="majorEastAsia" w:hAnsiTheme="majorHAnsi"/>
+      <w:rFonts w:ascii="Calibri" w:hAnsi="Calibri" w:eastAsia="" w:cs="" w:asciiTheme="majorHAnsi" w:cstheme="majorBidi" w:eastAsiaTheme="majorEastAsia" w:hAnsiTheme="majorHAnsi"/>
       <w:color w:themeColor="accent1" w:val="4F81BD"/>
       <w:sz w:val="20"/>
       <w:szCs w:val="20"/>
@@ -12027,7 +12296,7 @@
       <w:outlineLvl w:val="8"/>
     </w:pPr>
     <w:rPr>
-      <w:rFonts w:ascii="Calibri" w:hAnsi="Calibri" w:eastAsia="ＭＳ ゴシック" w:cs="" w:asciiTheme="majorHAnsi" w:cstheme="majorBidi" w:eastAsiaTheme="majorEastAsia" w:hAnsiTheme="majorHAnsi"/>
+      <w:rFonts w:ascii="Calibri" w:hAnsi="Calibri" w:eastAsia="" w:cs="" w:asciiTheme="majorHAnsi" w:cstheme="majorBidi" w:eastAsiaTheme="majorEastAsia" w:hAnsiTheme="majorHAnsi"/>
       <w:i/>
       <w:iCs/>
       <w:color w:themeColor="text1" w:themeTint="bf" w:val="404040"/>
@@ -12069,7 +12338,7 @@
     <w:qFormat/>
     <w:rsid w:val="00fc693f"/>
     <w:rPr>
-      <w:rFonts w:ascii="Calibri" w:hAnsi="Calibri" w:eastAsia="ＭＳ ゴシック" w:cs="" w:asciiTheme="majorHAnsi" w:cstheme="majorBidi" w:eastAsiaTheme="majorEastAsia" w:hAnsiTheme="majorHAnsi"/>
+      <w:rFonts w:ascii="Calibri" w:hAnsi="Calibri" w:eastAsia="" w:cs="" w:asciiTheme="majorHAnsi" w:cstheme="majorBidi" w:eastAsiaTheme="majorEastAsia" w:hAnsiTheme="majorHAnsi"/>
       <w:b/>
       <w:bCs/>
       <w:color w:themeColor="accent1" w:themeShade="bf" w:val="365F91"/>
@@ -12085,7 +12354,7 @@
     <w:qFormat/>
     <w:rsid w:val="00fc693f"/>
     <w:rPr>
-      <w:rFonts w:ascii="Calibri" w:hAnsi="Calibri" w:eastAsia="ＭＳ ゴシック" w:cs="" w:asciiTheme="majorHAnsi" w:cstheme="majorBidi" w:eastAsiaTheme="majorEastAsia" w:hAnsiTheme="majorHAnsi"/>
+      <w:rFonts w:ascii="Calibri" w:hAnsi="Calibri" w:eastAsia="" w:cs="" w:asciiTheme="majorHAnsi" w:cstheme="majorBidi" w:eastAsiaTheme="majorEastAsia" w:hAnsiTheme="majorHAnsi"/>
       <w:b/>
       <w:bCs/>
       <w:color w:themeColor="accent1" w:val="4F81BD"/>
@@ -12101,7 +12370,7 @@
     <w:qFormat/>
     <w:rsid w:val="00fc693f"/>
     <w:rPr>
-      <w:rFonts w:ascii="Calibri" w:hAnsi="Calibri" w:eastAsia="ＭＳ ゴシック" w:cs="" w:asciiTheme="majorHAnsi" w:cstheme="majorBidi" w:eastAsiaTheme="majorEastAsia" w:hAnsiTheme="majorHAnsi"/>
+      <w:rFonts w:ascii="Calibri" w:hAnsi="Calibri" w:eastAsia="" w:cs="" w:asciiTheme="majorHAnsi" w:cstheme="majorBidi" w:eastAsiaTheme="majorEastAsia" w:hAnsiTheme="majorHAnsi"/>
       <w:b/>
       <w:bCs/>
       <w:color w:themeColor="accent1" w:val="4F81BD"/>
@@ -12115,7 +12384,7 @@
     <w:qFormat/>
     <w:rsid w:val="00fc693f"/>
     <w:rPr>
-      <w:rFonts w:ascii="Calibri" w:hAnsi="Calibri" w:eastAsia="ＭＳ ゴシック" w:cs="" w:asciiTheme="majorHAnsi" w:cstheme="majorBidi" w:eastAsiaTheme="majorEastAsia" w:hAnsiTheme="majorHAnsi"/>
+      <w:rFonts w:ascii="Calibri" w:hAnsi="Calibri" w:eastAsia="" w:cs="" w:asciiTheme="majorHAnsi" w:cstheme="majorBidi" w:eastAsiaTheme="majorEastAsia" w:hAnsiTheme="majorHAnsi"/>
       <w:color w:themeColor="text2" w:themeShade="bf" w:val="17365D"/>
       <w:spacing w:val="5"/>
       <w:kern w:val="2"/>
@@ -12131,7 +12400,7 @@
     <w:qFormat/>
     <w:rsid w:val="00fc693f"/>
     <w:rPr>
-      <w:rFonts w:ascii="Calibri" w:hAnsi="Calibri" w:eastAsia="ＭＳ ゴシック" w:cs="" w:asciiTheme="majorHAnsi" w:cstheme="majorBidi" w:eastAsiaTheme="majorEastAsia" w:hAnsiTheme="majorHAnsi"/>
+      <w:rFonts w:ascii="Calibri" w:hAnsi="Calibri" w:eastAsia="" w:cs="" w:asciiTheme="majorHAnsi" w:cstheme="majorBidi" w:eastAsiaTheme="majorEastAsia" w:hAnsiTheme="majorHAnsi"/>
       <w:i/>
       <w:iCs/>
       <w:color w:themeColor="accent1" w:val="4F81BD"/>
@@ -12204,7 +12473,7 @@
     <w:qFormat/>
     <w:rsid w:val="00fc693f"/>
     <w:rPr>
-      <w:rFonts w:ascii="Calibri" w:hAnsi="Calibri" w:eastAsia="ＭＳ ゴシック" w:cs="" w:asciiTheme="majorHAnsi" w:cstheme="majorBidi" w:eastAsiaTheme="majorEastAsia" w:hAnsiTheme="majorHAnsi"/>
+      <w:rFonts w:ascii="Calibri" w:hAnsi="Calibri" w:eastAsia="" w:cs="" w:asciiTheme="majorHAnsi" w:cstheme="majorBidi" w:eastAsiaTheme="majorEastAsia" w:hAnsiTheme="majorHAnsi"/>
       <w:b/>
       <w:bCs/>
       <w:i/>
@@ -12221,7 +12490,7 @@
     <w:qFormat/>
     <w:rsid w:val="00fc693f"/>
     <w:rPr>
-      <w:rFonts w:ascii="Calibri" w:hAnsi="Calibri" w:eastAsia="ＭＳ ゴシック" w:cs="" w:asciiTheme="majorHAnsi" w:cstheme="majorBidi" w:eastAsiaTheme="majorEastAsia" w:hAnsiTheme="majorHAnsi"/>
+      <w:rFonts w:ascii="Calibri" w:hAnsi="Calibri" w:eastAsia="" w:cs="" w:asciiTheme="majorHAnsi" w:cstheme="majorBidi" w:eastAsiaTheme="majorEastAsia" w:hAnsiTheme="majorHAnsi"/>
       <w:color w:themeColor="accent1" w:themeShade="7f" w:val="243F60"/>
     </w:rPr>
   </w:style>
@@ -12234,7 +12503,7 @@
     <w:qFormat/>
     <w:rsid w:val="00fc693f"/>
     <w:rPr>
-      <w:rFonts w:ascii="Calibri" w:hAnsi="Calibri" w:eastAsia="ＭＳ ゴシック" w:cs="" w:asciiTheme="majorHAnsi" w:cstheme="majorBidi" w:eastAsiaTheme="majorEastAsia" w:hAnsiTheme="majorHAnsi"/>
+      <w:rFonts w:ascii="Calibri" w:hAnsi="Calibri" w:eastAsia="" w:cs="" w:asciiTheme="majorHAnsi" w:cstheme="majorBidi" w:eastAsiaTheme="majorEastAsia" w:hAnsiTheme="majorHAnsi"/>
       <w:i/>
       <w:iCs/>
       <w:color w:themeColor="accent1" w:themeShade="7f" w:val="243F60"/>
@@ -12249,7 +12518,7 @@
     <w:qFormat/>
     <w:rsid w:val="00fc693f"/>
     <w:rPr>
-      <w:rFonts w:ascii="Calibri" w:hAnsi="Calibri" w:eastAsia="ＭＳ ゴシック" w:cs="" w:asciiTheme="majorHAnsi" w:cstheme="majorBidi" w:eastAsiaTheme="majorEastAsia" w:hAnsiTheme="majorHAnsi"/>
+      <w:rFonts w:ascii="Calibri" w:hAnsi="Calibri" w:eastAsia="" w:cs="" w:asciiTheme="majorHAnsi" w:cstheme="majorBidi" w:eastAsiaTheme="majorEastAsia" w:hAnsiTheme="majorHAnsi"/>
       <w:i/>
       <w:iCs/>
       <w:color w:themeColor="text1" w:themeTint="bf" w:val="404040"/>
@@ -12264,7 +12533,7 @@
     <w:qFormat/>
     <w:rsid w:val="00fc693f"/>
     <w:rPr>
-      <w:rFonts w:ascii="Calibri" w:hAnsi="Calibri" w:eastAsia="ＭＳ ゴシック" w:cs="" w:asciiTheme="majorHAnsi" w:cstheme="majorBidi" w:eastAsiaTheme="majorEastAsia" w:hAnsiTheme="majorHAnsi"/>
+      <w:rFonts w:ascii="Calibri" w:hAnsi="Calibri" w:eastAsia="" w:cs="" w:asciiTheme="majorHAnsi" w:cstheme="majorBidi" w:eastAsiaTheme="majorEastAsia" w:hAnsiTheme="majorHAnsi"/>
       <w:color w:themeColor="accent1" w:val="4F81BD"/>
       <w:sz w:val="20"/>
       <w:szCs w:val="20"/>
@@ -12279,7 +12548,7 @@
     <w:qFormat/>
     <w:rsid w:val="00fc693f"/>
     <w:rPr>
-      <w:rFonts w:ascii="Calibri" w:hAnsi="Calibri" w:eastAsia="ＭＳ ゴシック" w:cs="" w:asciiTheme="majorHAnsi" w:cstheme="majorBidi" w:eastAsiaTheme="majorEastAsia" w:hAnsiTheme="majorHAnsi"/>
+      <w:rFonts w:ascii="Calibri" w:hAnsi="Calibri" w:eastAsia="" w:cs="" w:asciiTheme="majorHAnsi" w:cstheme="majorBidi" w:eastAsiaTheme="majorEastAsia" w:hAnsiTheme="majorHAnsi"/>
       <w:i/>
       <w:iCs/>
       <w:color w:themeColor="text1" w:themeTint="bf" w:val="404040"/>
@@ -12509,12 +12778,13 @@
     <w:rsid w:val="00fc693f"/>
     <w:pPr>
       <w:widowControl/>
+      <w:suppressAutoHyphens w:val="true"/>
       <w:bidi w:val="0"/>
       <w:spacing w:lineRule="auto" w:line="240" w:before="0" w:after="0"/>
       <w:jc w:val="left"/>
     </w:pPr>
     <w:rPr>
-      <w:rFonts w:ascii="Cambria" w:hAnsi="Cambria" w:eastAsia="ＭＳ 明朝" w:cs="" w:asciiTheme="minorHAnsi" w:cstheme="minorBidi" w:eastAsiaTheme="minorEastAsia" w:hAnsiTheme="minorHAnsi"/>
+      <w:rFonts w:ascii="Cambria" w:hAnsi="Cambria" w:eastAsia="" w:cs="" w:asciiTheme="minorHAnsi" w:cstheme="minorBidi" w:eastAsiaTheme="minorEastAsia" w:hAnsiTheme="minorHAnsi"/>
       <w:color w:val="auto"/>
       <w:kern w:val="0"/>
       <w:sz w:val="22"/>
@@ -12538,7 +12808,7 @@
       <w:contextualSpacing/>
     </w:pPr>
     <w:rPr>
-      <w:rFonts w:ascii="Calibri" w:hAnsi="Calibri" w:eastAsia="ＭＳ ゴシック" w:cs="" w:asciiTheme="majorHAnsi" w:cstheme="majorBidi" w:eastAsiaTheme="majorEastAsia" w:hAnsiTheme="majorHAnsi"/>
+      <w:rFonts w:ascii="Calibri" w:hAnsi="Calibri" w:eastAsia="" w:cs="" w:asciiTheme="majorHAnsi" w:cstheme="majorBidi" w:eastAsiaTheme="majorEastAsia" w:hAnsiTheme="majorHAnsi"/>
       <w:color w:themeColor="text2" w:themeShade="bf" w:val="17365D"/>
       <w:spacing w:val="5"/>
       <w:kern w:val="2"/>
@@ -12556,7 +12826,7 @@
     <w:rsid w:val="00fc693f"/>
     <w:pPr/>
     <w:rPr>
-      <w:rFonts w:ascii="Calibri" w:hAnsi="Calibri" w:eastAsia="ＭＳ ゴシック" w:cs="" w:asciiTheme="majorHAnsi" w:cstheme="majorBidi" w:eastAsiaTheme="majorEastAsia" w:hAnsiTheme="majorHAnsi"/>
+      <w:rFonts w:ascii="Calibri" w:hAnsi="Calibri" w:eastAsia="" w:cs="" w:asciiTheme="majorHAnsi" w:cstheme="majorBidi" w:eastAsiaTheme="majorEastAsia" w:hAnsiTheme="majorHAnsi"/>
       <w:i/>
       <w:iCs/>
       <w:color w:themeColor="accent1" w:val="4F81BD"/>
@@ -12789,12 +13059,13 @@
         <w:tab w:val="left" w:pos="3456" w:leader="none"/>
         <w:tab w:val="left" w:pos="4032" w:leader="none"/>
       </w:tabs>
+      <w:suppressAutoHyphens w:val="true"/>
       <w:bidi w:val="0"/>
       <w:spacing w:lineRule="auto" w:line="276" w:before="0" w:after="200"/>
       <w:jc w:val="left"/>
     </w:pPr>
     <w:rPr>
-      <w:rFonts w:ascii="Courier" w:hAnsi="Courier" w:eastAsia="ＭＳ 明朝" w:cs="" w:cstheme="minorBidi" w:eastAsiaTheme="minorEastAsia"/>
+      <w:rFonts w:ascii="Courier" w:hAnsi="Courier" w:eastAsia="" w:cs="" w:cstheme="minorBidi" w:eastAsiaTheme="minorEastAsia"/>
       <w:color w:val="auto"/>
       <w:kern w:val="0"/>
       <w:sz w:val="20"/>
@@ -15992,7 +16263,6 @@
       <w:pPr>
         <w:spacing w:before="0" w:after="0" w:line="240" w:lineRule="auto"/>
       </w:pPr>
-      <w:rPr/>
       <w:tblPr/>
       <w:tcPr>
         <w:tcBorders>
@@ -16138,7 +16408,6 @@
       <w:pPr>
         <w:spacing w:before="0" w:after="0" w:line="240" w:lineRule="auto"/>
       </w:pPr>
-      <w:rPr/>
       <w:tblPr/>
       <w:tcPr>
         <w:tcBorders>
@@ -16284,7 +16553,6 @@
       <w:pPr>
         <w:spacing w:before="0" w:after="0" w:line="240" w:lineRule="auto"/>
       </w:pPr>
-      <w:rPr/>
       <w:tblPr/>
       <w:tcPr>
         <w:tcBorders>
@@ -16430,7 +16698,6 @@
       <w:pPr>
         <w:spacing w:before="0" w:after="0" w:line="240" w:lineRule="auto"/>
       </w:pPr>
-      <w:rPr/>
       <w:tblPr/>
       <w:tcPr>
         <w:tcBorders>
@@ -16576,7 +16843,6 @@
       <w:pPr>
         <w:spacing w:before="0" w:after="0" w:line="240" w:lineRule="auto"/>
       </w:pPr>
-      <w:rPr/>
       <w:tblPr/>
       <w:tcPr>
         <w:tcBorders>
@@ -16722,7 +16988,6 @@
       <w:pPr>
         <w:spacing w:before="0" w:after="0" w:line="240" w:lineRule="auto"/>
       </w:pPr>
-      <w:rPr/>
       <w:tblPr/>
       <w:tcPr>
         <w:tcBorders>
@@ -16868,7 +17133,6 @@
       <w:pPr>
         <w:spacing w:before="0" w:after="0" w:line="240" w:lineRule="auto"/>
       </w:pPr>
-      <w:rPr/>
       <w:tblPr/>
       <w:tcPr>
         <w:tcBorders>

</xml_diff>